<commit_message>
Grading Guide: add acceptable alternatives and how to grade them per pain point
Keeps the answer key and adds, for every pain point, an "Also acceptable
for Solution Designer" panel: credible alternative HMF components with why
they earn credit, plus explicit grading bands (full 8-10 / partial 2-7 /
no credit 0-1). Adds a global "Grading alternative answers" instruction on
the how-to-evaluate page. Still a reference guide with no fill-in blanks;
scores are recorded on the Workbook's Proctor evaluation page.

Solution Guide unchanged. README and package zip refreshed.

Co-Authored-By: Claude Opus 4.8 <noreply@anthropic.com>
Claude-Session: https://claude.ai/code/session_01QFagQxWq3DUNgqxaEaNjHo
</commit_message>
<xml_diff>
--- a/case-study-pack/docx/HMF-Grading-Guide.docx
+++ b/case-study-pack/docx/HMF-Grading-Guide.docx
@@ -4175,6 +4175,82 @@
     </w:tbl>
     <w:p>
       <w:pPr>
+        <w:spacing w:after="120"/>
+      </w:pPr>
+      <w:r>
+        <w:rPr>
+          <w:rFonts w:ascii="Calibri" w:cs="Calibri" w:eastAsia="Calibri" w:hAnsi="Calibri"/>
+          <w:color w:val="14263A"/>
+          <w:sz w:val="2"/>
+          <w:szCs w:val="2"/>
+        </w:rPr>
+        <w:t xml:space="preserve"/>
+      </w:r>
+    </w:p>
+    <w:tbl>
+      <w:tblPr>
+        <w:tblW w:type="dxa" w:w="9360"/>
+        <w:tblBorders>
+          <w:top w:val="single" w:color="auto" w:sz="4"/>
+          <w:left w:val="single" w:color="auto" w:sz="4"/>
+          <w:bottom w:val="single" w:color="auto" w:sz="4"/>
+          <w:right w:val="single" w:color="auto" w:sz="4"/>
+          <w:insideH w:val="single" w:color="auto" w:sz="4"/>
+          <w:insideV w:val="single" w:color="auto" w:sz="4"/>
+        </w:tblBorders>
+      </w:tblPr>
+      <w:tblGrid>
+        <w:gridCol w:w="9360"/>
+      </w:tblGrid>
+      <w:tr>
+        <w:tc>
+          <w:tcPr>
+            <w:tcW w:type="dxa" w:w="9360"/>
+            <w:tcBorders>
+              <w:top w:val="single" w:color="CFE3EC" w:sz="6"/>
+              <w:left w:val="single" w:color="CFE3EC" w:sz="30"/>
+              <w:bottom w:val="single" w:color="CFE3EC" w:sz="6"/>
+              <w:right w:val="single" w:color="CFE3EC" w:sz="6"/>
+            </w:tcBorders>
+            <w:shd w:fill="F5FBFD" w:color="auto" w:val="clear"/>
+            <w:tcMar>
+              <w:top w:type="dxa" w:w="110"/>
+              <w:left w:type="dxa" w:w="160"/>
+              <w:bottom w:type="dxa" w:w="110"/>
+              <w:right w:type="dxa" w:w="160"/>
+            </w:tcMar>
+            <w:vAlign w:val="top"/>
+          </w:tcPr>
+          <w:p>
+            <w:pPr>
+              <w:spacing w:after="0" w:before="0" w:line="276"/>
+            </w:pPr>
+            <w:r>
+              <w:rPr>
+                <w:rFonts w:ascii="Calibri" w:cs="Calibri" w:eastAsia="Calibri" w:hAnsi="Calibri"/>
+                <w:b/>
+                <w:bCs/>
+                <w:color w:val="0D274D"/>
+                <w:sz w:val="20"/>
+                <w:szCs w:val="20"/>
+              </w:rPr>
+              <w:t xml:space="preserve">Grading alternative answers.  </w:t>
+            </w:r>
+            <w:r>
+              <w:rPr>
+                <w:rFonts w:ascii="Calibri" w:cs="Calibri" w:eastAsia="Calibri" w:hAnsi="Calibri"/>
+                <w:color w:val="33465F"/>
+                <w:sz w:val="20"/>
+                <w:szCs w:val="20"/>
+              </w:rPr>
+              <w:t xml:space="preserve">The answer key shows the primary Cisco fit, but a team may propose a different Hybrid Mesh Firewall component. Each pain point lists the acceptable alternatives and how to grade them. Award full Solution Designer marks for any acceptable alternative when the reasoning fits Cedarline, partial marks when the product is related but the approach is thin, and no credit for a generic or wrong product. Grade sound reasoning over the exact product name; Problem Identifier and Value Communicator are graded on the rubric levels regardless of which product the team chose.</w:t>
+            </w:r>
+          </w:p>
+        </w:tc>
+      </w:tr>
+    </w:tbl>
+    <w:p>
+      <w:pPr>
         <w:pageBreakBefore/>
         <w:spacing w:after="0" w:before="0" w:line="276"/>
       </w:pPr>
@@ -4293,7 +4369,7 @@
           <w:sz w:val="18"/>
           <w:szCs w:val="18"/>
         </w:rPr>
-        <w:t xml:space="preserve">The answer key below is the </w:t>
+        <w:t xml:space="preserve">For each pain point: the </w:t>
       </w:r>
       <w:r>
         <w:rPr>
@@ -4304,7 +4380,7 @@
           <w:sz w:val="18"/>
           <w:szCs w:val="18"/>
         </w:rPr>
-        <w:t xml:space="preserve">Complete</w:t>
+        <w:t xml:space="preserve">answer key</w:t>
       </w:r>
       <w:r>
         <w:rPr>
@@ -4313,7 +4389,27 @@
           <w:sz w:val="18"/>
           <w:szCs w:val="18"/>
         </w:rPr>
-        <w:t xml:space="preserve"> (full-marks) answer for each pain point. Grade the team's answer against it and the rubric levels; a Complete answer earns the top of each dimension's range.</w:t>
+        <w:t xml:space="preserve"> is the Complete (full-marks) answer, and the panel below it lists the </w:t>
+      </w:r>
+      <w:r>
+        <w:rPr>
+          <w:rFonts w:ascii="Calibri" w:cs="Calibri" w:eastAsia="Calibri" w:hAnsi="Calibri"/>
+          <w:b/>
+          <w:bCs/>
+          <w:color w:val="0D274D"/>
+          <w:sz w:val="18"/>
+          <w:szCs w:val="18"/>
+        </w:rPr>
+        <w:t xml:space="preserve">acceptable alternatives</w:t>
+      </w:r>
+      <w:r>
+        <w:rPr>
+          <w:rFonts w:ascii="Calibri" w:cs="Calibri" w:eastAsia="Calibri" w:hAnsi="Calibri"/>
+          <w:color w:val="7E8CA1"/>
+          <w:sz w:val="18"/>
+          <w:szCs w:val="18"/>
+        </w:rPr>
+        <w:t xml:space="preserve"> and how to grade partial and no-credit answers.</w:t>
       </w:r>
     </w:p>
     <w:p>
@@ -4720,6 +4816,174 @@
                 <w:szCs w:val="18"/>
               </w:rPr>
               <w:t xml:space="preserve">It automates the technical evidence gathering required for "Conformity Assessments." By mapping AI-specific threats to standardized frameworks (like MITRE ATLAS and OWASP), it provides the documentation and continuous monitoring necessary to prove to regulators that your systems are robust and compliant.</w:t>
+            </w:r>
+          </w:p>
+        </w:tc>
+      </w:tr>
+    </w:tbl>
+    <w:p>
+      <w:pPr>
+        <w:spacing w:after="40"/>
+      </w:pPr>
+      <w:r>
+        <w:rPr>
+          <w:rFonts w:ascii="Calibri" w:cs="Calibri" w:eastAsia="Calibri" w:hAnsi="Calibri"/>
+          <w:color w:val="14263A"/>
+          <w:sz w:val="2"/>
+          <w:szCs w:val="2"/>
+        </w:rPr>
+        <w:t xml:space="preserve"/>
+      </w:r>
+    </w:p>
+    <w:tbl>
+      <w:tblPr>
+        <w:tblW w:type="dxa" w:w="9360"/>
+        <w:tblBorders>
+          <w:top w:val="single" w:color="auto" w:sz="4"/>
+          <w:left w:val="single" w:color="auto" w:sz="4"/>
+          <w:bottom w:val="single" w:color="auto" w:sz="4"/>
+          <w:right w:val="single" w:color="auto" w:sz="4"/>
+          <w:insideH w:val="single" w:color="auto" w:sz="4"/>
+          <w:insideV w:val="single" w:color="auto" w:sz="4"/>
+        </w:tblBorders>
+      </w:tblPr>
+      <w:tblGrid>
+        <w:gridCol w:w="9360"/>
+      </w:tblGrid>
+      <w:tr>
+        <w:tc>
+          <w:tcPr>
+            <w:tcW w:type="dxa" w:w="9360"/>
+            <w:tcBorders>
+              <w:top w:val="single" w:color="CFE3EC" w:sz="6"/>
+              <w:left w:val="single" w:color="CFE3EC" w:sz="30"/>
+              <w:bottom w:val="single" w:color="CFE3EC" w:sz="6"/>
+              <w:right w:val="single" w:color="CFE3EC" w:sz="6"/>
+            </w:tcBorders>
+            <w:shd w:fill="F5FBFD" w:color="auto" w:val="clear"/>
+            <w:tcMar>
+              <w:top w:type="dxa" w:w="110"/>
+              <w:left w:type="dxa" w:w="160"/>
+              <w:bottom w:type="dxa" w:w="110"/>
+              <w:right w:type="dxa" w:w="160"/>
+            </w:tcMar>
+            <w:vAlign w:val="top"/>
+          </w:tcPr>
+          <w:p>
+            <w:pPr>
+              <w:spacing w:after="50" w:before="0" w:line="276"/>
+            </w:pPr>
+            <w:r>
+              <w:rPr>
+                <w:rFonts w:ascii="Calibri" w:cs="Calibri" w:eastAsia="Calibri" w:hAnsi="Calibri"/>
+                <w:b/>
+                <w:bCs/>
+                <w:caps/>
+                <w:color w:val="036C8F"/>
+                <w:sz w:val="15"/>
+                <w:szCs w:val="15"/>
+              </w:rPr>
+              <w:t xml:space="preserve">Also acceptable for Solution Designer, and how to grade</w:t>
+            </w:r>
+          </w:p>
+          <w:p>
+            <w:pPr>
+              <w:spacing w:after="30" w:before="0" w:line="276"/>
+            </w:pPr>
+            <w:r>
+              <w:rPr>
+                <w:rFonts w:ascii="Calibri" w:cs="Calibri" w:eastAsia="Calibri" w:hAnsi="Calibri"/>
+                <w:b/>
+                <w:bCs/>
+                <w:color w:val="0B6670"/>
+                <w:sz w:val="18"/>
+                <w:szCs w:val="18"/>
+              </w:rPr>
+              <w:t xml:space="preserve">Cisco AI Defense (model validation and algorithmic red teaming)</w:t>
+            </w:r>
+            <w:r>
+              <w:rPr>
+                <w:rFonts w:ascii="Calibri" w:cs="Calibri" w:eastAsia="Calibri" w:hAnsi="Calibri"/>
+                <w:color w:val="2A3C52"/>
+                <w:sz w:val="18"/>
+                <w:szCs w:val="18"/>
+              </w:rPr>
+              <w:t xml:space="preserve">, the same platform named by capability; full marks when it is tied to proving robustness and cybersecurity for Article 15.</w:t>
+            </w:r>
+          </w:p>
+          <w:p>
+            <w:pPr>
+              <w:spacing w:after="20" w:before="70" w:line="276"/>
+            </w:pPr>
+            <w:r>
+              <w:rPr>
+                <w:rFonts w:ascii="Calibri" w:cs="Calibri" w:eastAsia="Calibri" w:hAnsi="Calibri"/>
+                <w:b/>
+                <w:bCs/>
+                <w:color w:val="0B6670"/>
+                <w:sz w:val="17"/>
+                <w:szCs w:val="17"/>
+              </w:rPr>
+              <w:t xml:space="preserve">Full marks, 8 to 10.  </w:t>
+            </w:r>
+            <w:r>
+              <w:rPr>
+                <w:rFonts w:ascii="Calibri" w:cs="Calibri" w:eastAsia="Calibri" w:hAnsi="Calibri"/>
+                <w:color w:val="46566E"/>
+                <w:sz w:val="17"/>
+                <w:szCs w:val="17"/>
+              </w:rPr>
+              <w:t xml:space="preserve">The primary answer above, or any acceptable alternative, when the reasoning fits Cedarline.</w:t>
+            </w:r>
+          </w:p>
+          <w:p>
+            <w:pPr>
+              <w:spacing w:after="20" w:before="0" w:line="276"/>
+            </w:pPr>
+            <w:r>
+              <w:rPr>
+                <w:rFonts w:ascii="Calibri" w:cs="Calibri" w:eastAsia="Calibri" w:hAnsi="Calibri"/>
+                <w:b/>
+                <w:bCs/>
+                <w:color w:val="0D274D"/>
+                <w:sz w:val="17"/>
+                <w:szCs w:val="17"/>
+              </w:rPr>
+              <w:t xml:space="preserve">Partial, 2 to 7.  </w:t>
+            </w:r>
+            <w:r>
+              <w:rPr>
+                <w:rFonts w:ascii="Calibri" w:cs="Calibri" w:eastAsia="Calibri" w:hAnsi="Calibri"/>
+                <w:color w:val="46566E"/>
+                <w:sz w:val="17"/>
+                <w:szCs w:val="17"/>
+              </w:rPr>
+              <w:t xml:space="preserve">Names Cisco AI Defense but does not connect it to Article 15 evidence or model validation.</w:t>
+            </w:r>
+          </w:p>
+          <w:p>
+            <w:pPr>
+              <w:spacing w:after="0" w:before="0" w:line="276"/>
+            </w:pPr>
+            <w:r>
+              <w:rPr>
+                <w:rFonts w:ascii="Calibri" w:cs="Calibri" w:eastAsia="Calibri" w:hAnsi="Calibri"/>
+                <w:b/>
+                <w:bCs/>
+                <w:color w:val="0D274D"/>
+                <w:sz w:val="17"/>
+                <w:szCs w:val="17"/>
+              </w:rPr>
+              <w:t xml:space="preserve">No credit, 0 to 1.  </w:t>
+            </w:r>
+            <w:r>
+              <w:rPr>
+                <w:rFonts w:ascii="Calibri" w:cs="Calibri" w:eastAsia="Calibri" w:hAnsi="Calibri"/>
+                <w:color w:val="46566E"/>
+                <w:sz w:val="17"/>
+                <w:szCs w:val="17"/>
+              </w:rPr>
+              <w:t xml:space="preserve">A policy or governance process with no Cisco product, or an unrelated next-generation firewall.</w:t>
             </w:r>
           </w:p>
         </w:tc>
@@ -5150,6 +5414,174 @@
     </w:tbl>
     <w:p>
       <w:pPr>
+        <w:spacing w:after="40"/>
+      </w:pPr>
+      <w:r>
+        <w:rPr>
+          <w:rFonts w:ascii="Calibri" w:cs="Calibri" w:eastAsia="Calibri" w:hAnsi="Calibri"/>
+          <w:color w:val="14263A"/>
+          <w:sz w:val="2"/>
+          <w:szCs w:val="2"/>
+        </w:rPr>
+        <w:t xml:space="preserve"/>
+      </w:r>
+    </w:p>
+    <w:tbl>
+      <w:tblPr>
+        <w:tblW w:type="dxa" w:w="9360"/>
+        <w:tblBorders>
+          <w:top w:val="single" w:color="auto" w:sz="4"/>
+          <w:left w:val="single" w:color="auto" w:sz="4"/>
+          <w:bottom w:val="single" w:color="auto" w:sz="4"/>
+          <w:right w:val="single" w:color="auto" w:sz="4"/>
+          <w:insideH w:val="single" w:color="auto" w:sz="4"/>
+          <w:insideV w:val="single" w:color="auto" w:sz="4"/>
+        </w:tblBorders>
+      </w:tblPr>
+      <w:tblGrid>
+        <w:gridCol w:w="9360"/>
+      </w:tblGrid>
+      <w:tr>
+        <w:tc>
+          <w:tcPr>
+            <w:tcW w:type="dxa" w:w="9360"/>
+            <w:tcBorders>
+              <w:top w:val="single" w:color="CFE3EC" w:sz="6"/>
+              <w:left w:val="single" w:color="CFE3EC" w:sz="30"/>
+              <w:bottom w:val="single" w:color="CFE3EC" w:sz="6"/>
+              <w:right w:val="single" w:color="CFE3EC" w:sz="6"/>
+            </w:tcBorders>
+            <w:shd w:fill="F5FBFD" w:color="auto" w:val="clear"/>
+            <w:tcMar>
+              <w:top w:type="dxa" w:w="110"/>
+              <w:left w:type="dxa" w:w="160"/>
+              <w:bottom w:type="dxa" w:w="110"/>
+              <w:right w:type="dxa" w:w="160"/>
+            </w:tcMar>
+            <w:vAlign w:val="top"/>
+          </w:tcPr>
+          <w:p>
+            <w:pPr>
+              <w:spacing w:after="50" w:before="0" w:line="276"/>
+            </w:pPr>
+            <w:r>
+              <w:rPr>
+                <w:rFonts w:ascii="Calibri" w:cs="Calibri" w:eastAsia="Calibri" w:hAnsi="Calibri"/>
+                <w:b/>
+                <w:bCs/>
+                <w:caps/>
+                <w:color w:val="036C8F"/>
+                <w:sz w:val="15"/>
+                <w:szCs w:val="15"/>
+              </w:rPr>
+              <w:t xml:space="preserve">Also acceptable for Solution Designer, and how to grade</w:t>
+            </w:r>
+          </w:p>
+          <w:p>
+            <w:pPr>
+              <w:spacing w:after="30" w:before="0" w:line="276"/>
+            </w:pPr>
+            <w:r>
+              <w:rPr>
+                <w:rFonts w:ascii="Calibri" w:cs="Calibri" w:eastAsia="Calibri" w:hAnsi="Calibri"/>
+                <w:b/>
+                <w:bCs/>
+                <w:color w:val="0B6670"/>
+                <w:sz w:val="18"/>
+                <w:szCs w:val="18"/>
+              </w:rPr>
+              <w:t xml:space="preserve">Cisco AI Defense applied as a pre-production gate</w:t>
+            </w:r>
+            <w:r>
+              <w:rPr>
+                <w:rFonts w:ascii="Calibri" w:cs="Calibri" w:eastAsia="Calibri" w:hAnsi="Calibri"/>
+                <w:color w:val="2A3C52"/>
+                <w:sz w:val="18"/>
+                <w:szCs w:val="18"/>
+              </w:rPr>
+              <w:t xml:space="preserve">, AI Defense validation run in the model and agent pipeline; full marks when the vet-before-production reasoning is sound.</w:t>
+            </w:r>
+          </w:p>
+          <w:p>
+            <w:pPr>
+              <w:spacing w:after="20" w:before="70" w:line="276"/>
+            </w:pPr>
+            <w:r>
+              <w:rPr>
+                <w:rFonts w:ascii="Calibri" w:cs="Calibri" w:eastAsia="Calibri" w:hAnsi="Calibri"/>
+                <w:b/>
+                <w:bCs/>
+                <w:color w:val="0B6670"/>
+                <w:sz w:val="17"/>
+                <w:szCs w:val="17"/>
+              </w:rPr>
+              <w:t xml:space="preserve">Full marks, 8 to 10.  </w:t>
+            </w:r>
+            <w:r>
+              <w:rPr>
+                <w:rFonts w:ascii="Calibri" w:cs="Calibri" w:eastAsia="Calibri" w:hAnsi="Calibri"/>
+                <w:color w:val="46566E"/>
+                <w:sz w:val="17"/>
+                <w:szCs w:val="17"/>
+              </w:rPr>
+              <w:t xml:space="preserve">The primary answer above, or any acceptable alternative, when the reasoning fits Cedarline.</w:t>
+            </w:r>
+          </w:p>
+          <w:p>
+            <w:pPr>
+              <w:spacing w:after="20" w:before="0" w:line="276"/>
+            </w:pPr>
+            <w:r>
+              <w:rPr>
+                <w:rFonts w:ascii="Calibri" w:cs="Calibri" w:eastAsia="Calibri" w:hAnsi="Calibri"/>
+                <w:b/>
+                <w:bCs/>
+                <w:color w:val="0D274D"/>
+                <w:sz w:val="17"/>
+                <w:szCs w:val="17"/>
+              </w:rPr>
+              <w:t xml:space="preserve">Partial, 2 to 7.  </w:t>
+            </w:r>
+            <w:r>
+              <w:rPr>
+                <w:rFonts w:ascii="Calibri" w:cs="Calibri" w:eastAsia="Calibri" w:hAnsi="Calibri"/>
+                <w:color w:val="46566E"/>
+                <w:sz w:val="17"/>
+                <w:szCs w:val="17"/>
+              </w:rPr>
+              <w:t xml:space="preserve">Names AI Defense but not the pre-production vetting of third-party models and agents.</w:t>
+            </w:r>
+          </w:p>
+          <w:p>
+            <w:pPr>
+              <w:spacing w:after="0" w:before="0" w:line="276"/>
+            </w:pPr>
+            <w:r>
+              <w:rPr>
+                <w:rFonts w:ascii="Calibri" w:cs="Calibri" w:eastAsia="Calibri" w:hAnsi="Calibri"/>
+                <w:b/>
+                <w:bCs/>
+                <w:color w:val="0D274D"/>
+                <w:sz w:val="17"/>
+                <w:szCs w:val="17"/>
+              </w:rPr>
+              <w:t xml:space="preserve">No credit, 0 to 1.  </w:t>
+            </w:r>
+            <w:r>
+              <w:rPr>
+                <w:rFonts w:ascii="Calibri" w:cs="Calibri" w:eastAsia="Calibri" w:hAnsi="Calibri"/>
+                <w:color w:val="46566E"/>
+                <w:sz w:val="17"/>
+                <w:szCs w:val="17"/>
+              </w:rPr>
+              <w:t xml:space="preserve">Endpoint antivirus or code scanning with no AI supply-chain reasoning.</w:t>
+            </w:r>
+          </w:p>
+        </w:tc>
+      </w:tr>
+    </w:tbl>
+    <w:p>
+      <w:pPr>
         <w:spacing w:after="160"/>
       </w:pPr>
       <w:r>
@@ -5566,6 +5998,174 @@
                 <w:szCs w:val="18"/>
               </w:rPr>
               <w:t xml:space="preserve">Identifies rogue or unsanctioned AI assets. Maps relationships across data, models, agents, and tools.</w:t>
+            </w:r>
+          </w:p>
+        </w:tc>
+      </w:tr>
+    </w:tbl>
+    <w:p>
+      <w:pPr>
+        <w:spacing w:after="40"/>
+      </w:pPr>
+      <w:r>
+        <w:rPr>
+          <w:rFonts w:ascii="Calibri" w:cs="Calibri" w:eastAsia="Calibri" w:hAnsi="Calibri"/>
+          <w:color w:val="14263A"/>
+          <w:sz w:val="2"/>
+          <w:szCs w:val="2"/>
+        </w:rPr>
+        <w:t xml:space="preserve"/>
+      </w:r>
+    </w:p>
+    <w:tbl>
+      <w:tblPr>
+        <w:tblW w:type="dxa" w:w="9360"/>
+        <w:tblBorders>
+          <w:top w:val="single" w:color="auto" w:sz="4"/>
+          <w:left w:val="single" w:color="auto" w:sz="4"/>
+          <w:bottom w:val="single" w:color="auto" w:sz="4"/>
+          <w:right w:val="single" w:color="auto" w:sz="4"/>
+          <w:insideH w:val="single" w:color="auto" w:sz="4"/>
+          <w:insideV w:val="single" w:color="auto" w:sz="4"/>
+        </w:tblBorders>
+      </w:tblPr>
+      <w:tblGrid>
+        <w:gridCol w:w="9360"/>
+      </w:tblGrid>
+      <w:tr>
+        <w:tc>
+          <w:tcPr>
+            <w:tcW w:type="dxa" w:w="9360"/>
+            <w:tcBorders>
+              <w:top w:val="single" w:color="CFE3EC" w:sz="6"/>
+              <w:left w:val="single" w:color="CFE3EC" w:sz="30"/>
+              <w:bottom w:val="single" w:color="CFE3EC" w:sz="6"/>
+              <w:right w:val="single" w:color="CFE3EC" w:sz="6"/>
+            </w:tcBorders>
+            <w:shd w:fill="F5FBFD" w:color="auto" w:val="clear"/>
+            <w:tcMar>
+              <w:top w:type="dxa" w:w="110"/>
+              <w:left w:type="dxa" w:w="160"/>
+              <w:bottom w:type="dxa" w:w="110"/>
+              <w:right w:type="dxa" w:w="160"/>
+            </w:tcMar>
+            <w:vAlign w:val="top"/>
+          </w:tcPr>
+          <w:p>
+            <w:pPr>
+              <w:spacing w:after="50" w:before="0" w:line="276"/>
+            </w:pPr>
+            <w:r>
+              <w:rPr>
+                <w:rFonts w:ascii="Calibri" w:cs="Calibri" w:eastAsia="Calibri" w:hAnsi="Calibri"/>
+                <w:b/>
+                <w:bCs/>
+                <w:caps/>
+                <w:color w:val="036C8F"/>
+                <w:sz w:val="15"/>
+                <w:szCs w:val="15"/>
+              </w:rPr>
+              <w:t xml:space="preserve">Also acceptable for Solution Designer, and how to grade</w:t>
+            </w:r>
+          </w:p>
+          <w:p>
+            <w:pPr>
+              <w:spacing w:after="30" w:before="0" w:line="276"/>
+            </w:pPr>
+            <w:r>
+              <w:rPr>
+                <w:rFonts w:ascii="Calibri" w:cs="Calibri" w:eastAsia="Calibri" w:hAnsi="Calibri"/>
+                <w:b/>
+                <w:bCs/>
+                <w:color w:val="0B6670"/>
+                <w:sz w:val="18"/>
+                <w:szCs w:val="18"/>
+              </w:rPr>
+              <w:t xml:space="preserve">Cisco Multicloud Defense (cloud traffic visibility)</w:t>
+            </w:r>
+            <w:r>
+              <w:rPr>
+                <w:rFonts w:ascii="Calibri" w:cs="Calibri" w:eastAsia="Calibri" w:hAnsi="Calibri"/>
+                <w:color w:val="2A3C52"/>
+                <w:sz w:val="18"/>
+                <w:szCs w:val="18"/>
+              </w:rPr>
+              <w:t xml:space="preserve">, complements AI Defense to discover AI assets and traffic across clouds; credit when paired or well argued.</w:t>
+            </w:r>
+          </w:p>
+          <w:p>
+            <w:pPr>
+              <w:spacing w:after="20" w:before="70" w:line="276"/>
+            </w:pPr>
+            <w:r>
+              <w:rPr>
+                <w:rFonts w:ascii="Calibri" w:cs="Calibri" w:eastAsia="Calibri" w:hAnsi="Calibri"/>
+                <w:b/>
+                <w:bCs/>
+                <w:color w:val="0B6670"/>
+                <w:sz w:val="17"/>
+                <w:szCs w:val="17"/>
+              </w:rPr>
+              <w:t xml:space="preserve">Full marks, 8 to 10.  </w:t>
+            </w:r>
+            <w:r>
+              <w:rPr>
+                <w:rFonts w:ascii="Calibri" w:cs="Calibri" w:eastAsia="Calibri" w:hAnsi="Calibri"/>
+                <w:color w:val="46566E"/>
+                <w:sz w:val="17"/>
+                <w:szCs w:val="17"/>
+              </w:rPr>
+              <w:t xml:space="preserve">The primary answer above, or any acceptable alternative, when the reasoning fits Cedarline.</w:t>
+            </w:r>
+          </w:p>
+          <w:p>
+            <w:pPr>
+              <w:spacing w:after="20" w:before="0" w:line="276"/>
+            </w:pPr>
+            <w:r>
+              <w:rPr>
+                <w:rFonts w:ascii="Calibri" w:cs="Calibri" w:eastAsia="Calibri" w:hAnsi="Calibri"/>
+                <w:b/>
+                <w:bCs/>
+                <w:color w:val="0D274D"/>
+                <w:sz w:val="17"/>
+                <w:szCs w:val="17"/>
+              </w:rPr>
+              <w:t xml:space="preserve">Partial, 2 to 7.  </w:t>
+            </w:r>
+            <w:r>
+              <w:rPr>
+                <w:rFonts w:ascii="Calibri" w:cs="Calibri" w:eastAsia="Calibri" w:hAnsi="Calibri"/>
+                <w:color w:val="46566E"/>
+                <w:sz w:val="17"/>
+                <w:szCs w:val="17"/>
+              </w:rPr>
+              <w:t xml:space="preserve">Names AI Defense but not the discovery of models, agents, datasets and MCP tools across the cloud.</w:t>
+            </w:r>
+          </w:p>
+          <w:p>
+            <w:pPr>
+              <w:spacing w:after="0" w:before="0" w:line="276"/>
+            </w:pPr>
+            <w:r>
+              <w:rPr>
+                <w:rFonts w:ascii="Calibri" w:cs="Calibri" w:eastAsia="Calibri" w:hAnsi="Calibri"/>
+                <w:b/>
+                <w:bCs/>
+                <w:color w:val="0D274D"/>
+                <w:sz w:val="17"/>
+                <w:szCs w:val="17"/>
+              </w:rPr>
+              <w:t xml:space="preserve">No credit, 0 to 1.  </w:t>
+            </w:r>
+            <w:r>
+              <w:rPr>
+                <w:rFonts w:ascii="Calibri" w:cs="Calibri" w:eastAsia="Calibri" w:hAnsi="Calibri"/>
+                <w:color w:val="46566E"/>
+                <w:sz w:val="17"/>
+                <w:szCs w:val="17"/>
+              </w:rPr>
+              <w:t xml:space="preserve">A generic cloud logging or posture tool with no AI-asset discovery.</w:t>
             </w:r>
           </w:p>
         </w:tc>
@@ -5996,6 +6596,199 @@
     </w:tbl>
     <w:p>
       <w:pPr>
+        <w:spacing w:after="40"/>
+      </w:pPr>
+      <w:r>
+        <w:rPr>
+          <w:rFonts w:ascii="Calibri" w:cs="Calibri" w:eastAsia="Calibri" w:hAnsi="Calibri"/>
+          <w:color w:val="14263A"/>
+          <w:sz w:val="2"/>
+          <w:szCs w:val="2"/>
+        </w:rPr>
+        <w:t xml:space="preserve"/>
+      </w:r>
+    </w:p>
+    <w:tbl>
+      <w:tblPr>
+        <w:tblW w:type="dxa" w:w="9360"/>
+        <w:tblBorders>
+          <w:top w:val="single" w:color="auto" w:sz="4"/>
+          <w:left w:val="single" w:color="auto" w:sz="4"/>
+          <w:bottom w:val="single" w:color="auto" w:sz="4"/>
+          <w:right w:val="single" w:color="auto" w:sz="4"/>
+          <w:insideH w:val="single" w:color="auto" w:sz="4"/>
+          <w:insideV w:val="single" w:color="auto" w:sz="4"/>
+        </w:tblBorders>
+      </w:tblPr>
+      <w:tblGrid>
+        <w:gridCol w:w="9360"/>
+      </w:tblGrid>
+      <w:tr>
+        <w:tc>
+          <w:tcPr>
+            <w:tcW w:type="dxa" w:w="9360"/>
+            <w:tcBorders>
+              <w:top w:val="single" w:color="CFE3EC" w:sz="6"/>
+              <w:left w:val="single" w:color="CFE3EC" w:sz="30"/>
+              <w:bottom w:val="single" w:color="CFE3EC" w:sz="6"/>
+              <w:right w:val="single" w:color="CFE3EC" w:sz="6"/>
+            </w:tcBorders>
+            <w:shd w:fill="F5FBFD" w:color="auto" w:val="clear"/>
+            <w:tcMar>
+              <w:top w:type="dxa" w:w="110"/>
+              <w:left w:type="dxa" w:w="160"/>
+              <w:bottom w:type="dxa" w:w="110"/>
+              <w:right w:type="dxa" w:w="160"/>
+            </w:tcMar>
+            <w:vAlign w:val="top"/>
+          </w:tcPr>
+          <w:p>
+            <w:pPr>
+              <w:spacing w:after="50" w:before="0" w:line="276"/>
+            </w:pPr>
+            <w:r>
+              <w:rPr>
+                <w:rFonts w:ascii="Calibri" w:cs="Calibri" w:eastAsia="Calibri" w:hAnsi="Calibri"/>
+                <w:b/>
+                <w:bCs/>
+                <w:caps/>
+                <w:color w:val="036C8F"/>
+                <w:sz w:val="15"/>
+                <w:szCs w:val="15"/>
+              </w:rPr>
+              <w:t xml:space="preserve">Also acceptable for Solution Designer, and how to grade</w:t>
+            </w:r>
+          </w:p>
+          <w:p>
+            <w:pPr>
+              <w:spacing w:after="30" w:before="0" w:line="276"/>
+            </w:pPr>
+            <w:r>
+              <w:rPr>
+                <w:rFonts w:ascii="Calibri" w:cs="Calibri" w:eastAsia="Calibri" w:hAnsi="Calibri"/>
+                <w:b/>
+                <w:bCs/>
+                <w:color w:val="0B6670"/>
+                <w:sz w:val="18"/>
+                <w:szCs w:val="18"/>
+              </w:rPr>
+              <w:t xml:space="preserve">Cisco Hypershield (runtime enforcement)</w:t>
+            </w:r>
+            <w:r>
+              <w:rPr>
+                <w:rFonts w:ascii="Calibri" w:cs="Calibri" w:eastAsia="Calibri" w:hAnsi="Calibri"/>
+                <w:color w:val="2A3C52"/>
+                <w:sz w:val="18"/>
+                <w:szCs w:val="18"/>
+              </w:rPr>
+              <w:t xml:space="preserve">, an HMF path to enforce guardrails on workload and AI traffic without changing applications.</w:t>
+            </w:r>
+          </w:p>
+          <w:p>
+            <w:pPr>
+              <w:spacing w:after="30" w:before="0" w:line="276"/>
+            </w:pPr>
+            <w:r>
+              <w:rPr>
+                <w:rFonts w:ascii="Calibri" w:cs="Calibri" w:eastAsia="Calibri" w:hAnsi="Calibri"/>
+                <w:b/>
+                <w:bCs/>
+                <w:color w:val="0B6670"/>
+                <w:sz w:val="18"/>
+                <w:szCs w:val="18"/>
+              </w:rPr>
+              <w:t xml:space="preserve">Cisco Multicloud Defense (cloud runtime enforcement)</w:t>
+            </w:r>
+            <w:r>
+              <w:rPr>
+                <w:rFonts w:ascii="Calibri" w:cs="Calibri" w:eastAsia="Calibri" w:hAnsi="Calibri"/>
+                <w:color w:val="2A3C52"/>
+                <w:sz w:val="18"/>
+                <w:szCs w:val="18"/>
+              </w:rPr>
+              <w:t xml:space="preserve">, enforces guardrails on AI traffic in the cloud alongside AI Defense.</w:t>
+            </w:r>
+          </w:p>
+          <w:p>
+            <w:pPr>
+              <w:spacing w:after="20" w:before="70" w:line="276"/>
+            </w:pPr>
+            <w:r>
+              <w:rPr>
+                <w:rFonts w:ascii="Calibri" w:cs="Calibri" w:eastAsia="Calibri" w:hAnsi="Calibri"/>
+                <w:b/>
+                <w:bCs/>
+                <w:color w:val="0B6670"/>
+                <w:sz w:val="17"/>
+                <w:szCs w:val="17"/>
+              </w:rPr>
+              <w:t xml:space="preserve">Full marks, 8 to 10.  </w:t>
+            </w:r>
+            <w:r>
+              <w:rPr>
+                <w:rFonts w:ascii="Calibri" w:cs="Calibri" w:eastAsia="Calibri" w:hAnsi="Calibri"/>
+                <w:color w:val="46566E"/>
+                <w:sz w:val="17"/>
+                <w:szCs w:val="17"/>
+              </w:rPr>
+              <w:t xml:space="preserve">The primary answer above, or any acceptable alternative, when the reasoning fits Cedarline.</w:t>
+            </w:r>
+          </w:p>
+          <w:p>
+            <w:pPr>
+              <w:spacing w:after="20" w:before="0" w:line="276"/>
+            </w:pPr>
+            <w:r>
+              <w:rPr>
+                <w:rFonts w:ascii="Calibri" w:cs="Calibri" w:eastAsia="Calibri" w:hAnsi="Calibri"/>
+                <w:b/>
+                <w:bCs/>
+                <w:color w:val="0D274D"/>
+                <w:sz w:val="17"/>
+                <w:szCs w:val="17"/>
+              </w:rPr>
+              <w:t xml:space="preserve">Partial, 2 to 7.  </w:t>
+            </w:r>
+            <w:r>
+              <w:rPr>
+                <w:rFonts w:ascii="Calibri" w:cs="Calibri" w:eastAsia="Calibri" w:hAnsi="Calibri"/>
+                <w:color w:val="46566E"/>
+                <w:sz w:val="17"/>
+                <w:szCs w:val="17"/>
+              </w:rPr>
+              <w:t xml:space="preserve">Names AI Defense or Multicloud Defense but not the runtime guardrail on prompt and response traffic.</w:t>
+            </w:r>
+          </w:p>
+          <w:p>
+            <w:pPr>
+              <w:spacing w:after="0" w:before="0" w:line="276"/>
+            </w:pPr>
+            <w:r>
+              <w:rPr>
+                <w:rFonts w:ascii="Calibri" w:cs="Calibri" w:eastAsia="Calibri" w:hAnsi="Calibri"/>
+                <w:b/>
+                <w:bCs/>
+                <w:color w:val="0D274D"/>
+                <w:sz w:val="17"/>
+                <w:szCs w:val="17"/>
+              </w:rPr>
+              <w:t xml:space="preserve">No credit, 0 to 1.  </w:t>
+            </w:r>
+            <w:r>
+              <w:rPr>
+                <w:rFonts w:ascii="Calibri" w:cs="Calibri" w:eastAsia="Calibri" w:hAnsi="Calibri"/>
+                <w:color w:val="46566E"/>
+                <w:sz w:val="17"/>
+                <w:szCs w:val="17"/>
+              </w:rPr>
+              <w:t xml:space="preserve">Blocking AI use outright, or an answer with no runtime inspection or enforcement.</w:t>
+            </w:r>
+          </w:p>
+        </w:tc>
+      </w:tr>
+    </w:tbl>
+    <w:p>
+      <w:pPr>
         <w:spacing w:after="160"/>
       </w:pPr>
       <w:r>
@@ -6128,7 +6921,7 @@
           <w:sz w:val="18"/>
           <w:szCs w:val="18"/>
         </w:rPr>
-        <w:t xml:space="preserve">The answer key below is the </w:t>
+        <w:t xml:space="preserve">For each pain point: the </w:t>
       </w:r>
       <w:r>
         <w:rPr>
@@ -6139,7 +6932,7 @@
           <w:sz w:val="18"/>
           <w:szCs w:val="18"/>
         </w:rPr>
-        <w:t xml:space="preserve">Complete</w:t>
+        <w:t xml:space="preserve">answer key</w:t>
       </w:r>
       <w:r>
         <w:rPr>
@@ -6148,7 +6941,27 @@
           <w:sz w:val="18"/>
           <w:szCs w:val="18"/>
         </w:rPr>
-        <w:t xml:space="preserve"> (full-marks) answer for each pain point. Grade the team's answer against it and the rubric levels; a Complete answer earns the top of each dimension's range.</w:t>
+        <w:t xml:space="preserve"> is the Complete (full-marks) answer, and the panel below it lists the </w:t>
+      </w:r>
+      <w:r>
+        <w:rPr>
+          <w:rFonts w:ascii="Calibri" w:cs="Calibri" w:eastAsia="Calibri" w:hAnsi="Calibri"/>
+          <w:b/>
+          <w:bCs/>
+          <w:color w:val="0D274D"/>
+          <w:sz w:val="18"/>
+          <w:szCs w:val="18"/>
+        </w:rPr>
+        <w:t xml:space="preserve">acceptable alternatives</w:t>
+      </w:r>
+      <w:r>
+        <w:rPr>
+          <w:rFonts w:ascii="Calibri" w:cs="Calibri" w:eastAsia="Calibri" w:hAnsi="Calibri"/>
+          <w:color w:val="7E8CA1"/>
+          <w:sz w:val="18"/>
+          <w:szCs w:val="18"/>
+        </w:rPr>
+        <w:t xml:space="preserve"> and how to grade partial and no-credit answers.</w:t>
       </w:r>
     </w:p>
     <w:p>
@@ -6555,6 +7368,199 @@
                 <w:szCs w:val="18"/>
               </w:rPr>
               <w:t xml:space="preserve">It provides granular visibility and control over east-west traffic. By applying Zero Trust principles across the hybrid fabric, you transform your network into a series of secure, isolated zones that prevent an attacker from pivoting through your infrastructure.</w:t>
+            </w:r>
+          </w:p>
+        </w:tc>
+      </w:tr>
+    </w:tbl>
+    <w:p>
+      <w:pPr>
+        <w:spacing w:after="40"/>
+      </w:pPr>
+      <w:r>
+        <w:rPr>
+          <w:rFonts w:ascii="Calibri" w:cs="Calibri" w:eastAsia="Calibri" w:hAnsi="Calibri"/>
+          <w:color w:val="14263A"/>
+          <w:sz w:val="2"/>
+          <w:szCs w:val="2"/>
+        </w:rPr>
+        <w:t xml:space="preserve"/>
+      </w:r>
+    </w:p>
+    <w:tbl>
+      <w:tblPr>
+        <w:tblW w:type="dxa" w:w="9360"/>
+        <w:tblBorders>
+          <w:top w:val="single" w:color="auto" w:sz="4"/>
+          <w:left w:val="single" w:color="auto" w:sz="4"/>
+          <w:bottom w:val="single" w:color="auto" w:sz="4"/>
+          <w:right w:val="single" w:color="auto" w:sz="4"/>
+          <w:insideH w:val="single" w:color="auto" w:sz="4"/>
+          <w:insideV w:val="single" w:color="auto" w:sz="4"/>
+        </w:tblBorders>
+      </w:tblPr>
+      <w:tblGrid>
+        <w:gridCol w:w="9360"/>
+      </w:tblGrid>
+      <w:tr>
+        <w:tc>
+          <w:tcPr>
+            <w:tcW w:type="dxa" w:w="9360"/>
+            <w:tcBorders>
+              <w:top w:val="single" w:color="CFE3EC" w:sz="6"/>
+              <w:left w:val="single" w:color="CFE3EC" w:sz="30"/>
+              <w:bottom w:val="single" w:color="CFE3EC" w:sz="6"/>
+              <w:right w:val="single" w:color="CFE3EC" w:sz="6"/>
+            </w:tcBorders>
+            <w:shd w:fill="F5FBFD" w:color="auto" w:val="clear"/>
+            <w:tcMar>
+              <w:top w:type="dxa" w:w="110"/>
+              <w:left w:type="dxa" w:w="160"/>
+              <w:bottom w:type="dxa" w:w="110"/>
+              <w:right w:type="dxa" w:w="160"/>
+            </w:tcMar>
+            <w:vAlign w:val="top"/>
+          </w:tcPr>
+          <w:p>
+            <w:pPr>
+              <w:spacing w:after="50" w:before="0" w:line="276"/>
+            </w:pPr>
+            <w:r>
+              <w:rPr>
+                <w:rFonts w:ascii="Calibri" w:cs="Calibri" w:eastAsia="Calibri" w:hAnsi="Calibri"/>
+                <w:b/>
+                <w:bCs/>
+                <w:caps/>
+                <w:color w:val="036C8F"/>
+                <w:sz w:val="15"/>
+                <w:szCs w:val="15"/>
+              </w:rPr>
+              <w:t xml:space="preserve">Also acceptable for Solution Designer, and how to grade</w:t>
+            </w:r>
+          </w:p>
+          <w:p>
+            <w:pPr>
+              <w:spacing w:after="30" w:before="0" w:line="276"/>
+            </w:pPr>
+            <w:r>
+              <w:rPr>
+                <w:rFonts w:ascii="Calibri" w:cs="Calibri" w:eastAsia="Calibri" w:hAnsi="Calibri"/>
+                <w:b/>
+                <w:bCs/>
+                <w:color w:val="0B6670"/>
+                <w:sz w:val="18"/>
+                <w:szCs w:val="18"/>
+              </w:rPr>
+              <w:t xml:space="preserve">Cisco Secure Workload (micro-segmentation)</w:t>
+            </w:r>
+            <w:r>
+              <w:rPr>
+                <w:rFonts w:ascii="Calibri" w:cs="Calibri" w:eastAsia="Calibri" w:hAnsi="Calibri"/>
+                <w:color w:val="2A3C52"/>
+                <w:sz w:val="18"/>
+                <w:szCs w:val="18"/>
+              </w:rPr>
+              <w:t xml:space="preserve">, contains east-west movement at the workload; credit alongside or instead of the gateways when argued.</w:t>
+            </w:r>
+          </w:p>
+          <w:p>
+            <w:pPr>
+              <w:spacing w:after="30" w:before="0" w:line="276"/>
+            </w:pPr>
+            <w:r>
+              <w:rPr>
+                <w:rFonts w:ascii="Calibri" w:cs="Calibri" w:eastAsia="Calibri" w:hAnsi="Calibri"/>
+                <w:b/>
+                <w:bCs/>
+                <w:color w:val="0B6670"/>
+                <w:sz w:val="18"/>
+                <w:szCs w:val="18"/>
+              </w:rPr>
+              <w:t xml:space="preserve">Cisco Hypershield</w:t>
+            </w:r>
+            <w:r>
+              <w:rPr>
+                <w:rFonts w:ascii="Calibri" w:cs="Calibri" w:eastAsia="Calibri" w:hAnsi="Calibri"/>
+                <w:color w:val="2A3C52"/>
+                <w:sz w:val="18"/>
+                <w:szCs w:val="18"/>
+              </w:rPr>
+              <w:t xml:space="preserve">, distributed segmentation and enforcement across the estate.</w:t>
+            </w:r>
+          </w:p>
+          <w:p>
+            <w:pPr>
+              <w:spacing w:after="20" w:before="70" w:line="276"/>
+            </w:pPr>
+            <w:r>
+              <w:rPr>
+                <w:rFonts w:ascii="Calibri" w:cs="Calibri" w:eastAsia="Calibri" w:hAnsi="Calibri"/>
+                <w:b/>
+                <w:bCs/>
+                <w:color w:val="0B6670"/>
+                <w:sz w:val="17"/>
+                <w:szCs w:val="17"/>
+              </w:rPr>
+              <w:t xml:space="preserve">Full marks, 8 to 10.  </w:t>
+            </w:r>
+            <w:r>
+              <w:rPr>
+                <w:rFonts w:ascii="Calibri" w:cs="Calibri" w:eastAsia="Calibri" w:hAnsi="Calibri"/>
+                <w:color w:val="46566E"/>
+                <w:sz w:val="17"/>
+                <w:szCs w:val="17"/>
+              </w:rPr>
+              <w:t xml:space="preserve">The primary answer above, or any acceptable alternative, when the reasoning fits Cedarline.</w:t>
+            </w:r>
+          </w:p>
+          <w:p>
+            <w:pPr>
+              <w:spacing w:after="20" w:before="0" w:line="276"/>
+            </w:pPr>
+            <w:r>
+              <w:rPr>
+                <w:rFonts w:ascii="Calibri" w:cs="Calibri" w:eastAsia="Calibri" w:hAnsi="Calibri"/>
+                <w:b/>
+                <w:bCs/>
+                <w:color w:val="0D274D"/>
+                <w:sz w:val="17"/>
+                <w:szCs w:val="17"/>
+              </w:rPr>
+              <w:t xml:space="preserve">Partial, 2 to 7.  </w:t>
+            </w:r>
+            <w:r>
+              <w:rPr>
+                <w:rFonts w:ascii="Calibri" w:cs="Calibri" w:eastAsia="Calibri" w:hAnsi="Calibri"/>
+                <w:color w:val="46566E"/>
+                <w:sz w:val="17"/>
+                <w:szCs w:val="17"/>
+              </w:rPr>
+              <w:t xml:space="preserve">Names Multicloud Defense but not segmentation to contain lateral movement.</w:t>
+            </w:r>
+          </w:p>
+          <w:p>
+            <w:pPr>
+              <w:spacing w:after="0" w:before="0" w:line="276"/>
+            </w:pPr>
+            <w:r>
+              <w:rPr>
+                <w:rFonts w:ascii="Calibri" w:cs="Calibri" w:eastAsia="Calibri" w:hAnsi="Calibri"/>
+                <w:b/>
+                <w:bCs/>
+                <w:color w:val="0D274D"/>
+                <w:sz w:val="17"/>
+                <w:szCs w:val="17"/>
+              </w:rPr>
+              <w:t xml:space="preserve">No credit, 0 to 1.  </w:t>
+            </w:r>
+            <w:r>
+              <w:rPr>
+                <w:rFonts w:ascii="Calibri" w:cs="Calibri" w:eastAsia="Calibri" w:hAnsi="Calibri"/>
+                <w:color w:val="46566E"/>
+                <w:sz w:val="17"/>
+                <w:szCs w:val="17"/>
+              </w:rPr>
+              <w:t xml:space="preserve">A single perimeter firewall with no multicloud or east-west control.</w:t>
             </w:r>
           </w:p>
         </w:tc>
@@ -6985,6 +7991,174 @@
     </w:tbl>
     <w:p>
       <w:pPr>
+        <w:spacing w:after="40"/>
+      </w:pPr>
+      <w:r>
+        <w:rPr>
+          <w:rFonts w:ascii="Calibri" w:cs="Calibri" w:eastAsia="Calibri" w:hAnsi="Calibri"/>
+          <w:color w:val="14263A"/>
+          <w:sz w:val="2"/>
+          <w:szCs w:val="2"/>
+        </w:rPr>
+        <w:t xml:space="preserve"/>
+      </w:r>
+    </w:p>
+    <w:tbl>
+      <w:tblPr>
+        <w:tblW w:type="dxa" w:w="9360"/>
+        <w:tblBorders>
+          <w:top w:val="single" w:color="auto" w:sz="4"/>
+          <w:left w:val="single" w:color="auto" w:sz="4"/>
+          <w:bottom w:val="single" w:color="auto" w:sz="4"/>
+          <w:right w:val="single" w:color="auto" w:sz="4"/>
+          <w:insideH w:val="single" w:color="auto" w:sz="4"/>
+          <w:insideV w:val="single" w:color="auto" w:sz="4"/>
+        </w:tblBorders>
+      </w:tblPr>
+      <w:tblGrid>
+        <w:gridCol w:w="9360"/>
+      </w:tblGrid>
+      <w:tr>
+        <w:tc>
+          <w:tcPr>
+            <w:tcW w:type="dxa" w:w="9360"/>
+            <w:tcBorders>
+              <w:top w:val="single" w:color="CFE3EC" w:sz="6"/>
+              <w:left w:val="single" w:color="CFE3EC" w:sz="30"/>
+              <w:bottom w:val="single" w:color="CFE3EC" w:sz="6"/>
+              <w:right w:val="single" w:color="CFE3EC" w:sz="6"/>
+            </w:tcBorders>
+            <w:shd w:fill="F5FBFD" w:color="auto" w:val="clear"/>
+            <w:tcMar>
+              <w:top w:type="dxa" w:w="110"/>
+              <w:left w:type="dxa" w:w="160"/>
+              <w:bottom w:type="dxa" w:w="110"/>
+              <w:right w:type="dxa" w:w="160"/>
+            </w:tcMar>
+            <w:vAlign w:val="top"/>
+          </w:tcPr>
+          <w:p>
+            <w:pPr>
+              <w:spacing w:after="50" w:before="0" w:line="276"/>
+            </w:pPr>
+            <w:r>
+              <w:rPr>
+                <w:rFonts w:ascii="Calibri" w:cs="Calibri" w:eastAsia="Calibri" w:hAnsi="Calibri"/>
+                <w:b/>
+                <w:bCs/>
+                <w:caps/>
+                <w:color w:val="036C8F"/>
+                <w:sz w:val="15"/>
+                <w:szCs w:val="15"/>
+              </w:rPr>
+              <w:t xml:space="preserve">Also acceptable for Solution Designer, and how to grade</w:t>
+            </w:r>
+          </w:p>
+          <w:p>
+            <w:pPr>
+              <w:spacing w:after="30" w:before="0" w:line="276"/>
+            </w:pPr>
+            <w:r>
+              <w:rPr>
+                <w:rFonts w:ascii="Calibri" w:cs="Calibri" w:eastAsia="Calibri" w:hAnsi="Calibri"/>
+                <w:b/>
+                <w:bCs/>
+                <w:color w:val="0B6670"/>
+                <w:sz w:val="18"/>
+                <w:szCs w:val="18"/>
+              </w:rPr>
+              <w:t xml:space="preserve">Cisco Security Cloud Control</w:t>
+            </w:r>
+            <w:r>
+              <w:rPr>
+                <w:rFonts w:ascii="Calibri" w:cs="Calibri" w:eastAsia="Calibri" w:hAnsi="Calibri"/>
+                <w:color w:val="2A3C52"/>
+                <w:sz w:val="18"/>
+                <w:szCs w:val="18"/>
+              </w:rPr>
+              <w:t xml:space="preserve">, central visibility and reporting across the estate to evidence controls to auditors.</w:t>
+            </w:r>
+          </w:p>
+          <w:p>
+            <w:pPr>
+              <w:spacing w:after="20" w:before="70" w:line="276"/>
+            </w:pPr>
+            <w:r>
+              <w:rPr>
+                <w:rFonts w:ascii="Calibri" w:cs="Calibri" w:eastAsia="Calibri" w:hAnsi="Calibri"/>
+                <w:b/>
+                <w:bCs/>
+                <w:color w:val="0B6670"/>
+                <w:sz w:val="17"/>
+                <w:szCs w:val="17"/>
+              </w:rPr>
+              <w:t xml:space="preserve">Full marks, 8 to 10.  </w:t>
+            </w:r>
+            <w:r>
+              <w:rPr>
+                <w:rFonts w:ascii="Calibri" w:cs="Calibri" w:eastAsia="Calibri" w:hAnsi="Calibri"/>
+                <w:color w:val="46566E"/>
+                <w:sz w:val="17"/>
+                <w:szCs w:val="17"/>
+              </w:rPr>
+              <w:t xml:space="preserve">The primary answer above, or any acceptable alternative, when the reasoning fits Cedarline.</w:t>
+            </w:r>
+          </w:p>
+          <w:p>
+            <w:pPr>
+              <w:spacing w:after="20" w:before="0" w:line="276"/>
+            </w:pPr>
+            <w:r>
+              <w:rPr>
+                <w:rFonts w:ascii="Calibri" w:cs="Calibri" w:eastAsia="Calibri" w:hAnsi="Calibri"/>
+                <w:b/>
+                <w:bCs/>
+                <w:color w:val="0D274D"/>
+                <w:sz w:val="17"/>
+                <w:szCs w:val="17"/>
+              </w:rPr>
+              <w:t xml:space="preserve">Partial, 2 to 7.  </w:t>
+            </w:r>
+            <w:r>
+              <w:rPr>
+                <w:rFonts w:ascii="Calibri" w:cs="Calibri" w:eastAsia="Calibri" w:hAnsi="Calibri"/>
+                <w:color w:val="46566E"/>
+                <w:sz w:val="17"/>
+                <w:szCs w:val="17"/>
+              </w:rPr>
+              <w:t xml:space="preserve">Names Multicloud Defense but not the audit or evidence angle.</w:t>
+            </w:r>
+          </w:p>
+          <w:p>
+            <w:pPr>
+              <w:spacing w:after="0" w:before="0" w:line="276"/>
+            </w:pPr>
+            <w:r>
+              <w:rPr>
+                <w:rFonts w:ascii="Calibri" w:cs="Calibri" w:eastAsia="Calibri" w:hAnsi="Calibri"/>
+                <w:b/>
+                <w:bCs/>
+                <w:color w:val="0D274D"/>
+                <w:sz w:val="17"/>
+                <w:szCs w:val="17"/>
+              </w:rPr>
+              <w:t xml:space="preserve">No credit, 0 to 1.  </w:t>
+            </w:r>
+            <w:r>
+              <w:rPr>
+                <w:rFonts w:ascii="Calibri" w:cs="Calibri" w:eastAsia="Calibri" w:hAnsi="Calibri"/>
+                <w:color w:val="46566E"/>
+                <w:sz w:val="17"/>
+                <w:szCs w:val="17"/>
+              </w:rPr>
+              <w:t xml:space="preserve">Per-cloud native logs or spreadsheets with no unified, auditable view.</w:t>
+            </w:r>
+          </w:p>
+        </w:tc>
+      </w:tr>
+    </w:tbl>
+    <w:p>
+      <w:pPr>
         <w:spacing w:after="160"/>
       </w:pPr>
       <w:r>
@@ -7401,6 +8575,174 @@
                 <w:szCs w:val="18"/>
               </w:rPr>
               <w:t xml:space="preserve">It replaces siloed, manual configuration with centralized orchestration. By abstracting the security policy from the cloud-native tools, it ensures that your security posture is uniform and eliminates the "configuration drift" that occurs when managing multiple cloud consoles.</w:t>
+            </w:r>
+          </w:p>
+        </w:tc>
+      </w:tr>
+    </w:tbl>
+    <w:p>
+      <w:pPr>
+        <w:spacing w:after="40"/>
+      </w:pPr>
+      <w:r>
+        <w:rPr>
+          <w:rFonts w:ascii="Calibri" w:cs="Calibri" w:eastAsia="Calibri" w:hAnsi="Calibri"/>
+          <w:color w:val="14263A"/>
+          <w:sz w:val="2"/>
+          <w:szCs w:val="2"/>
+        </w:rPr>
+        <w:t xml:space="preserve"/>
+      </w:r>
+    </w:p>
+    <w:tbl>
+      <w:tblPr>
+        <w:tblW w:type="dxa" w:w="9360"/>
+        <w:tblBorders>
+          <w:top w:val="single" w:color="auto" w:sz="4"/>
+          <w:left w:val="single" w:color="auto" w:sz="4"/>
+          <w:bottom w:val="single" w:color="auto" w:sz="4"/>
+          <w:right w:val="single" w:color="auto" w:sz="4"/>
+          <w:insideH w:val="single" w:color="auto" w:sz="4"/>
+          <w:insideV w:val="single" w:color="auto" w:sz="4"/>
+        </w:tblBorders>
+      </w:tblPr>
+      <w:tblGrid>
+        <w:gridCol w:w="9360"/>
+      </w:tblGrid>
+      <w:tr>
+        <w:tc>
+          <w:tcPr>
+            <w:tcW w:type="dxa" w:w="9360"/>
+            <w:tcBorders>
+              <w:top w:val="single" w:color="CFE3EC" w:sz="6"/>
+              <w:left w:val="single" w:color="CFE3EC" w:sz="30"/>
+              <w:bottom w:val="single" w:color="CFE3EC" w:sz="6"/>
+              <w:right w:val="single" w:color="CFE3EC" w:sz="6"/>
+            </w:tcBorders>
+            <w:shd w:fill="F5FBFD" w:color="auto" w:val="clear"/>
+            <w:tcMar>
+              <w:top w:type="dxa" w:w="110"/>
+              <w:left w:type="dxa" w:w="160"/>
+              <w:bottom w:type="dxa" w:w="110"/>
+              <w:right w:type="dxa" w:w="160"/>
+            </w:tcMar>
+            <w:vAlign w:val="top"/>
+          </w:tcPr>
+          <w:p>
+            <w:pPr>
+              <w:spacing w:after="50" w:before="0" w:line="276"/>
+            </w:pPr>
+            <w:r>
+              <w:rPr>
+                <w:rFonts w:ascii="Calibri" w:cs="Calibri" w:eastAsia="Calibri" w:hAnsi="Calibri"/>
+                <w:b/>
+                <w:bCs/>
+                <w:caps/>
+                <w:color w:val="036C8F"/>
+                <w:sz w:val="15"/>
+                <w:szCs w:val="15"/>
+              </w:rPr>
+              <w:t xml:space="preserve">Also acceptable for Solution Designer, and how to grade</w:t>
+            </w:r>
+          </w:p>
+          <w:p>
+            <w:pPr>
+              <w:spacing w:after="30" w:before="0" w:line="276"/>
+            </w:pPr>
+            <w:r>
+              <w:rPr>
+                <w:rFonts w:ascii="Calibri" w:cs="Calibri" w:eastAsia="Calibri" w:hAnsi="Calibri"/>
+                <w:b/>
+                <w:bCs/>
+                <w:color w:val="0B6670"/>
+                <w:sz w:val="18"/>
+                <w:szCs w:val="18"/>
+              </w:rPr>
+              <w:t xml:space="preserve">Cisco Secure Firewall with FMC or Security Cloud Control</w:t>
+            </w:r>
+            <w:r>
+              <w:rPr>
+                <w:rFonts w:ascii="Calibri" w:cs="Calibri" w:eastAsia="Calibri" w:hAnsi="Calibri"/>
+                <w:color w:val="2A3C52"/>
+                <w:sz w:val="18"/>
+                <w:szCs w:val="18"/>
+              </w:rPr>
+              <w:t xml:space="preserve">, consistent policy across the firewall estate; credit when the one-policy-model reasoning fits Cedarline.</w:t>
+            </w:r>
+          </w:p>
+          <w:p>
+            <w:pPr>
+              <w:spacing w:after="20" w:before="70" w:line="276"/>
+            </w:pPr>
+            <w:r>
+              <w:rPr>
+                <w:rFonts w:ascii="Calibri" w:cs="Calibri" w:eastAsia="Calibri" w:hAnsi="Calibri"/>
+                <w:b/>
+                <w:bCs/>
+                <w:color w:val="0B6670"/>
+                <w:sz w:val="17"/>
+                <w:szCs w:val="17"/>
+              </w:rPr>
+              <w:t xml:space="preserve">Full marks, 8 to 10.  </w:t>
+            </w:r>
+            <w:r>
+              <w:rPr>
+                <w:rFonts w:ascii="Calibri" w:cs="Calibri" w:eastAsia="Calibri" w:hAnsi="Calibri"/>
+                <w:color w:val="46566E"/>
+                <w:sz w:val="17"/>
+                <w:szCs w:val="17"/>
+              </w:rPr>
+              <w:t xml:space="preserve">The primary answer above, or any acceptable alternative, when the reasoning fits Cedarline.</w:t>
+            </w:r>
+          </w:p>
+          <w:p>
+            <w:pPr>
+              <w:spacing w:after="20" w:before="0" w:line="276"/>
+            </w:pPr>
+            <w:r>
+              <w:rPr>
+                <w:rFonts w:ascii="Calibri" w:cs="Calibri" w:eastAsia="Calibri" w:hAnsi="Calibri"/>
+                <w:b/>
+                <w:bCs/>
+                <w:color w:val="0D274D"/>
+                <w:sz w:val="17"/>
+                <w:szCs w:val="17"/>
+              </w:rPr>
+              <w:t xml:space="preserve">Partial, 2 to 7.  </w:t>
+            </w:r>
+            <w:r>
+              <w:rPr>
+                <w:rFonts w:ascii="Calibri" w:cs="Calibri" w:eastAsia="Calibri" w:hAnsi="Calibri"/>
+                <w:color w:val="46566E"/>
+                <w:sz w:val="17"/>
+                <w:szCs w:val="17"/>
+              </w:rPr>
+              <w:t xml:space="preserve">Names Multicloud Defense but not the single, consistent policy model across clouds.</w:t>
+            </w:r>
+          </w:p>
+          <w:p>
+            <w:pPr>
+              <w:spacing w:after="0" w:before="0" w:line="276"/>
+            </w:pPr>
+            <w:r>
+              <w:rPr>
+                <w:rFonts w:ascii="Calibri" w:cs="Calibri" w:eastAsia="Calibri" w:hAnsi="Calibri"/>
+                <w:b/>
+                <w:bCs/>
+                <w:color w:val="0D274D"/>
+                <w:sz w:val="17"/>
+                <w:szCs w:val="17"/>
+              </w:rPr>
+              <w:t xml:space="preserve">No credit, 0 to 1.  </w:t>
+            </w:r>
+            <w:r>
+              <w:rPr>
+                <w:rFonts w:ascii="Calibri" w:cs="Calibri" w:eastAsia="Calibri" w:hAnsi="Calibri"/>
+                <w:color w:val="46566E"/>
+                <w:sz w:val="17"/>
+                <w:szCs w:val="17"/>
+              </w:rPr>
+              <w:t xml:space="preserve">Separate per-cloud native firewalls managed independently.</w:t>
             </w:r>
           </w:p>
         </w:tc>
@@ -7831,6 +9173,199 @@
     </w:tbl>
     <w:p>
       <w:pPr>
+        <w:spacing w:after="40"/>
+      </w:pPr>
+      <w:r>
+        <w:rPr>
+          <w:rFonts w:ascii="Calibri" w:cs="Calibri" w:eastAsia="Calibri" w:hAnsi="Calibri"/>
+          <w:color w:val="14263A"/>
+          <w:sz w:val="2"/>
+          <w:szCs w:val="2"/>
+        </w:rPr>
+        <w:t xml:space="preserve"/>
+      </w:r>
+    </w:p>
+    <w:tbl>
+      <w:tblPr>
+        <w:tblW w:type="dxa" w:w="9360"/>
+        <w:tblBorders>
+          <w:top w:val="single" w:color="auto" w:sz="4"/>
+          <w:left w:val="single" w:color="auto" w:sz="4"/>
+          <w:bottom w:val="single" w:color="auto" w:sz="4"/>
+          <w:right w:val="single" w:color="auto" w:sz="4"/>
+          <w:insideH w:val="single" w:color="auto" w:sz="4"/>
+          <w:insideV w:val="single" w:color="auto" w:sz="4"/>
+        </w:tblBorders>
+      </w:tblPr>
+      <w:tblGrid>
+        <w:gridCol w:w="9360"/>
+      </w:tblGrid>
+      <w:tr>
+        <w:tc>
+          <w:tcPr>
+            <w:tcW w:type="dxa" w:w="9360"/>
+            <w:tcBorders>
+              <w:top w:val="single" w:color="CFE3EC" w:sz="6"/>
+              <w:left w:val="single" w:color="CFE3EC" w:sz="30"/>
+              <w:bottom w:val="single" w:color="CFE3EC" w:sz="6"/>
+              <w:right w:val="single" w:color="CFE3EC" w:sz="6"/>
+            </w:tcBorders>
+            <w:shd w:fill="F5FBFD" w:color="auto" w:val="clear"/>
+            <w:tcMar>
+              <w:top w:type="dxa" w:w="110"/>
+              <w:left w:type="dxa" w:w="160"/>
+              <w:bottom w:type="dxa" w:w="110"/>
+              <w:right w:type="dxa" w:w="160"/>
+            </w:tcMar>
+            <w:vAlign w:val="top"/>
+          </w:tcPr>
+          <w:p>
+            <w:pPr>
+              <w:spacing w:after="50" w:before="0" w:line="276"/>
+            </w:pPr>
+            <w:r>
+              <w:rPr>
+                <w:rFonts w:ascii="Calibri" w:cs="Calibri" w:eastAsia="Calibri" w:hAnsi="Calibri"/>
+                <w:b/>
+                <w:bCs/>
+                <w:caps/>
+                <w:color w:val="036C8F"/>
+                <w:sz w:val="15"/>
+                <w:szCs w:val="15"/>
+              </w:rPr>
+              <w:t xml:space="preserve">Also acceptable for Solution Designer, and how to grade</w:t>
+            </w:r>
+          </w:p>
+          <w:p>
+            <w:pPr>
+              <w:spacing w:after="30" w:before="0" w:line="276"/>
+            </w:pPr>
+            <w:r>
+              <w:rPr>
+                <w:rFonts w:ascii="Calibri" w:cs="Calibri" w:eastAsia="Calibri" w:hAnsi="Calibri"/>
+                <w:b/>
+                <w:bCs/>
+                <w:color w:val="0B6670"/>
+                <w:sz w:val="18"/>
+                <w:szCs w:val="18"/>
+              </w:rPr>
+              <w:t xml:space="preserve">Cisco Multicloud Defense (consistent segmentation policy)</w:t>
+            </w:r>
+            <w:r>
+              <w:rPr>
+                <w:rFonts w:ascii="Calibri" w:cs="Calibri" w:eastAsia="Calibri" w:hAnsi="Calibri"/>
+                <w:color w:val="2A3C52"/>
+                <w:sz w:val="18"/>
+                <w:szCs w:val="18"/>
+              </w:rPr>
+              <w:t xml:space="preserve">, enforces uniform segmentation across clouds; credit with Secure Workload's dependency mapping.</w:t>
+            </w:r>
+          </w:p>
+          <w:p>
+            <w:pPr>
+              <w:spacing w:after="30" w:before="0" w:line="276"/>
+            </w:pPr>
+            <w:r>
+              <w:rPr>
+                <w:rFonts w:ascii="Calibri" w:cs="Calibri" w:eastAsia="Calibri" w:hAnsi="Calibri"/>
+                <w:b/>
+                <w:bCs/>
+                <w:color w:val="0B6670"/>
+                <w:sz w:val="18"/>
+                <w:szCs w:val="18"/>
+              </w:rPr>
+              <w:t xml:space="preserve">Cisco Hypershield</w:t>
+            </w:r>
+            <w:r>
+              <w:rPr>
+                <w:rFonts w:ascii="Calibri" w:cs="Calibri" w:eastAsia="Calibri" w:hAnsi="Calibri"/>
+                <w:color w:val="2A3C52"/>
+                <w:sz w:val="18"/>
+                <w:szCs w:val="18"/>
+              </w:rPr>
+              <w:t xml:space="preserve">, distributed, consistent enforcement that prevents policy drift.</w:t>
+            </w:r>
+          </w:p>
+          <w:p>
+            <w:pPr>
+              <w:spacing w:after="20" w:before="70" w:line="276"/>
+            </w:pPr>
+            <w:r>
+              <w:rPr>
+                <w:rFonts w:ascii="Calibri" w:cs="Calibri" w:eastAsia="Calibri" w:hAnsi="Calibri"/>
+                <w:b/>
+                <w:bCs/>
+                <w:color w:val="0B6670"/>
+                <w:sz w:val="17"/>
+                <w:szCs w:val="17"/>
+              </w:rPr>
+              <w:t xml:space="preserve">Full marks, 8 to 10.  </w:t>
+            </w:r>
+            <w:r>
+              <w:rPr>
+                <w:rFonts w:ascii="Calibri" w:cs="Calibri" w:eastAsia="Calibri" w:hAnsi="Calibri"/>
+                <w:color w:val="46566E"/>
+                <w:sz w:val="17"/>
+                <w:szCs w:val="17"/>
+              </w:rPr>
+              <w:t xml:space="preserve">The primary answer above, or any acceptable alternative, when the reasoning fits Cedarline.</w:t>
+            </w:r>
+          </w:p>
+          <w:p>
+            <w:pPr>
+              <w:spacing w:after="20" w:before="0" w:line="276"/>
+            </w:pPr>
+            <w:r>
+              <w:rPr>
+                <w:rFonts w:ascii="Calibri" w:cs="Calibri" w:eastAsia="Calibri" w:hAnsi="Calibri"/>
+                <w:b/>
+                <w:bCs/>
+                <w:color w:val="0D274D"/>
+                <w:sz w:val="17"/>
+                <w:szCs w:val="17"/>
+              </w:rPr>
+              <w:t xml:space="preserve">Partial, 2 to 7.  </w:t>
+            </w:r>
+            <w:r>
+              <w:rPr>
+                <w:rFonts w:ascii="Calibri" w:cs="Calibri" w:eastAsia="Calibri" w:hAnsi="Calibri"/>
+                <w:color w:val="46566E"/>
+                <w:sz w:val="17"/>
+                <w:szCs w:val="17"/>
+              </w:rPr>
+              <w:t xml:space="preserve">Names Secure Workload or a firewall but not the drift-prevention or unified policy.</w:t>
+            </w:r>
+          </w:p>
+          <w:p>
+            <w:pPr>
+              <w:spacing w:after="0" w:before="0" w:line="276"/>
+            </w:pPr>
+            <w:r>
+              <w:rPr>
+                <w:rFonts w:ascii="Calibri" w:cs="Calibri" w:eastAsia="Calibri" w:hAnsi="Calibri"/>
+                <w:b/>
+                <w:bCs/>
+                <w:color w:val="0D274D"/>
+                <w:sz w:val="17"/>
+                <w:szCs w:val="17"/>
+              </w:rPr>
+              <w:t xml:space="preserve">No credit, 0 to 1.  </w:t>
+            </w:r>
+            <w:r>
+              <w:rPr>
+                <w:rFonts w:ascii="Calibri" w:cs="Calibri" w:eastAsia="Calibri" w:hAnsi="Calibri"/>
+                <w:color w:val="46566E"/>
+                <w:sz w:val="17"/>
+                <w:szCs w:val="17"/>
+              </w:rPr>
+              <w:t xml:space="preserve">Point segmentation in one environment only.</w:t>
+            </w:r>
+          </w:p>
+        </w:tc>
+      </w:tr>
+    </w:tbl>
+    <w:p>
+      <w:pPr>
         <w:spacing w:after="160"/>
       </w:pPr>
       <w:r>
@@ -7963,7 +9498,7 @@
           <w:sz w:val="18"/>
           <w:szCs w:val="18"/>
         </w:rPr>
-        <w:t xml:space="preserve">The answer key below is the </w:t>
+        <w:t xml:space="preserve">For each pain point: the </w:t>
       </w:r>
       <w:r>
         <w:rPr>
@@ -7974,7 +9509,7 @@
           <w:sz w:val="18"/>
           <w:szCs w:val="18"/>
         </w:rPr>
-        <w:t xml:space="preserve">Complete</w:t>
+        <w:t xml:space="preserve">answer key</w:t>
       </w:r>
       <w:r>
         <w:rPr>
@@ -7983,7 +9518,27 @@
           <w:sz w:val="18"/>
           <w:szCs w:val="18"/>
         </w:rPr>
-        <w:t xml:space="preserve"> (full-marks) answer for each pain point. Grade the team's answer against it and the rubric levels; a Complete answer earns the top of each dimension's range.</w:t>
+        <w:t xml:space="preserve"> is the Complete (full-marks) answer, and the panel below it lists the </w:t>
+      </w:r>
+      <w:r>
+        <w:rPr>
+          <w:rFonts w:ascii="Calibri" w:cs="Calibri" w:eastAsia="Calibri" w:hAnsi="Calibri"/>
+          <w:b/>
+          <w:bCs/>
+          <w:color w:val="0D274D"/>
+          <w:sz w:val="18"/>
+          <w:szCs w:val="18"/>
+        </w:rPr>
+        <w:t xml:space="preserve">acceptable alternatives</w:t>
+      </w:r>
+      <w:r>
+        <w:rPr>
+          <w:rFonts w:ascii="Calibri" w:cs="Calibri" w:eastAsia="Calibri" w:hAnsi="Calibri"/>
+          <w:color w:val="7E8CA1"/>
+          <w:sz w:val="18"/>
+          <w:szCs w:val="18"/>
+        </w:rPr>
+        <w:t xml:space="preserve"> and how to grade partial and no-credit answers.</w:t>
       </w:r>
     </w:p>
     <w:p>
@@ -8390,6 +9945,199 @@
                 <w:szCs w:val="18"/>
               </w:rPr>
               <w:t xml:space="preserve">It automates the "Response" phase of the incident lifecycle. By bridging the gap between detection and enforcement, it stops threats at the speed of the network.</w:t>
+            </w:r>
+          </w:p>
+        </w:tc>
+      </w:tr>
+    </w:tbl>
+    <w:p>
+      <w:pPr>
+        <w:spacing w:after="40"/>
+      </w:pPr>
+      <w:r>
+        <w:rPr>
+          <w:rFonts w:ascii="Calibri" w:cs="Calibri" w:eastAsia="Calibri" w:hAnsi="Calibri"/>
+          <w:color w:val="14263A"/>
+          <w:sz w:val="2"/>
+          <w:szCs w:val="2"/>
+        </w:rPr>
+        <w:t xml:space="preserve"/>
+      </w:r>
+    </w:p>
+    <w:tbl>
+      <w:tblPr>
+        <w:tblW w:type="dxa" w:w="9360"/>
+        <w:tblBorders>
+          <w:top w:val="single" w:color="auto" w:sz="4"/>
+          <w:left w:val="single" w:color="auto" w:sz="4"/>
+          <w:bottom w:val="single" w:color="auto" w:sz="4"/>
+          <w:right w:val="single" w:color="auto" w:sz="4"/>
+          <w:insideH w:val="single" w:color="auto" w:sz="4"/>
+          <w:insideV w:val="single" w:color="auto" w:sz="4"/>
+        </w:tblBorders>
+      </w:tblPr>
+      <w:tblGrid>
+        <w:gridCol w:w="9360"/>
+      </w:tblGrid>
+      <w:tr>
+        <w:tc>
+          <w:tcPr>
+            <w:tcW w:type="dxa" w:w="9360"/>
+            <w:tcBorders>
+              <w:top w:val="single" w:color="CFE3EC" w:sz="6"/>
+              <w:left w:val="single" w:color="CFE3EC" w:sz="30"/>
+              <w:bottom w:val="single" w:color="CFE3EC" w:sz="6"/>
+              <w:right w:val="single" w:color="CFE3EC" w:sz="6"/>
+            </w:tcBorders>
+            <w:shd w:fill="F5FBFD" w:color="auto" w:val="clear"/>
+            <w:tcMar>
+              <w:top w:type="dxa" w:w="110"/>
+              <w:left w:type="dxa" w:w="160"/>
+              <w:bottom w:type="dxa" w:w="110"/>
+              <w:right w:type="dxa" w:w="160"/>
+            </w:tcMar>
+            <w:vAlign w:val="top"/>
+          </w:tcPr>
+          <w:p>
+            <w:pPr>
+              <w:spacing w:after="50" w:before="0" w:line="276"/>
+            </w:pPr>
+            <w:r>
+              <w:rPr>
+                <w:rFonts w:ascii="Calibri" w:cs="Calibri" w:eastAsia="Calibri" w:hAnsi="Calibri"/>
+                <w:b/>
+                <w:bCs/>
+                <w:caps/>
+                <w:color w:val="036C8F"/>
+                <w:sz w:val="15"/>
+                <w:szCs w:val="15"/>
+              </w:rPr>
+              <w:t xml:space="preserve">Also acceptable for Solution Designer, and how to grade</w:t>
+            </w:r>
+          </w:p>
+          <w:p>
+            <w:pPr>
+              <w:spacing w:after="30" w:before="0" w:line="276"/>
+            </w:pPr>
+            <w:r>
+              <w:rPr>
+                <w:rFonts w:ascii="Calibri" w:cs="Calibri" w:eastAsia="Calibri" w:hAnsi="Calibri"/>
+                <w:b/>
+                <w:bCs/>
+                <w:color w:val="0B6670"/>
+                <w:sz w:val="18"/>
+                <w:szCs w:val="18"/>
+              </w:rPr>
+              <w:t xml:space="preserve">Cisco Secure Firewall integrated with ISE</w:t>
+            </w:r>
+            <w:r>
+              <w:rPr>
+                <w:rFonts w:ascii="Calibri" w:cs="Calibri" w:eastAsia="Calibri" w:hAnsi="Calibri"/>
+                <w:color w:val="2A3C52"/>
+                <w:sz w:val="18"/>
+                <w:szCs w:val="18"/>
+              </w:rPr>
+              <w:t xml:space="preserve">, firewall-triggered containment through ISE; credit when the automated quarantine path is clear.</w:t>
+            </w:r>
+          </w:p>
+          <w:p>
+            <w:pPr>
+              <w:spacing w:after="30" w:before="0" w:line="276"/>
+            </w:pPr>
+            <w:r>
+              <w:rPr>
+                <w:rFonts w:ascii="Calibri" w:cs="Calibri" w:eastAsia="Calibri" w:hAnsi="Calibri"/>
+                <w:b/>
+                <w:bCs/>
+                <w:color w:val="0B6670"/>
+                <w:sz w:val="18"/>
+                <w:szCs w:val="18"/>
+              </w:rPr>
+              <w:t xml:space="preserve">Cisco ISE with Adaptive Network Control</w:t>
+            </w:r>
+            <w:r>
+              <w:rPr>
+                <w:rFonts w:ascii="Calibri" w:cs="Calibri" w:eastAsia="Calibri" w:hAnsi="Calibri"/>
+                <w:color w:val="2A3C52"/>
+                <w:sz w:val="18"/>
+                <w:szCs w:val="18"/>
+              </w:rPr>
+              <w:t xml:space="preserve">, the core real-time auto-quarantine capability.</w:t>
+            </w:r>
+          </w:p>
+          <w:p>
+            <w:pPr>
+              <w:spacing w:after="20" w:before="70" w:line="276"/>
+            </w:pPr>
+            <w:r>
+              <w:rPr>
+                <w:rFonts w:ascii="Calibri" w:cs="Calibri" w:eastAsia="Calibri" w:hAnsi="Calibri"/>
+                <w:b/>
+                <w:bCs/>
+                <w:color w:val="0B6670"/>
+                <w:sz w:val="17"/>
+                <w:szCs w:val="17"/>
+              </w:rPr>
+              <w:t xml:space="preserve">Full marks, 8 to 10.  </w:t>
+            </w:r>
+            <w:r>
+              <w:rPr>
+                <w:rFonts w:ascii="Calibri" w:cs="Calibri" w:eastAsia="Calibri" w:hAnsi="Calibri"/>
+                <w:color w:val="46566E"/>
+                <w:sz w:val="17"/>
+                <w:szCs w:val="17"/>
+              </w:rPr>
+              <w:t xml:space="preserve">The primary answer above, or any acceptable alternative, when the reasoning fits Cedarline.</w:t>
+            </w:r>
+          </w:p>
+          <w:p>
+            <w:pPr>
+              <w:spacing w:after="20" w:before="0" w:line="276"/>
+            </w:pPr>
+            <w:r>
+              <w:rPr>
+                <w:rFonts w:ascii="Calibri" w:cs="Calibri" w:eastAsia="Calibri" w:hAnsi="Calibri"/>
+                <w:b/>
+                <w:bCs/>
+                <w:color w:val="0D274D"/>
+                <w:sz w:val="17"/>
+                <w:szCs w:val="17"/>
+              </w:rPr>
+              <w:t xml:space="preserve">Partial, 2 to 7.  </w:t>
+            </w:r>
+            <w:r>
+              <w:rPr>
+                <w:rFonts w:ascii="Calibri" w:cs="Calibri" w:eastAsia="Calibri" w:hAnsi="Calibri"/>
+                <w:color w:val="46566E"/>
+                <w:sz w:val="17"/>
+                <w:szCs w:val="17"/>
+              </w:rPr>
+              <w:t xml:space="preserve">Names ISE but not the automated, real-time quarantine through pxGrid or ANC.</w:t>
+            </w:r>
+          </w:p>
+          <w:p>
+            <w:pPr>
+              <w:spacing w:after="0" w:before="0" w:line="276"/>
+            </w:pPr>
+            <w:r>
+              <w:rPr>
+                <w:rFonts w:ascii="Calibri" w:cs="Calibri" w:eastAsia="Calibri" w:hAnsi="Calibri"/>
+                <w:b/>
+                <w:bCs/>
+                <w:color w:val="0D274D"/>
+                <w:sz w:val="17"/>
+                <w:szCs w:val="17"/>
+              </w:rPr>
+              <w:t xml:space="preserve">No credit, 0 to 1.  </w:t>
+            </w:r>
+            <w:r>
+              <w:rPr>
+                <w:rFonts w:ascii="Calibri" w:cs="Calibri" w:eastAsia="Calibri" w:hAnsi="Calibri"/>
+                <w:color w:val="46566E"/>
+                <w:sz w:val="17"/>
+                <w:szCs w:val="17"/>
+              </w:rPr>
+              <w:t xml:space="preserve">A manual, ticket-based response, or a firewall rule with no identity or automation.</w:t>
             </w:r>
           </w:p>
         </w:tc>
@@ -8820,6 +10568,174 @@
     </w:tbl>
     <w:p>
       <w:pPr>
+        <w:spacing w:after="40"/>
+      </w:pPr>
+      <w:r>
+        <w:rPr>
+          <w:rFonts w:ascii="Calibri" w:cs="Calibri" w:eastAsia="Calibri" w:hAnsi="Calibri"/>
+          <w:color w:val="14263A"/>
+          <w:sz w:val="2"/>
+          <w:szCs w:val="2"/>
+        </w:rPr>
+        <w:t xml:space="preserve"/>
+      </w:r>
+    </w:p>
+    <w:tbl>
+      <w:tblPr>
+        <w:tblW w:type="dxa" w:w="9360"/>
+        <w:tblBorders>
+          <w:top w:val="single" w:color="auto" w:sz="4"/>
+          <w:left w:val="single" w:color="auto" w:sz="4"/>
+          <w:bottom w:val="single" w:color="auto" w:sz="4"/>
+          <w:right w:val="single" w:color="auto" w:sz="4"/>
+          <w:insideH w:val="single" w:color="auto" w:sz="4"/>
+          <w:insideV w:val="single" w:color="auto" w:sz="4"/>
+        </w:tblBorders>
+      </w:tblPr>
+      <w:tblGrid>
+        <w:gridCol w:w="9360"/>
+      </w:tblGrid>
+      <w:tr>
+        <w:tc>
+          <w:tcPr>
+            <w:tcW w:type="dxa" w:w="9360"/>
+            <w:tcBorders>
+              <w:top w:val="single" w:color="CFE3EC" w:sz="6"/>
+              <w:left w:val="single" w:color="CFE3EC" w:sz="30"/>
+              <w:bottom w:val="single" w:color="CFE3EC" w:sz="6"/>
+              <w:right w:val="single" w:color="CFE3EC" w:sz="6"/>
+            </w:tcBorders>
+            <w:shd w:fill="F5FBFD" w:color="auto" w:val="clear"/>
+            <w:tcMar>
+              <w:top w:type="dxa" w:w="110"/>
+              <w:left w:type="dxa" w:w="160"/>
+              <w:bottom w:type="dxa" w:w="110"/>
+              <w:right w:type="dxa" w:w="160"/>
+            </w:tcMar>
+            <w:vAlign w:val="top"/>
+          </w:tcPr>
+          <w:p>
+            <w:pPr>
+              <w:spacing w:after="50" w:before="0" w:line="276"/>
+            </w:pPr>
+            <w:r>
+              <w:rPr>
+                <w:rFonts w:ascii="Calibri" w:cs="Calibri" w:eastAsia="Calibri" w:hAnsi="Calibri"/>
+                <w:b/>
+                <w:bCs/>
+                <w:caps/>
+                <w:color w:val="036C8F"/>
+                <w:sz w:val="15"/>
+                <w:szCs w:val="15"/>
+              </w:rPr>
+              <w:t xml:space="preserve">Also acceptable for Solution Designer, and how to grade</w:t>
+            </w:r>
+          </w:p>
+          <w:p>
+            <w:pPr>
+              <w:spacing w:after="30" w:before="0" w:line="276"/>
+            </w:pPr>
+            <w:r>
+              <w:rPr>
+                <w:rFonts w:ascii="Calibri" w:cs="Calibri" w:eastAsia="Calibri" w:hAnsi="Calibri"/>
+                <w:b/>
+                <w:bCs/>
+                <w:color w:val="0B6670"/>
+                <w:sz w:val="18"/>
+                <w:szCs w:val="18"/>
+              </w:rPr>
+              <w:t xml:space="preserve">Cisco Secure Firewall Management Center (FMC)</w:t>
+            </w:r>
+            <w:r>
+              <w:rPr>
+                <w:rFonts w:ascii="Calibri" w:cs="Calibri" w:eastAsia="Calibri" w:hAnsi="Calibri"/>
+                <w:color w:val="2A3C52"/>
+                <w:sz w:val="18"/>
+                <w:szCs w:val="18"/>
+              </w:rPr>
+              <w:t xml:space="preserve">, centralised policy administration and rulebase cleanup; credit when the at-scale simplification is argued.</w:t>
+            </w:r>
+          </w:p>
+          <w:p>
+            <w:pPr>
+              <w:spacing w:after="20" w:before="70" w:line="276"/>
+            </w:pPr>
+            <w:r>
+              <w:rPr>
+                <w:rFonts w:ascii="Calibri" w:cs="Calibri" w:eastAsia="Calibri" w:hAnsi="Calibri"/>
+                <w:b/>
+                <w:bCs/>
+                <w:color w:val="0B6670"/>
+                <w:sz w:val="17"/>
+                <w:szCs w:val="17"/>
+              </w:rPr>
+              <w:t xml:space="preserve">Full marks, 8 to 10.  </w:t>
+            </w:r>
+            <w:r>
+              <w:rPr>
+                <w:rFonts w:ascii="Calibri" w:cs="Calibri" w:eastAsia="Calibri" w:hAnsi="Calibri"/>
+                <w:color w:val="46566E"/>
+                <w:sz w:val="17"/>
+                <w:szCs w:val="17"/>
+              </w:rPr>
+              <w:t xml:space="preserve">The primary answer above, or any acceptable alternative, when the reasoning fits Cedarline.</w:t>
+            </w:r>
+          </w:p>
+          <w:p>
+            <w:pPr>
+              <w:spacing w:after="20" w:before="0" w:line="276"/>
+            </w:pPr>
+            <w:r>
+              <w:rPr>
+                <w:rFonts w:ascii="Calibri" w:cs="Calibri" w:eastAsia="Calibri" w:hAnsi="Calibri"/>
+                <w:b/>
+                <w:bCs/>
+                <w:color w:val="0D274D"/>
+                <w:sz w:val="17"/>
+                <w:szCs w:val="17"/>
+              </w:rPr>
+              <w:t xml:space="preserve">Partial, 2 to 7.  </w:t>
+            </w:r>
+            <w:r>
+              <w:rPr>
+                <w:rFonts w:ascii="Calibri" w:cs="Calibri" w:eastAsia="Calibri" w:hAnsi="Calibri"/>
+                <w:color w:val="46566E"/>
+                <w:sz w:val="17"/>
+                <w:szCs w:val="17"/>
+              </w:rPr>
+              <w:t xml:space="preserve">Names a manager but not the rulebase cleanup or consolidation at scale.</w:t>
+            </w:r>
+          </w:p>
+          <w:p>
+            <w:pPr>
+              <w:spacing w:after="0" w:before="0" w:line="276"/>
+            </w:pPr>
+            <w:r>
+              <w:rPr>
+                <w:rFonts w:ascii="Calibri" w:cs="Calibri" w:eastAsia="Calibri" w:hAnsi="Calibri"/>
+                <w:b/>
+                <w:bCs/>
+                <w:color w:val="0D274D"/>
+                <w:sz w:val="17"/>
+                <w:szCs w:val="17"/>
+              </w:rPr>
+              <w:t xml:space="preserve">No credit, 0 to 1.  </w:t>
+            </w:r>
+            <w:r>
+              <w:rPr>
+                <w:rFonts w:ascii="Calibri" w:cs="Calibri" w:eastAsia="Calibri" w:hAnsi="Calibri"/>
+                <w:color w:val="46566E"/>
+                <w:sz w:val="17"/>
+                <w:szCs w:val="17"/>
+              </w:rPr>
+              <w:t xml:space="preserve">Editing firewalls device by device with no central management.</w:t>
+            </w:r>
+          </w:p>
+        </w:tc>
+      </w:tr>
+    </w:tbl>
+    <w:p>
+      <w:pPr>
         <w:spacing w:after="160"/>
       </w:pPr>
       <w:r>
@@ -9236,6 +11152,174 @@
                 <w:szCs w:val="18"/>
               </w:rPr>
               <w:t xml:space="preserve">Restores visibility into encrypted blind spots; avoids the performance/privacy overhead of decrypt-everything strategies.</w:t>
+            </w:r>
+          </w:p>
+        </w:tc>
+      </w:tr>
+    </w:tbl>
+    <w:p>
+      <w:pPr>
+        <w:spacing w:after="40"/>
+      </w:pPr>
+      <w:r>
+        <w:rPr>
+          <w:rFonts w:ascii="Calibri" w:cs="Calibri" w:eastAsia="Calibri" w:hAnsi="Calibri"/>
+          <w:color w:val="14263A"/>
+          <w:sz w:val="2"/>
+          <w:szCs w:val="2"/>
+        </w:rPr>
+        <w:t xml:space="preserve"/>
+      </w:r>
+    </w:p>
+    <w:tbl>
+      <w:tblPr>
+        <w:tblW w:type="dxa" w:w="9360"/>
+        <w:tblBorders>
+          <w:top w:val="single" w:color="auto" w:sz="4"/>
+          <w:left w:val="single" w:color="auto" w:sz="4"/>
+          <w:bottom w:val="single" w:color="auto" w:sz="4"/>
+          <w:right w:val="single" w:color="auto" w:sz="4"/>
+          <w:insideH w:val="single" w:color="auto" w:sz="4"/>
+          <w:insideV w:val="single" w:color="auto" w:sz="4"/>
+        </w:tblBorders>
+      </w:tblPr>
+      <w:tblGrid>
+        <w:gridCol w:w="9360"/>
+      </w:tblGrid>
+      <w:tr>
+        <w:tc>
+          <w:tcPr>
+            <w:tcW w:type="dxa" w:w="9360"/>
+            <w:tcBorders>
+              <w:top w:val="single" w:color="CFE3EC" w:sz="6"/>
+              <w:left w:val="single" w:color="CFE3EC" w:sz="30"/>
+              <w:bottom w:val="single" w:color="CFE3EC" w:sz="6"/>
+              <w:right w:val="single" w:color="CFE3EC" w:sz="6"/>
+            </w:tcBorders>
+            <w:shd w:fill="F5FBFD" w:color="auto" w:val="clear"/>
+            <w:tcMar>
+              <w:top w:type="dxa" w:w="110"/>
+              <w:left w:type="dxa" w:w="160"/>
+              <w:bottom w:type="dxa" w:w="110"/>
+              <w:right w:type="dxa" w:w="160"/>
+            </w:tcMar>
+            <w:vAlign w:val="top"/>
+          </w:tcPr>
+          <w:p>
+            <w:pPr>
+              <w:spacing w:after="50" w:before="0" w:line="276"/>
+            </w:pPr>
+            <w:r>
+              <w:rPr>
+                <w:rFonts w:ascii="Calibri" w:cs="Calibri" w:eastAsia="Calibri" w:hAnsi="Calibri"/>
+                <w:b/>
+                <w:bCs/>
+                <w:caps/>
+                <w:color w:val="036C8F"/>
+                <w:sz w:val="15"/>
+                <w:szCs w:val="15"/>
+              </w:rPr>
+              <w:t xml:space="preserve">Also acceptable for Solution Designer, and how to grade</w:t>
+            </w:r>
+          </w:p>
+          <w:p>
+            <w:pPr>
+              <w:spacing w:after="30" w:before="0" w:line="276"/>
+            </w:pPr>
+            <w:r>
+              <w:rPr>
+                <w:rFonts w:ascii="Calibri" w:cs="Calibri" w:eastAsia="Calibri" w:hAnsi="Calibri"/>
+                <w:b/>
+                <w:bCs/>
+                <w:color w:val="0B6670"/>
+                <w:sz w:val="18"/>
+                <w:szCs w:val="18"/>
+              </w:rPr>
+              <w:t xml:space="preserve">Cisco Secure Firewall with selective TLS decryption</w:t>
+            </w:r>
+            <w:r>
+              <w:rPr>
+                <w:rFonts w:ascii="Calibri" w:cs="Calibri" w:eastAsia="Calibri" w:hAnsi="Calibri"/>
+                <w:color w:val="2A3C52"/>
+                <w:sz w:val="18"/>
+                <w:szCs w:val="18"/>
+              </w:rPr>
+              <w:t xml:space="preserve">, a valid but heavier path; credit when selective decryption is justified, though EVE is preferred for no-decrypt visibility.</w:t>
+            </w:r>
+          </w:p>
+          <w:p>
+            <w:pPr>
+              <w:spacing w:after="20" w:before="70" w:line="276"/>
+            </w:pPr>
+            <w:r>
+              <w:rPr>
+                <w:rFonts w:ascii="Calibri" w:cs="Calibri" w:eastAsia="Calibri" w:hAnsi="Calibri"/>
+                <w:b/>
+                <w:bCs/>
+                <w:color w:val="0B6670"/>
+                <w:sz w:val="17"/>
+                <w:szCs w:val="17"/>
+              </w:rPr>
+              <w:t xml:space="preserve">Full marks, 8 to 10.  </w:t>
+            </w:r>
+            <w:r>
+              <w:rPr>
+                <w:rFonts w:ascii="Calibri" w:cs="Calibri" w:eastAsia="Calibri" w:hAnsi="Calibri"/>
+                <w:color w:val="46566E"/>
+                <w:sz w:val="17"/>
+                <w:szCs w:val="17"/>
+              </w:rPr>
+              <w:t xml:space="preserve">The primary answer above, or any acceptable alternative, when the reasoning fits Cedarline.</w:t>
+            </w:r>
+          </w:p>
+          <w:p>
+            <w:pPr>
+              <w:spacing w:after="20" w:before="0" w:line="276"/>
+            </w:pPr>
+            <w:r>
+              <w:rPr>
+                <w:rFonts w:ascii="Calibri" w:cs="Calibri" w:eastAsia="Calibri" w:hAnsi="Calibri"/>
+                <w:b/>
+                <w:bCs/>
+                <w:color w:val="0D274D"/>
+                <w:sz w:val="17"/>
+                <w:szCs w:val="17"/>
+              </w:rPr>
+              <w:t xml:space="preserve">Partial, 2 to 7.  </w:t>
+            </w:r>
+            <w:r>
+              <w:rPr>
+                <w:rFonts w:ascii="Calibri" w:cs="Calibri" w:eastAsia="Calibri" w:hAnsi="Calibri"/>
+                <w:color w:val="46566E"/>
+                <w:sz w:val="17"/>
+                <w:szCs w:val="17"/>
+              </w:rPr>
+              <w:t xml:space="preserve">Names Secure Firewall but not EVE or a no-decrypt approach to encrypted traffic.</w:t>
+            </w:r>
+          </w:p>
+          <w:p>
+            <w:pPr>
+              <w:spacing w:after="0" w:before="0" w:line="276"/>
+            </w:pPr>
+            <w:r>
+              <w:rPr>
+                <w:rFonts w:ascii="Calibri" w:cs="Calibri" w:eastAsia="Calibri" w:hAnsi="Calibri"/>
+                <w:b/>
+                <w:bCs/>
+                <w:color w:val="0D274D"/>
+                <w:sz w:val="17"/>
+                <w:szCs w:val="17"/>
+              </w:rPr>
+              <w:t xml:space="preserve">No credit, 0 to 1.  </w:t>
+            </w:r>
+            <w:r>
+              <w:rPr>
+                <w:rFonts w:ascii="Calibri" w:cs="Calibri" w:eastAsia="Calibri" w:hAnsi="Calibri"/>
+                <w:color w:val="46566E"/>
+                <w:sz w:val="17"/>
+                <w:szCs w:val="17"/>
+              </w:rPr>
+              <w:t xml:space="preserve">Blanket decryption of all traffic, or ignoring encrypted flows entirely.</w:t>
             </w:r>
           </w:p>
         </w:tc>
@@ -9657,6 +11741,174 @@
     </w:tbl>
     <w:p>
       <w:pPr>
+        <w:spacing w:after="40"/>
+      </w:pPr>
+      <w:r>
+        <w:rPr>
+          <w:rFonts w:ascii="Calibri" w:cs="Calibri" w:eastAsia="Calibri" w:hAnsi="Calibri"/>
+          <w:color w:val="14263A"/>
+          <w:sz w:val="2"/>
+          <w:szCs w:val="2"/>
+        </w:rPr>
+        <w:t xml:space="preserve"/>
+      </w:r>
+    </w:p>
+    <w:tbl>
+      <w:tblPr>
+        <w:tblW w:type="dxa" w:w="9360"/>
+        <w:tblBorders>
+          <w:top w:val="single" w:color="auto" w:sz="4"/>
+          <w:left w:val="single" w:color="auto" w:sz="4"/>
+          <w:bottom w:val="single" w:color="auto" w:sz="4"/>
+          <w:right w:val="single" w:color="auto" w:sz="4"/>
+          <w:insideH w:val="single" w:color="auto" w:sz="4"/>
+          <w:insideV w:val="single" w:color="auto" w:sz="4"/>
+        </w:tblBorders>
+      </w:tblPr>
+      <w:tblGrid>
+        <w:gridCol w:w="9360"/>
+      </w:tblGrid>
+      <w:tr>
+        <w:tc>
+          <w:tcPr>
+            <w:tcW w:type="dxa" w:w="9360"/>
+            <w:tcBorders>
+              <w:top w:val="single" w:color="CFE3EC" w:sz="6"/>
+              <w:left w:val="single" w:color="CFE3EC" w:sz="30"/>
+              <w:bottom w:val="single" w:color="CFE3EC" w:sz="6"/>
+              <w:right w:val="single" w:color="CFE3EC" w:sz="6"/>
+            </w:tcBorders>
+            <w:shd w:fill="F5FBFD" w:color="auto" w:val="clear"/>
+            <w:tcMar>
+              <w:top w:type="dxa" w:w="110"/>
+              <w:left w:type="dxa" w:w="160"/>
+              <w:bottom w:type="dxa" w:w="110"/>
+              <w:right w:type="dxa" w:w="160"/>
+            </w:tcMar>
+            <w:vAlign w:val="top"/>
+          </w:tcPr>
+          <w:p>
+            <w:pPr>
+              <w:spacing w:after="50" w:before="0" w:line="276"/>
+            </w:pPr>
+            <w:r>
+              <w:rPr>
+                <w:rFonts w:ascii="Calibri" w:cs="Calibri" w:eastAsia="Calibri" w:hAnsi="Calibri"/>
+                <w:b/>
+                <w:bCs/>
+                <w:caps/>
+                <w:color w:val="036C8F"/>
+                <w:sz w:val="15"/>
+                <w:szCs w:val="15"/>
+              </w:rPr>
+              <w:t xml:space="preserve">Also acceptable for Solution Designer, and how to grade</w:t>
+            </w:r>
+          </w:p>
+          <w:p>
+            <w:pPr>
+              <w:spacing w:after="30" w:before="0" w:line="276"/>
+            </w:pPr>
+            <w:r>
+              <w:rPr>
+                <w:rFonts w:ascii="Calibri" w:cs="Calibri" w:eastAsia="Calibri" w:hAnsi="Calibri"/>
+                <w:b/>
+                <w:bCs/>
+                <w:color w:val="0B6670"/>
+                <w:sz w:val="18"/>
+                <w:szCs w:val="18"/>
+              </w:rPr>
+              <w:t xml:space="preserve">Cisco Secure Firewall with Talos-backed IPS and malware protection</w:t>
+            </w:r>
+            <w:r>
+              <w:rPr>
+                <w:rFonts w:ascii="Calibri" w:cs="Calibri" w:eastAsia="Calibri" w:hAnsi="Calibri"/>
+                <w:color w:val="2A3C52"/>
+                <w:sz w:val="18"/>
+                <w:szCs w:val="18"/>
+              </w:rPr>
+              <w:t xml:space="preserve">, complementary advanced detection; credit when the beyond-signature reasoning is present, with Snort ML preferred.</w:t>
+            </w:r>
+          </w:p>
+          <w:p>
+            <w:pPr>
+              <w:spacing w:after="20" w:before="70" w:line="276"/>
+            </w:pPr>
+            <w:r>
+              <w:rPr>
+                <w:rFonts w:ascii="Calibri" w:cs="Calibri" w:eastAsia="Calibri" w:hAnsi="Calibri"/>
+                <w:b/>
+                <w:bCs/>
+                <w:color w:val="0B6670"/>
+                <w:sz w:val="17"/>
+                <w:szCs w:val="17"/>
+              </w:rPr>
+              <w:t xml:space="preserve">Full marks, 8 to 10.  </w:t>
+            </w:r>
+            <w:r>
+              <w:rPr>
+                <w:rFonts w:ascii="Calibri" w:cs="Calibri" w:eastAsia="Calibri" w:hAnsi="Calibri"/>
+                <w:color w:val="46566E"/>
+                <w:sz w:val="17"/>
+                <w:szCs w:val="17"/>
+              </w:rPr>
+              <w:t xml:space="preserve">The primary answer above, or any acceptable alternative, when the reasoning fits Cedarline.</w:t>
+            </w:r>
+          </w:p>
+          <w:p>
+            <w:pPr>
+              <w:spacing w:after="20" w:before="0" w:line="276"/>
+            </w:pPr>
+            <w:r>
+              <w:rPr>
+                <w:rFonts w:ascii="Calibri" w:cs="Calibri" w:eastAsia="Calibri" w:hAnsi="Calibri"/>
+                <w:b/>
+                <w:bCs/>
+                <w:color w:val="0D274D"/>
+                <w:sz w:val="17"/>
+                <w:szCs w:val="17"/>
+              </w:rPr>
+              <w:t xml:space="preserve">Partial, 2 to 7.  </w:t>
+            </w:r>
+            <w:r>
+              <w:rPr>
+                <w:rFonts w:ascii="Calibri" w:cs="Calibri" w:eastAsia="Calibri" w:hAnsi="Calibri"/>
+                <w:color w:val="46566E"/>
+                <w:sz w:val="17"/>
+                <w:szCs w:val="17"/>
+              </w:rPr>
+              <w:t xml:space="preserve">Names Secure Firewall or IPS but not machine-learning or zero-day detection.</w:t>
+            </w:r>
+          </w:p>
+          <w:p>
+            <w:pPr>
+              <w:spacing w:after="0" w:before="0" w:line="276"/>
+            </w:pPr>
+            <w:r>
+              <w:rPr>
+                <w:rFonts w:ascii="Calibri" w:cs="Calibri" w:eastAsia="Calibri" w:hAnsi="Calibri"/>
+                <w:b/>
+                <w:bCs/>
+                <w:color w:val="0D274D"/>
+                <w:sz w:val="17"/>
+                <w:szCs w:val="17"/>
+              </w:rPr>
+              <w:t xml:space="preserve">No credit, 0 to 1.  </w:t>
+            </w:r>
+            <w:r>
+              <w:rPr>
+                <w:rFonts w:ascii="Calibri" w:cs="Calibri" w:eastAsia="Calibri" w:hAnsi="Calibri"/>
+                <w:color w:val="46566E"/>
+                <w:sz w:val="17"/>
+                <w:szCs w:val="17"/>
+              </w:rPr>
+              <w:t xml:space="preserve">Signature-only IPS with no unknown-threat detection.</w:t>
+            </w:r>
+          </w:p>
+        </w:tc>
+      </w:tr>
+    </w:tbl>
+    <w:p>
+      <w:pPr>
         <w:spacing w:after="160"/>
       </w:pPr>
       <w:r>
@@ -9789,7 +12041,7 @@
           <w:sz w:val="18"/>
           <w:szCs w:val="18"/>
         </w:rPr>
-        <w:t xml:space="preserve">The answer key below is the </w:t>
+        <w:t xml:space="preserve">For each pain point: the </w:t>
       </w:r>
       <w:r>
         <w:rPr>
@@ -9800,7 +12052,7 @@
           <w:sz w:val="18"/>
           <w:szCs w:val="18"/>
         </w:rPr>
-        <w:t xml:space="preserve">Complete</w:t>
+        <w:t xml:space="preserve">answer key</w:t>
       </w:r>
       <w:r>
         <w:rPr>
@@ -9809,7 +12061,27 @@
           <w:sz w:val="18"/>
           <w:szCs w:val="18"/>
         </w:rPr>
-        <w:t xml:space="preserve"> (full-marks) answer for each pain point. Grade the team's answer against it and the rubric levels; a Complete answer earns the top of each dimension's range.</w:t>
+        <w:t xml:space="preserve"> is the Complete (full-marks) answer, and the panel below it lists the </w:t>
+      </w:r>
+      <w:r>
+        <w:rPr>
+          <w:rFonts w:ascii="Calibri" w:cs="Calibri" w:eastAsia="Calibri" w:hAnsi="Calibri"/>
+          <w:b/>
+          <w:bCs/>
+          <w:color w:val="0D274D"/>
+          <w:sz w:val="18"/>
+          <w:szCs w:val="18"/>
+        </w:rPr>
+        <w:t xml:space="preserve">acceptable alternatives</w:t>
+      </w:r>
+      <w:r>
+        <w:rPr>
+          <w:rFonts w:ascii="Calibri" w:cs="Calibri" w:eastAsia="Calibri" w:hAnsi="Calibri"/>
+          <w:color w:val="7E8CA1"/>
+          <w:sz w:val="18"/>
+          <w:szCs w:val="18"/>
+        </w:rPr>
+        <w:t xml:space="preserve"> and how to grade partial and no-credit answers.</w:t>
       </w:r>
     </w:p>
     <w:p>
@@ -10216,6 +12488,199 @@
                 <w:szCs w:val="18"/>
               </w:rPr>
               <w:t xml:space="preserve">Adds runtime visibility beyond basic network controls. Detects suspicious system and network behavior in real time.</w:t>
+            </w:r>
+          </w:p>
+        </w:tc>
+      </w:tr>
+    </w:tbl>
+    <w:p>
+      <w:pPr>
+        <w:spacing w:after="40"/>
+      </w:pPr>
+      <w:r>
+        <w:rPr>
+          <w:rFonts w:ascii="Calibri" w:cs="Calibri" w:eastAsia="Calibri" w:hAnsi="Calibri"/>
+          <w:color w:val="14263A"/>
+          <w:sz w:val="2"/>
+          <w:szCs w:val="2"/>
+        </w:rPr>
+        <w:t xml:space="preserve"/>
+      </w:r>
+    </w:p>
+    <w:tbl>
+      <w:tblPr>
+        <w:tblW w:type="dxa" w:w="9360"/>
+        <w:tblBorders>
+          <w:top w:val="single" w:color="auto" w:sz="4"/>
+          <w:left w:val="single" w:color="auto" w:sz="4"/>
+          <w:bottom w:val="single" w:color="auto" w:sz="4"/>
+          <w:right w:val="single" w:color="auto" w:sz="4"/>
+          <w:insideH w:val="single" w:color="auto" w:sz="4"/>
+          <w:insideV w:val="single" w:color="auto" w:sz="4"/>
+        </w:tblBorders>
+      </w:tblPr>
+      <w:tblGrid>
+        <w:gridCol w:w="9360"/>
+      </w:tblGrid>
+      <w:tr>
+        <w:tc>
+          <w:tcPr>
+            <w:tcW w:type="dxa" w:w="9360"/>
+            <w:tcBorders>
+              <w:top w:val="single" w:color="CFE3EC" w:sz="6"/>
+              <w:left w:val="single" w:color="CFE3EC" w:sz="30"/>
+              <w:bottom w:val="single" w:color="CFE3EC" w:sz="6"/>
+              <w:right w:val="single" w:color="CFE3EC" w:sz="6"/>
+            </w:tcBorders>
+            <w:shd w:fill="F5FBFD" w:color="auto" w:val="clear"/>
+            <w:tcMar>
+              <w:top w:type="dxa" w:w="110"/>
+              <w:left w:type="dxa" w:w="160"/>
+              <w:bottom w:type="dxa" w:w="110"/>
+              <w:right w:type="dxa" w:w="160"/>
+            </w:tcMar>
+            <w:vAlign w:val="top"/>
+          </w:tcPr>
+          <w:p>
+            <w:pPr>
+              <w:spacing w:after="50" w:before="0" w:line="276"/>
+            </w:pPr>
+            <w:r>
+              <w:rPr>
+                <w:rFonts w:ascii="Calibri" w:cs="Calibri" w:eastAsia="Calibri" w:hAnsi="Calibri"/>
+                <w:b/>
+                <w:bCs/>
+                <w:caps/>
+                <w:color w:val="036C8F"/>
+                <w:sz w:val="15"/>
+                <w:szCs w:val="15"/>
+              </w:rPr>
+              <w:t xml:space="preserve">Also acceptable for Solution Designer, and how to grade</w:t>
+            </w:r>
+          </w:p>
+          <w:p>
+            <w:pPr>
+              <w:spacing w:after="30" w:before="0" w:line="276"/>
+            </w:pPr>
+            <w:r>
+              <w:rPr>
+                <w:rFonts w:ascii="Calibri" w:cs="Calibri" w:eastAsia="Calibri" w:hAnsi="Calibri"/>
+                <w:b/>
+                <w:bCs/>
+                <w:color w:val="0B6670"/>
+                <w:sz w:val="18"/>
+                <w:szCs w:val="18"/>
+              </w:rPr>
+              <w:t xml:space="preserve">Cisco Secure Workload</w:t>
+            </w:r>
+            <w:r>
+              <w:rPr>
+                <w:rFonts w:ascii="Calibri" w:cs="Calibri" w:eastAsia="Calibri" w:hAnsi="Calibri"/>
+                <w:color w:val="2A3C52"/>
+                <w:sz w:val="18"/>
+                <w:szCs w:val="18"/>
+              </w:rPr>
+              <w:t xml:space="preserve">, process and behaviour visibility with policy for workloads; credit alongside or instead of Tetragon when argued.</w:t>
+            </w:r>
+          </w:p>
+          <w:p>
+            <w:pPr>
+              <w:spacing w:after="30" w:before="0" w:line="276"/>
+            </w:pPr>
+            <w:r>
+              <w:rPr>
+                <w:rFonts w:ascii="Calibri" w:cs="Calibri" w:eastAsia="Calibri" w:hAnsi="Calibri"/>
+                <w:b/>
+                <w:bCs/>
+                <w:color w:val="0B6670"/>
+                <w:sz w:val="18"/>
+                <w:szCs w:val="18"/>
+              </w:rPr>
+              <w:t xml:space="preserve">Cisco Hypershield</w:t>
+            </w:r>
+            <w:r>
+              <w:rPr>
+                <w:rFonts w:ascii="Calibri" w:cs="Calibri" w:eastAsia="Calibri" w:hAnsi="Calibri"/>
+                <w:color w:val="2A3C52"/>
+                <w:sz w:val="18"/>
+                <w:szCs w:val="18"/>
+              </w:rPr>
+              <w:t xml:space="preserve">, in-kernel eBPF runtime detection and enforcement.</w:t>
+            </w:r>
+          </w:p>
+          <w:p>
+            <w:pPr>
+              <w:spacing w:after="20" w:before="70" w:line="276"/>
+            </w:pPr>
+            <w:r>
+              <w:rPr>
+                <w:rFonts w:ascii="Calibri" w:cs="Calibri" w:eastAsia="Calibri" w:hAnsi="Calibri"/>
+                <w:b/>
+                <w:bCs/>
+                <w:color w:val="0B6670"/>
+                <w:sz w:val="17"/>
+                <w:szCs w:val="17"/>
+              </w:rPr>
+              <w:t xml:space="preserve">Full marks, 8 to 10.  </w:t>
+            </w:r>
+            <w:r>
+              <w:rPr>
+                <w:rFonts w:ascii="Calibri" w:cs="Calibri" w:eastAsia="Calibri" w:hAnsi="Calibri"/>
+                <w:color w:val="46566E"/>
+                <w:sz w:val="17"/>
+                <w:szCs w:val="17"/>
+              </w:rPr>
+              <w:t xml:space="preserve">The primary answer above, or any acceptable alternative, when the reasoning fits Cedarline.</w:t>
+            </w:r>
+          </w:p>
+          <w:p>
+            <w:pPr>
+              <w:spacing w:after="20" w:before="0" w:line="276"/>
+            </w:pPr>
+            <w:r>
+              <w:rPr>
+                <w:rFonts w:ascii="Calibri" w:cs="Calibri" w:eastAsia="Calibri" w:hAnsi="Calibri"/>
+                <w:b/>
+                <w:bCs/>
+                <w:color w:val="0D274D"/>
+                <w:sz w:val="17"/>
+                <w:szCs w:val="17"/>
+              </w:rPr>
+              <w:t xml:space="preserve">Partial, 2 to 7.  </w:t>
+            </w:r>
+            <w:r>
+              <w:rPr>
+                <w:rFonts w:ascii="Calibri" w:cs="Calibri" w:eastAsia="Calibri" w:hAnsi="Calibri"/>
+                <w:color w:val="46566E"/>
+                <w:sz w:val="17"/>
+                <w:szCs w:val="17"/>
+              </w:rPr>
+              <w:t xml:space="preserve">Names an eBPF or workload tool but not the runtime behaviour detection inside workloads.</w:t>
+            </w:r>
+          </w:p>
+          <w:p>
+            <w:pPr>
+              <w:spacing w:after="0" w:before="0" w:line="276"/>
+            </w:pPr>
+            <w:r>
+              <w:rPr>
+                <w:rFonts w:ascii="Calibri" w:cs="Calibri" w:eastAsia="Calibri" w:hAnsi="Calibri"/>
+                <w:b/>
+                <w:bCs/>
+                <w:color w:val="0D274D"/>
+                <w:sz w:val="17"/>
+                <w:szCs w:val="17"/>
+              </w:rPr>
+              <w:t xml:space="preserve">No credit, 0 to 1.  </w:t>
+            </w:r>
+            <w:r>
+              <w:rPr>
+                <w:rFonts w:ascii="Calibri" w:cs="Calibri" w:eastAsia="Calibri" w:hAnsi="Calibri"/>
+                <w:color w:val="46566E"/>
+                <w:sz w:val="17"/>
+                <w:szCs w:val="17"/>
+              </w:rPr>
+              <w:t xml:space="preserve">Perimeter intrusion prevention only, with no workload runtime visibility.</w:t>
             </w:r>
           </w:p>
         </w:tc>
@@ -10646,6 +13111,174 @@
     </w:tbl>
     <w:p>
       <w:pPr>
+        <w:spacing w:after="40"/>
+      </w:pPr>
+      <w:r>
+        <w:rPr>
+          <w:rFonts w:ascii="Calibri" w:cs="Calibri" w:eastAsia="Calibri" w:hAnsi="Calibri"/>
+          <w:color w:val="14263A"/>
+          <w:sz w:val="2"/>
+          <w:szCs w:val="2"/>
+        </w:rPr>
+        <w:t xml:space="preserve"/>
+      </w:r>
+    </w:p>
+    <w:tbl>
+      <w:tblPr>
+        <w:tblW w:type="dxa" w:w="9360"/>
+        <w:tblBorders>
+          <w:top w:val="single" w:color="auto" w:sz="4"/>
+          <w:left w:val="single" w:color="auto" w:sz="4"/>
+          <w:bottom w:val="single" w:color="auto" w:sz="4"/>
+          <w:right w:val="single" w:color="auto" w:sz="4"/>
+          <w:insideH w:val="single" w:color="auto" w:sz="4"/>
+          <w:insideV w:val="single" w:color="auto" w:sz="4"/>
+        </w:tblBorders>
+      </w:tblPr>
+      <w:tblGrid>
+        <w:gridCol w:w="9360"/>
+      </w:tblGrid>
+      <w:tr>
+        <w:tc>
+          <w:tcPr>
+            <w:tcW w:type="dxa" w:w="9360"/>
+            <w:tcBorders>
+              <w:top w:val="single" w:color="CFE3EC" w:sz="6"/>
+              <w:left w:val="single" w:color="CFE3EC" w:sz="30"/>
+              <w:bottom w:val="single" w:color="CFE3EC" w:sz="6"/>
+              <w:right w:val="single" w:color="CFE3EC" w:sz="6"/>
+            </w:tcBorders>
+            <w:shd w:fill="F5FBFD" w:color="auto" w:val="clear"/>
+            <w:tcMar>
+              <w:top w:type="dxa" w:w="110"/>
+              <w:left w:type="dxa" w:w="160"/>
+              <w:bottom w:type="dxa" w:w="110"/>
+              <w:right w:type="dxa" w:w="160"/>
+            </w:tcMar>
+            <w:vAlign w:val="top"/>
+          </w:tcPr>
+          <w:p>
+            <w:pPr>
+              <w:spacing w:after="50" w:before="0" w:line="276"/>
+            </w:pPr>
+            <w:r>
+              <w:rPr>
+                <w:rFonts w:ascii="Calibri" w:cs="Calibri" w:eastAsia="Calibri" w:hAnsi="Calibri"/>
+                <w:b/>
+                <w:bCs/>
+                <w:caps/>
+                <w:color w:val="036C8F"/>
+                <w:sz w:val="15"/>
+                <w:szCs w:val="15"/>
+              </w:rPr>
+              <w:t xml:space="preserve">Also acceptable for Solution Designer, and how to grade</w:t>
+            </w:r>
+          </w:p>
+          <w:p>
+            <w:pPr>
+              <w:spacing w:after="30" w:before="0" w:line="276"/>
+            </w:pPr>
+            <w:r>
+              <w:rPr>
+                <w:rFonts w:ascii="Calibri" w:cs="Calibri" w:eastAsia="Calibri" w:hAnsi="Calibri"/>
+                <w:b/>
+                <w:bCs/>
+                <w:color w:val="0B6670"/>
+                <w:sz w:val="18"/>
+                <w:szCs w:val="18"/>
+              </w:rPr>
+              <w:t xml:space="preserve">Cisco Hypershield</w:t>
+            </w:r>
+            <w:r>
+              <w:rPr>
+                <w:rFonts w:ascii="Calibri" w:cs="Calibri" w:eastAsia="Calibri" w:hAnsi="Calibri"/>
+                <w:color w:val="2A3C52"/>
+                <w:sz w:val="18"/>
+                <w:szCs w:val="18"/>
+              </w:rPr>
+              <w:t xml:space="preserve">, distributed eBPF enforcement across Kubernetes and workloads.</w:t>
+            </w:r>
+          </w:p>
+          <w:p>
+            <w:pPr>
+              <w:spacing w:after="20" w:before="70" w:line="276"/>
+            </w:pPr>
+            <w:r>
+              <w:rPr>
+                <w:rFonts w:ascii="Calibri" w:cs="Calibri" w:eastAsia="Calibri" w:hAnsi="Calibri"/>
+                <w:b/>
+                <w:bCs/>
+                <w:color w:val="0B6670"/>
+                <w:sz w:val="17"/>
+                <w:szCs w:val="17"/>
+              </w:rPr>
+              <w:t xml:space="preserve">Full marks, 8 to 10.  </w:t>
+            </w:r>
+            <w:r>
+              <w:rPr>
+                <w:rFonts w:ascii="Calibri" w:cs="Calibri" w:eastAsia="Calibri" w:hAnsi="Calibri"/>
+                <w:color w:val="46566E"/>
+                <w:sz w:val="17"/>
+                <w:szCs w:val="17"/>
+              </w:rPr>
+              <w:t xml:space="preserve">The primary answer above, or any acceptable alternative, when the reasoning fits Cedarline.</w:t>
+            </w:r>
+          </w:p>
+          <w:p>
+            <w:pPr>
+              <w:spacing w:after="20" w:before="0" w:line="276"/>
+            </w:pPr>
+            <w:r>
+              <w:rPr>
+                <w:rFonts w:ascii="Calibri" w:cs="Calibri" w:eastAsia="Calibri" w:hAnsi="Calibri"/>
+                <w:b/>
+                <w:bCs/>
+                <w:color w:val="0D274D"/>
+                <w:sz w:val="17"/>
+                <w:szCs w:val="17"/>
+              </w:rPr>
+              <w:t xml:space="preserve">Partial, 2 to 7.  </w:t>
+            </w:r>
+            <w:r>
+              <w:rPr>
+                <w:rFonts w:ascii="Calibri" w:cs="Calibri" w:eastAsia="Calibri" w:hAnsi="Calibri"/>
+                <w:color w:val="46566E"/>
+                <w:sz w:val="17"/>
+                <w:szCs w:val="17"/>
+              </w:rPr>
+              <w:t xml:space="preserve">Names Cilium but not the consistent networking and policy across clusters.</w:t>
+            </w:r>
+          </w:p>
+          <w:p>
+            <w:pPr>
+              <w:spacing w:after="0" w:before="0" w:line="276"/>
+            </w:pPr>
+            <w:r>
+              <w:rPr>
+                <w:rFonts w:ascii="Calibri" w:cs="Calibri" w:eastAsia="Calibri" w:hAnsi="Calibri"/>
+                <w:b/>
+                <w:bCs/>
+                <w:color w:val="0D274D"/>
+                <w:sz w:val="17"/>
+                <w:szCs w:val="17"/>
+              </w:rPr>
+              <w:t xml:space="preserve">No credit, 0 to 1.  </w:t>
+            </w:r>
+            <w:r>
+              <w:rPr>
+                <w:rFonts w:ascii="Calibri" w:cs="Calibri" w:eastAsia="Calibri" w:hAnsi="Calibri"/>
+                <w:color w:val="46566E"/>
+                <w:sz w:val="17"/>
+                <w:szCs w:val="17"/>
+              </w:rPr>
+              <w:t xml:space="preserve">Per-cluster bespoke networking with no consistency.</w:t>
+            </w:r>
+          </w:p>
+        </w:tc>
+      </w:tr>
+    </w:tbl>
+    <w:p>
+      <w:pPr>
         <w:spacing w:after="160"/>
       </w:pPr>
       <w:r>
@@ -11053,6 +13686,174 @@
                 <w:szCs w:val="18"/>
               </w:rPr>
               <w:t xml:space="preserve">Consolidates multiple functions into one platform approach. Reduces tool sprawl and operational friction.</w:t>
+            </w:r>
+          </w:p>
+        </w:tc>
+      </w:tr>
+    </w:tbl>
+    <w:p>
+      <w:pPr>
+        <w:spacing w:after="40"/>
+      </w:pPr>
+      <w:r>
+        <w:rPr>
+          <w:rFonts w:ascii="Calibri" w:cs="Calibri" w:eastAsia="Calibri" w:hAnsi="Calibri"/>
+          <w:color w:val="14263A"/>
+          <w:sz w:val="2"/>
+          <w:szCs w:val="2"/>
+        </w:rPr>
+        <w:t xml:space="preserve"/>
+      </w:r>
+    </w:p>
+    <w:tbl>
+      <w:tblPr>
+        <w:tblW w:type="dxa" w:w="9360"/>
+        <w:tblBorders>
+          <w:top w:val="single" w:color="auto" w:sz="4"/>
+          <w:left w:val="single" w:color="auto" w:sz="4"/>
+          <w:bottom w:val="single" w:color="auto" w:sz="4"/>
+          <w:right w:val="single" w:color="auto" w:sz="4"/>
+          <w:insideH w:val="single" w:color="auto" w:sz="4"/>
+          <w:insideV w:val="single" w:color="auto" w:sz="4"/>
+        </w:tblBorders>
+      </w:tblPr>
+      <w:tblGrid>
+        <w:gridCol w:w="9360"/>
+      </w:tblGrid>
+      <w:tr>
+        <w:tc>
+          <w:tcPr>
+            <w:tcW w:type="dxa" w:w="9360"/>
+            <w:tcBorders>
+              <w:top w:val="single" w:color="CFE3EC" w:sz="6"/>
+              <w:left w:val="single" w:color="CFE3EC" w:sz="30"/>
+              <w:bottom w:val="single" w:color="CFE3EC" w:sz="6"/>
+              <w:right w:val="single" w:color="CFE3EC" w:sz="6"/>
+            </w:tcBorders>
+            <w:shd w:fill="F5FBFD" w:color="auto" w:val="clear"/>
+            <w:tcMar>
+              <w:top w:type="dxa" w:w="110"/>
+              <w:left w:type="dxa" w:w="160"/>
+              <w:bottom w:type="dxa" w:w="110"/>
+              <w:right w:type="dxa" w:w="160"/>
+            </w:tcMar>
+            <w:vAlign w:val="top"/>
+          </w:tcPr>
+          <w:p>
+            <w:pPr>
+              <w:spacing w:after="50" w:before="0" w:line="276"/>
+            </w:pPr>
+            <w:r>
+              <w:rPr>
+                <w:rFonts w:ascii="Calibri" w:cs="Calibri" w:eastAsia="Calibri" w:hAnsi="Calibri"/>
+                <w:b/>
+                <w:bCs/>
+                <w:caps/>
+                <w:color w:val="036C8F"/>
+                <w:sz w:val="15"/>
+                <w:szCs w:val="15"/>
+              </w:rPr>
+              <w:t xml:space="preserve">Also acceptable for Solution Designer, and how to grade</w:t>
+            </w:r>
+          </w:p>
+          <w:p>
+            <w:pPr>
+              <w:spacing w:after="30" w:before="0" w:line="276"/>
+            </w:pPr>
+            <w:r>
+              <w:rPr>
+                <w:rFonts w:ascii="Calibri" w:cs="Calibri" w:eastAsia="Calibri" w:hAnsi="Calibri"/>
+                <w:b/>
+                <w:bCs/>
+                <w:color w:val="0B6670"/>
+                <w:sz w:val="18"/>
+                <w:szCs w:val="18"/>
+              </w:rPr>
+              <w:t xml:space="preserve">Cisco Hypershield with Cisco Secure Workload</w:t>
+            </w:r>
+            <w:r>
+              <w:rPr>
+                <w:rFonts w:ascii="Calibri" w:cs="Calibri" w:eastAsia="Calibri" w:hAnsi="Calibri"/>
+                <w:color w:val="2A3C52"/>
+                <w:sz w:val="18"/>
+                <w:szCs w:val="18"/>
+              </w:rPr>
+              <w:t xml:space="preserve">, a consolidation path across enforcement and dependency visibility; credit when the tool-sprawl reduction is argued.</w:t>
+            </w:r>
+          </w:p>
+          <w:p>
+            <w:pPr>
+              <w:spacing w:after="20" w:before="70" w:line="276"/>
+            </w:pPr>
+            <w:r>
+              <w:rPr>
+                <w:rFonts w:ascii="Calibri" w:cs="Calibri" w:eastAsia="Calibri" w:hAnsi="Calibri"/>
+                <w:b/>
+                <w:bCs/>
+                <w:color w:val="0B6670"/>
+                <w:sz w:val="17"/>
+                <w:szCs w:val="17"/>
+              </w:rPr>
+              <w:t xml:space="preserve">Full marks, 8 to 10.  </w:t>
+            </w:r>
+            <w:r>
+              <w:rPr>
+                <w:rFonts w:ascii="Calibri" w:cs="Calibri" w:eastAsia="Calibri" w:hAnsi="Calibri"/>
+                <w:color w:val="46566E"/>
+                <w:sz w:val="17"/>
+                <w:szCs w:val="17"/>
+              </w:rPr>
+              <w:t xml:space="preserve">The primary answer above, or any acceptable alternative, when the reasoning fits Cedarline.</w:t>
+            </w:r>
+          </w:p>
+          <w:p>
+            <w:pPr>
+              <w:spacing w:after="20" w:before="0" w:line="276"/>
+            </w:pPr>
+            <w:r>
+              <w:rPr>
+                <w:rFonts w:ascii="Calibri" w:cs="Calibri" w:eastAsia="Calibri" w:hAnsi="Calibri"/>
+                <w:b/>
+                <w:bCs/>
+                <w:color w:val="0D274D"/>
+                <w:sz w:val="17"/>
+                <w:szCs w:val="17"/>
+              </w:rPr>
+              <w:t xml:space="preserve">Partial, 2 to 7.  </w:t>
+            </w:r>
+            <w:r>
+              <w:rPr>
+                <w:rFonts w:ascii="Calibri" w:cs="Calibri" w:eastAsia="Calibri" w:hAnsi="Calibri"/>
+                <w:color w:val="46566E"/>
+                <w:sz w:val="17"/>
+                <w:szCs w:val="17"/>
+              </w:rPr>
+              <w:t xml:space="preserve">Names Cilium or Tetragon alone but not the consolidation of networking, security and observability.</w:t>
+            </w:r>
+          </w:p>
+          <w:p>
+            <w:pPr>
+              <w:spacing w:after="0" w:before="0" w:line="276"/>
+            </w:pPr>
+            <w:r>
+              <w:rPr>
+                <w:rFonts w:ascii="Calibri" w:cs="Calibri" w:eastAsia="Calibri" w:hAnsi="Calibri"/>
+                <w:b/>
+                <w:bCs/>
+                <w:color w:val="0D274D"/>
+                <w:sz w:val="17"/>
+                <w:szCs w:val="17"/>
+              </w:rPr>
+              <w:t xml:space="preserve">No credit, 0 to 1.  </w:t>
+            </w:r>
+            <w:r>
+              <w:rPr>
+                <w:rFonts w:ascii="Calibri" w:cs="Calibri" w:eastAsia="Calibri" w:hAnsi="Calibri"/>
+                <w:color w:val="46566E"/>
+                <w:sz w:val="17"/>
+                <w:szCs w:val="17"/>
+              </w:rPr>
+              <w:t xml:space="preserve">Adding another point tool that increases sprawl.</w:t>
             </w:r>
           </w:p>
         </w:tc>
@@ -11476,6 +14277,174 @@
                 <w:szCs w:val="18"/>
               </w:rPr>
               <w:t xml:space="preserve">Reveals actual application communication paths. Reduces the risk of segmentation causing outages.</w:t>
+            </w:r>
+          </w:p>
+        </w:tc>
+      </w:tr>
+    </w:tbl>
+    <w:p>
+      <w:pPr>
+        <w:spacing w:after="40"/>
+      </w:pPr>
+      <w:r>
+        <w:rPr>
+          <w:rFonts w:ascii="Calibri" w:cs="Calibri" w:eastAsia="Calibri" w:hAnsi="Calibri"/>
+          <w:color w:val="14263A"/>
+          <w:sz w:val="2"/>
+          <w:szCs w:val="2"/>
+        </w:rPr>
+        <w:t xml:space="preserve"/>
+      </w:r>
+    </w:p>
+    <w:tbl>
+      <w:tblPr>
+        <w:tblW w:type="dxa" w:w="9360"/>
+        <w:tblBorders>
+          <w:top w:val="single" w:color="auto" w:sz="4"/>
+          <w:left w:val="single" w:color="auto" w:sz="4"/>
+          <w:bottom w:val="single" w:color="auto" w:sz="4"/>
+          <w:right w:val="single" w:color="auto" w:sz="4"/>
+          <w:insideH w:val="single" w:color="auto" w:sz="4"/>
+          <w:insideV w:val="single" w:color="auto" w:sz="4"/>
+        </w:tblBorders>
+      </w:tblPr>
+      <w:tblGrid>
+        <w:gridCol w:w="9360"/>
+      </w:tblGrid>
+      <w:tr>
+        <w:tc>
+          <w:tcPr>
+            <w:tcW w:type="dxa" w:w="9360"/>
+            <w:tcBorders>
+              <w:top w:val="single" w:color="CFE3EC" w:sz="6"/>
+              <w:left w:val="single" w:color="CFE3EC" w:sz="30"/>
+              <w:bottom w:val="single" w:color="CFE3EC" w:sz="6"/>
+              <w:right w:val="single" w:color="CFE3EC" w:sz="6"/>
+            </w:tcBorders>
+            <w:shd w:fill="F5FBFD" w:color="auto" w:val="clear"/>
+            <w:tcMar>
+              <w:top w:type="dxa" w:w="110"/>
+              <w:left w:type="dxa" w:w="160"/>
+              <w:bottom w:type="dxa" w:w="110"/>
+              <w:right w:type="dxa" w:w="160"/>
+            </w:tcMar>
+            <w:vAlign w:val="top"/>
+          </w:tcPr>
+          <w:p>
+            <w:pPr>
+              <w:spacing w:after="50" w:before="0" w:line="276"/>
+            </w:pPr>
+            <w:r>
+              <w:rPr>
+                <w:rFonts w:ascii="Calibri" w:cs="Calibri" w:eastAsia="Calibri" w:hAnsi="Calibri"/>
+                <w:b/>
+                <w:bCs/>
+                <w:caps/>
+                <w:color w:val="036C8F"/>
+                <w:sz w:val="15"/>
+                <w:szCs w:val="15"/>
+              </w:rPr>
+              <w:t xml:space="preserve">Also acceptable for Solution Designer, and how to grade</w:t>
+            </w:r>
+          </w:p>
+          <w:p>
+            <w:pPr>
+              <w:spacing w:after="30" w:before="0" w:line="276"/>
+            </w:pPr>
+            <w:r>
+              <w:rPr>
+                <w:rFonts w:ascii="Calibri" w:cs="Calibri" w:eastAsia="Calibri" w:hAnsi="Calibri"/>
+                <w:b/>
+                <w:bCs/>
+                <w:color w:val="0B6670"/>
+                <w:sz w:val="18"/>
+                <w:szCs w:val="18"/>
+              </w:rPr>
+              <w:t xml:space="preserve">Isovalent Cilium with Hubble (flow observability)</w:t>
+            </w:r>
+            <w:r>
+              <w:rPr>
+                <w:rFonts w:ascii="Calibri" w:cs="Calibri" w:eastAsia="Calibri" w:hAnsi="Calibri"/>
+                <w:color w:val="2A3C52"/>
+                <w:sz w:val="18"/>
+                <w:szCs w:val="18"/>
+              </w:rPr>
+              <w:t xml:space="preserve">, maps east-west flows to inform safe segmentation; credit alongside or instead of Secure Workload when argued.</w:t>
+            </w:r>
+          </w:p>
+          <w:p>
+            <w:pPr>
+              <w:spacing w:after="20" w:before="70" w:line="276"/>
+            </w:pPr>
+            <w:r>
+              <w:rPr>
+                <w:rFonts w:ascii="Calibri" w:cs="Calibri" w:eastAsia="Calibri" w:hAnsi="Calibri"/>
+                <w:b/>
+                <w:bCs/>
+                <w:color w:val="0B6670"/>
+                <w:sz w:val="17"/>
+                <w:szCs w:val="17"/>
+              </w:rPr>
+              <w:t xml:space="preserve">Full marks, 8 to 10.  </w:t>
+            </w:r>
+            <w:r>
+              <w:rPr>
+                <w:rFonts w:ascii="Calibri" w:cs="Calibri" w:eastAsia="Calibri" w:hAnsi="Calibri"/>
+                <w:color w:val="46566E"/>
+                <w:sz w:val="17"/>
+                <w:szCs w:val="17"/>
+              </w:rPr>
+              <w:t xml:space="preserve">The primary answer above, or any acceptable alternative, when the reasoning fits Cedarline.</w:t>
+            </w:r>
+          </w:p>
+          <w:p>
+            <w:pPr>
+              <w:spacing w:after="20" w:before="0" w:line="276"/>
+            </w:pPr>
+            <w:r>
+              <w:rPr>
+                <w:rFonts w:ascii="Calibri" w:cs="Calibri" w:eastAsia="Calibri" w:hAnsi="Calibri"/>
+                <w:b/>
+                <w:bCs/>
+                <w:color w:val="0D274D"/>
+                <w:sz w:val="17"/>
+                <w:szCs w:val="17"/>
+              </w:rPr>
+              <w:t xml:space="preserve">Partial, 2 to 7.  </w:t>
+            </w:r>
+            <w:r>
+              <w:rPr>
+                <w:rFonts w:ascii="Calibri" w:cs="Calibri" w:eastAsia="Calibri" w:hAnsi="Calibri"/>
+                <w:color w:val="46566E"/>
+                <w:sz w:val="17"/>
+                <w:szCs w:val="17"/>
+              </w:rPr>
+              <w:t xml:space="preserve">Names Secure Workload but not the dependency mapping before enforcement.</w:t>
+            </w:r>
+          </w:p>
+          <w:p>
+            <w:pPr>
+              <w:spacing w:after="0" w:before="0" w:line="276"/>
+            </w:pPr>
+            <w:r>
+              <w:rPr>
+                <w:rFonts w:ascii="Calibri" w:cs="Calibri" w:eastAsia="Calibri" w:hAnsi="Calibri"/>
+                <w:b/>
+                <w:bCs/>
+                <w:color w:val="0D274D"/>
+                <w:sz w:val="17"/>
+                <w:szCs w:val="17"/>
+              </w:rPr>
+              <w:t xml:space="preserve">No credit, 0 to 1.  </w:t>
+            </w:r>
+            <w:r>
+              <w:rPr>
+                <w:rFonts w:ascii="Calibri" w:cs="Calibri" w:eastAsia="Calibri" w:hAnsi="Calibri"/>
+                <w:color w:val="46566E"/>
+                <w:sz w:val="17"/>
+                <w:szCs w:val="17"/>
+              </w:rPr>
+              <w:t xml:space="preserve">Enforcing segmentation with no dependency discovery, which risks breaking applications.</w:t>
             </w:r>
           </w:p>
         </w:tc>

</xml_diff>

<commit_message>
Grading Guide: add a completed score sheet example as the final page
Adds a filled-in example of the Workbook's Proctor evaluation page at
the end of the Grading Guide: example team, per case study score and
feedback, an overall total out of 400, the SME-review line ticked, and
worked "what the team did well" and "where they can learn and grow"
notes, ending with how to hand the result back. This completes the
proctor's end-to-end path: rubric, worked grading example, per-pain-point
levels, then how to fill and return the score sheet.

Mirrors the blank Proctor evaluation page bound in the Workbook, keeping
the documents aligned. Solution Guide unchanged. README and zip refreshed.

Co-Authored-By: Claude Opus 4.8 <noreply@anthropic.com>
Claude-Session: https://claude.ai/code/session_01QFagQxWq3DUNgqxaEaNjHo
</commit_message>
<xml_diff>
--- a/case-study-pack/docx/HMF-Grading-Guide.docx
+++ b/case-study-pack/docx/HMF-Grading-Guide.docx
@@ -23092,6 +23092,1171 @@
         <w:t xml:space="preserve"/>
       </w:r>
     </w:p>
+    <w:p>
+      <w:pPr>
+        <w:pageBreakBefore/>
+        <w:spacing w:after="0" w:before="0" w:line="276"/>
+      </w:pPr>
+    </w:p>
+    <w:p>
+      <w:pPr>
+        <w:spacing w:after="40" w:before="0" w:line="276"/>
+      </w:pPr>
+      <w:r>
+        <w:rPr>
+          <w:rFonts w:ascii="Calibri" w:cs="Calibri" w:eastAsia="Calibri" w:hAnsi="Calibri"/>
+          <w:b/>
+          <w:bCs/>
+          <w:caps/>
+          <w:color w:val="036C8F"/>
+          <w:sz w:val="16"/>
+          <w:szCs w:val="16"/>
+        </w:rPr>
+        <w:t xml:space="preserve">Worked example</w:t>
+      </w:r>
+    </w:p>
+    <w:p>
+      <w:pPr>
+        <w:pBdr>
+          <w:bottom w:val="single" w:color="00BCEB" w:sz="18"/>
+        </w:pBdr>
+        <w:spacing w:after="120"/>
+      </w:pPr>
+      <w:r>
+        <w:rPr>
+          <w:rFonts w:ascii="Calibri" w:cs="Calibri" w:eastAsia="Calibri" w:hAnsi="Calibri"/>
+          <w:color w:val="14263A"/>
+          <w:sz w:val="2"/>
+          <w:szCs w:val="2"/>
+        </w:rPr>
+        <w:t xml:space="preserve"/>
+      </w:r>
+    </w:p>
+    <w:p>
+      <w:pPr>
+        <w:spacing w:after="80" w:before="120" w:line="276"/>
+      </w:pPr>
+      <w:r>
+        <w:rPr>
+          <w:rFonts w:ascii="Calibri" w:cs="Calibri" w:eastAsia="Calibri" w:hAnsi="Calibri"/>
+          <w:b/>
+          <w:bCs/>
+          <w:color w:val="0D274D"/>
+          <w:sz w:val="30"/>
+          <w:szCs w:val="30"/>
+        </w:rPr>
+        <w:t xml:space="preserve">A completed score sheet</w:t>
+      </w:r>
+      <w:r>
+        <w:rPr>
+          <w:rFonts w:ascii="Calibri" w:cs="Calibri" w:eastAsia="Calibri" w:hAnsi="Calibri"/>
+          <w:b/>
+          <w:bCs/>
+          <w:caps/>
+          <w:color w:val="155C43"/>
+          <w:sz w:val="14"/>
+          <w:szCs w:val="14"/>
+        </w:rPr>
+        <w:t xml:space="preserve">    EXAMPLE</w:t>
+      </w:r>
+    </w:p>
+    <w:p>
+      <w:pPr>
+        <w:spacing w:after="120" w:before="0" w:line="276"/>
+      </w:pPr>
+      <w:r>
+        <w:rPr>
+          <w:rFonts w:ascii="Calibri" w:cs="Calibri" w:eastAsia="Calibri" w:hAnsi="Calibri"/>
+          <w:color w:val="3A4C63"/>
+          <w:sz w:val="21"/>
+          <w:szCs w:val="21"/>
+        </w:rPr>
+        <w:t xml:space="preserve">This is the Proctor evaluation page from the back of the Workbook, filled in for an example team, so you can see how to record the scores and feedback before you hand the result back.</w:t>
+      </w:r>
+    </w:p>
+    <w:p>
+      <w:pPr>
+        <w:spacing w:after="120" w:before="0" w:line="276"/>
+      </w:pPr>
+      <w:r>
+        <w:rPr>
+          <w:rFonts w:ascii="Calibri" w:cs="Calibri" w:eastAsia="Calibri" w:hAnsi="Calibri"/>
+          <w:b/>
+          <w:bCs/>
+          <w:color w:val="0D274D"/>
+          <w:sz w:val="21"/>
+          <w:szCs w:val="21"/>
+        </w:rPr>
+        <w:t xml:space="preserve">Team  </w:t>
+      </w:r>
+      <w:r>
+        <w:rPr>
+          <w:rFonts w:ascii="Calibri" w:cs="Calibri" w:eastAsia="Calibri" w:hAnsi="Calibri"/>
+          <w:b/>
+          <w:bCs/>
+          <w:color w:val="036C8F"/>
+          <w:sz w:val="21"/>
+          <w:szCs w:val="21"/>
+        </w:rPr>
+        <w:t xml:space="preserve">Blue Team       </w:t>
+      </w:r>
+      <w:r>
+        <w:rPr>
+          <w:rFonts w:ascii="Calibri" w:cs="Calibri" w:eastAsia="Calibri" w:hAnsi="Calibri"/>
+          <w:b/>
+          <w:bCs/>
+          <w:color w:val="0D274D"/>
+          <w:sz w:val="21"/>
+          <w:szCs w:val="21"/>
+        </w:rPr>
+        <w:t xml:space="preserve">Members (up to 8)  </w:t>
+      </w:r>
+      <w:r>
+        <w:rPr>
+          <w:rFonts w:ascii="Calibri" w:cs="Calibri" w:eastAsia="Calibri" w:hAnsi="Calibri"/>
+          <w:b/>
+          <w:bCs/>
+          <w:color w:val="036C8F"/>
+          <w:sz w:val="21"/>
+          <w:szCs w:val="21"/>
+        </w:rPr>
+        <w:t xml:space="preserve">8 present       </w:t>
+      </w:r>
+      <w:r>
+        <w:rPr>
+          <w:rFonts w:ascii="Calibri" w:cs="Calibri" w:eastAsia="Calibri" w:hAnsi="Calibri"/>
+          <w:b/>
+          <w:bCs/>
+          <w:color w:val="0D274D"/>
+          <w:sz w:val="21"/>
+          <w:szCs w:val="21"/>
+        </w:rPr>
+        <w:t xml:space="preserve">Date  </w:t>
+      </w:r>
+      <w:r>
+        <w:rPr>
+          <w:rFonts w:ascii="Calibri" w:cs="Calibri" w:eastAsia="Calibri" w:hAnsi="Calibri"/>
+          <w:b/>
+          <w:bCs/>
+          <w:color w:val="036C8F"/>
+          <w:sz w:val="21"/>
+          <w:szCs w:val="21"/>
+        </w:rPr>
+        <w:t xml:space="preserve">12 May</w:t>
+      </w:r>
+    </w:p>
+    <w:tbl>
+      <w:tblPr>
+        <w:tblW w:type="dxa" w:w="9360"/>
+        <w:tblBorders>
+          <w:top w:val="single" w:color="C4D2E2" w:sz="6"/>
+          <w:left w:val="single" w:color="C4D2E2" w:sz="6"/>
+          <w:bottom w:val="single" w:color="C4D2E2" w:sz="6"/>
+          <w:right w:val="single" w:color="C4D2E2" w:sz="6"/>
+          <w:insideH w:val="none" w:color="FFFFFF" w:sz="0"/>
+          <w:insideV w:val="none" w:color="FFFFFF" w:sz="0"/>
+        </w:tblBorders>
+      </w:tblPr>
+      <w:tblGrid>
+        <w:gridCol w:w="2500"/>
+        <w:gridCol w:w="1900"/>
+        <w:gridCol w:w="4960"/>
+      </w:tblGrid>
+      <w:tr>
+        <w:trPr>
+          <w:tblHeader/>
+        </w:trPr>
+        <w:tc>
+          <w:tcPr>
+            <w:tcW w:type="dxa" w:w="2500"/>
+            <w:tcBorders>
+              <w:top w:val="none" w:color="FFFFFF" w:sz="0"/>
+              <w:left w:val="none" w:color="FFFFFF" w:sz="0"/>
+              <w:bottom w:val="none" w:color="FFFFFF" w:sz="0"/>
+              <w:right w:val="none" w:color="FFFFFF" w:sz="0"/>
+            </w:tcBorders>
+            <w:shd w:fill="0D274D" w:color="auto" w:val="clear"/>
+            <w:tcMar>
+              <w:top w:type="dxa" w:w="70"/>
+              <w:left w:type="dxa" w:w="130"/>
+              <w:bottom w:type="dxa" w:w="70"/>
+              <w:right w:type="dxa" w:w="130"/>
+            </w:tcMar>
+          </w:tcPr>
+          <w:p>
+            <w:pPr>
+              <w:spacing w:after="0" w:before="0" w:line="276"/>
+              <w:jc w:val="left"/>
+            </w:pPr>
+            <w:r>
+              <w:rPr>
+                <w:rFonts w:ascii="Calibri" w:cs="Calibri" w:eastAsia="Calibri" w:hAnsi="Calibri"/>
+                <w:b/>
+                <w:bCs/>
+                <w:caps/>
+                <w:color w:val="FFFFFF"/>
+                <w:sz w:val="14"/>
+                <w:szCs w:val="14"/>
+              </w:rPr>
+              <w:t xml:space="preserve">Case Study</w:t>
+            </w:r>
+          </w:p>
+        </w:tc>
+        <w:tc>
+          <w:tcPr>
+            <w:tcW w:type="dxa" w:w="1900"/>
+            <w:tcBorders>
+              <w:top w:val="none" w:color="FFFFFF" w:sz="0"/>
+              <w:left w:val="none" w:color="FFFFFF" w:sz="0"/>
+              <w:bottom w:val="none" w:color="FFFFFF" w:sz="0"/>
+              <w:right w:val="none" w:color="FFFFFF" w:sz="0"/>
+            </w:tcBorders>
+            <w:shd w:fill="0D274D" w:color="auto" w:val="clear"/>
+            <w:tcMar>
+              <w:top w:type="dxa" w:w="70"/>
+              <w:left w:type="dxa" w:w="130"/>
+              <w:bottom w:type="dxa" w:w="70"/>
+              <w:right w:type="dxa" w:w="130"/>
+            </w:tcMar>
+          </w:tcPr>
+          <w:p>
+            <w:pPr>
+              <w:spacing w:after="0" w:before="0" w:line="276"/>
+              <w:jc w:val="center"/>
+            </w:pPr>
+            <w:r>
+              <w:rPr>
+                <w:rFonts w:ascii="Calibri" w:cs="Calibri" w:eastAsia="Calibri" w:hAnsi="Calibri"/>
+                <w:b/>
+                <w:bCs/>
+                <w:caps/>
+                <w:color w:val="FFFFFF"/>
+                <w:sz w:val="14"/>
+                <w:szCs w:val="14"/>
+              </w:rPr>
+              <w:t xml:space="preserve">Score / 100</w:t>
+            </w:r>
+          </w:p>
+        </w:tc>
+        <w:tc>
+          <w:tcPr>
+            <w:tcW w:type="dxa" w:w="4960"/>
+            <w:tcBorders>
+              <w:top w:val="none" w:color="FFFFFF" w:sz="0"/>
+              <w:left w:val="none" w:color="FFFFFF" w:sz="0"/>
+              <w:bottom w:val="none" w:color="FFFFFF" w:sz="0"/>
+              <w:right w:val="none" w:color="FFFFFF" w:sz="0"/>
+            </w:tcBorders>
+            <w:shd w:fill="0D274D" w:color="auto" w:val="clear"/>
+            <w:tcMar>
+              <w:top w:type="dxa" w:w="70"/>
+              <w:left w:type="dxa" w:w="130"/>
+              <w:bottom w:type="dxa" w:w="70"/>
+              <w:right w:type="dxa" w:w="130"/>
+            </w:tcMar>
+          </w:tcPr>
+          <w:p>
+            <w:pPr>
+              <w:spacing w:after="0" w:before="0" w:line="276"/>
+              <w:jc w:val="left"/>
+            </w:pPr>
+            <w:r>
+              <w:rPr>
+                <w:rFonts w:ascii="Calibri" w:cs="Calibri" w:eastAsia="Calibri" w:hAnsi="Calibri"/>
+                <w:b/>
+                <w:bCs/>
+                <w:caps/>
+                <w:color w:val="FFFFFF"/>
+                <w:sz w:val="14"/>
+                <w:szCs w:val="14"/>
+              </w:rPr>
+              <w:t xml:space="preserve">Feedback for this case study</w:t>
+            </w:r>
+          </w:p>
+        </w:tc>
+      </w:tr>
+      <w:tr>
+        <w:tc>
+          <w:tcPr>
+            <w:tcW w:type="dxa" w:w="2500"/>
+            <w:tcBorders>
+              <w:top w:val="single" w:color="E4EBF3" w:sz="4"/>
+              <w:left w:val="none" w:color="FFFFFF" w:sz="0"/>
+              <w:bottom w:val="none" w:color="FFFFFF" w:sz="0"/>
+              <w:right w:val="none" w:color="FFFFFF" w:sz="0"/>
+            </w:tcBorders>
+            <w:tcMar>
+              <w:top w:type="dxa" w:w="100"/>
+              <w:left w:type="dxa" w:w="130"/>
+              <w:bottom w:type="dxa" w:w="100"/>
+              <w:right w:type="dxa" w:w="110"/>
+            </w:tcMar>
+            <w:vAlign w:val="top"/>
+          </w:tcPr>
+          <w:p>
+            <w:pPr>
+              <w:spacing w:after="0" w:before="0" w:line="276"/>
+            </w:pPr>
+            <w:r>
+              <w:rPr>
+                <w:rFonts w:ascii="Calibri" w:cs="Calibri" w:eastAsia="Calibri" w:hAnsi="Calibri"/>
+                <w:b/>
+                <w:bCs/>
+                <w:color w:val="0D274D"/>
+                <w:sz w:val="20"/>
+                <w:szCs w:val="20"/>
+              </w:rPr>
+              <w:t xml:space="preserve">Case Study 1</w:t>
+            </w:r>
+          </w:p>
+        </w:tc>
+        <w:tc>
+          <w:tcPr>
+            <w:tcW w:type="dxa" w:w="1900"/>
+            <w:tcBorders>
+              <w:top w:val="single" w:color="E4EBF3" w:sz="4"/>
+              <w:left w:val="none" w:color="FFFFFF" w:sz="0"/>
+              <w:bottom w:val="none" w:color="FFFFFF" w:sz="0"/>
+              <w:right w:val="none" w:color="FFFFFF" w:sz="0"/>
+            </w:tcBorders>
+            <w:tcMar>
+              <w:top w:type="dxa" w:w="100"/>
+              <w:left w:type="dxa" w:w="110"/>
+              <w:bottom w:type="dxa" w:w="100"/>
+              <w:right w:type="dxa" w:w="110"/>
+            </w:tcMar>
+            <w:vAlign w:val="top"/>
+          </w:tcPr>
+          <w:p>
+            <w:pPr>
+              <w:spacing w:after="0" w:before="0" w:line="276"/>
+              <w:jc w:val="center"/>
+            </w:pPr>
+            <w:r>
+              <w:rPr>
+                <w:rFonts w:ascii="Calibri" w:cs="Calibri" w:eastAsia="Calibri" w:hAnsi="Calibri"/>
+                <w:b/>
+                <w:bCs/>
+                <w:color w:val="0B6670"/>
+                <w:sz w:val="20"/>
+                <w:szCs w:val="20"/>
+              </w:rPr>
+              <w:t xml:space="preserve">66</w:t>
+            </w:r>
+          </w:p>
+        </w:tc>
+        <w:tc>
+          <w:tcPr>
+            <w:tcW w:type="dxa" w:w="4960"/>
+            <w:tcBorders>
+              <w:top w:val="single" w:color="E4EBF3" w:sz="4"/>
+              <w:left w:val="none" w:color="FFFFFF" w:sz="0"/>
+              <w:bottom w:val="none" w:color="FFFFFF" w:sz="0"/>
+              <w:right w:val="none" w:color="FFFFFF" w:sz="0"/>
+            </w:tcBorders>
+            <w:tcMar>
+              <w:top w:type="dxa" w:w="100"/>
+              <w:left w:type="dxa" w:w="110"/>
+              <w:bottom w:type="dxa" w:w="100"/>
+              <w:right w:type="dxa" w:w="130"/>
+            </w:tcMar>
+            <w:vAlign w:val="top"/>
+          </w:tcPr>
+          <w:p>
+            <w:pPr>
+              <w:spacing w:after="0" w:before="0" w:line="276"/>
+            </w:pPr>
+            <w:r>
+              <w:rPr>
+                <w:rFonts w:ascii="Calibri" w:cs="Calibri" w:eastAsia="Calibri" w:hAnsi="Calibri"/>
+                <w:i/>
+                <w:iCs/>
+                <w:color w:val="0B4A5E"/>
+                <w:sz w:val="18"/>
+                <w:szCs w:val="18"/>
+              </w:rPr>
+              <w:t xml:space="preserve">Right products throughout and strong on AI Defense. Tighten the Article 15 requirement and state the concrete outcomes.</w:t>
+            </w:r>
+          </w:p>
+        </w:tc>
+      </w:tr>
+      <w:tr>
+        <w:tc>
+          <w:tcPr>
+            <w:tcW w:type="dxa" w:w="2500"/>
+            <w:tcBorders>
+              <w:top w:val="single" w:color="E4EBF3" w:sz="4"/>
+              <w:left w:val="none" w:color="FFFFFF" w:sz="0"/>
+              <w:bottom w:val="none" w:color="FFFFFF" w:sz="0"/>
+              <w:right w:val="none" w:color="FFFFFF" w:sz="0"/>
+            </w:tcBorders>
+            <w:tcMar>
+              <w:top w:type="dxa" w:w="100"/>
+              <w:left w:type="dxa" w:w="130"/>
+              <w:bottom w:type="dxa" w:w="100"/>
+              <w:right w:type="dxa" w:w="110"/>
+            </w:tcMar>
+            <w:vAlign w:val="top"/>
+          </w:tcPr>
+          <w:p>
+            <w:pPr>
+              <w:spacing w:after="0" w:before="0" w:line="276"/>
+            </w:pPr>
+            <w:r>
+              <w:rPr>
+                <w:rFonts w:ascii="Calibri" w:cs="Calibri" w:eastAsia="Calibri" w:hAnsi="Calibri"/>
+                <w:b/>
+                <w:bCs/>
+                <w:color w:val="0D274D"/>
+                <w:sz w:val="20"/>
+                <w:szCs w:val="20"/>
+              </w:rPr>
+              <w:t xml:space="preserve">Case Study 2</w:t>
+            </w:r>
+          </w:p>
+        </w:tc>
+        <w:tc>
+          <w:tcPr>
+            <w:tcW w:type="dxa" w:w="1900"/>
+            <w:tcBorders>
+              <w:top w:val="single" w:color="E4EBF3" w:sz="4"/>
+              <w:left w:val="none" w:color="FFFFFF" w:sz="0"/>
+              <w:bottom w:val="none" w:color="FFFFFF" w:sz="0"/>
+              <w:right w:val="none" w:color="FFFFFF" w:sz="0"/>
+            </w:tcBorders>
+            <w:tcMar>
+              <w:top w:type="dxa" w:w="100"/>
+              <w:left w:type="dxa" w:w="110"/>
+              <w:bottom w:type="dxa" w:w="100"/>
+              <w:right w:type="dxa" w:w="110"/>
+            </w:tcMar>
+            <w:vAlign w:val="top"/>
+          </w:tcPr>
+          <w:p>
+            <w:pPr>
+              <w:spacing w:after="0" w:before="0" w:line="276"/>
+              <w:jc w:val="center"/>
+            </w:pPr>
+            <w:r>
+              <w:rPr>
+                <w:rFonts w:ascii="Calibri" w:cs="Calibri" w:eastAsia="Calibri" w:hAnsi="Calibri"/>
+                <w:b/>
+                <w:bCs/>
+                <w:color w:val="0B6670"/>
+                <w:sz w:val="20"/>
+                <w:szCs w:val="20"/>
+              </w:rPr>
+              <w:t xml:space="preserve">78</w:t>
+            </w:r>
+          </w:p>
+        </w:tc>
+        <w:tc>
+          <w:tcPr>
+            <w:tcW w:type="dxa" w:w="4960"/>
+            <w:tcBorders>
+              <w:top w:val="single" w:color="E4EBF3" w:sz="4"/>
+              <w:left w:val="none" w:color="FFFFFF" w:sz="0"/>
+              <w:bottom w:val="none" w:color="FFFFFF" w:sz="0"/>
+              <w:right w:val="none" w:color="FFFFFF" w:sz="0"/>
+            </w:tcBorders>
+            <w:tcMar>
+              <w:top w:type="dxa" w:w="100"/>
+              <w:left w:type="dxa" w:w="110"/>
+              <w:bottom w:type="dxa" w:w="100"/>
+              <w:right w:type="dxa" w:w="130"/>
+            </w:tcMar>
+            <w:vAlign w:val="top"/>
+          </w:tcPr>
+          <w:p>
+            <w:pPr>
+              <w:spacing w:after="0" w:before="0" w:line="276"/>
+            </w:pPr>
+            <w:r>
+              <w:rPr>
+                <w:rFonts w:ascii="Calibri" w:cs="Calibri" w:eastAsia="Calibri" w:hAnsi="Calibri"/>
+                <w:i/>
+                <w:iCs/>
+                <w:color w:val="0B4A5E"/>
+                <w:sz w:val="18"/>
+                <w:szCs w:val="18"/>
+              </w:rPr>
+              <w:t xml:space="preserve">Excellent multicloud segmentation and a clear audit story. One pain point was light on the single, unified policy model.</w:t>
+            </w:r>
+          </w:p>
+        </w:tc>
+      </w:tr>
+      <w:tr>
+        <w:tc>
+          <w:tcPr>
+            <w:tcW w:type="dxa" w:w="2500"/>
+            <w:tcBorders>
+              <w:top w:val="single" w:color="E4EBF3" w:sz="4"/>
+              <w:left w:val="none" w:color="FFFFFF" w:sz="0"/>
+              <w:bottom w:val="none" w:color="FFFFFF" w:sz="0"/>
+              <w:right w:val="none" w:color="FFFFFF" w:sz="0"/>
+            </w:tcBorders>
+            <w:tcMar>
+              <w:top w:type="dxa" w:w="100"/>
+              <w:left w:type="dxa" w:w="130"/>
+              <w:bottom w:type="dxa" w:w="100"/>
+              <w:right w:type="dxa" w:w="110"/>
+            </w:tcMar>
+            <w:vAlign w:val="top"/>
+          </w:tcPr>
+          <w:p>
+            <w:pPr>
+              <w:spacing w:after="0" w:before="0" w:line="276"/>
+            </w:pPr>
+            <w:r>
+              <w:rPr>
+                <w:rFonts w:ascii="Calibri" w:cs="Calibri" w:eastAsia="Calibri" w:hAnsi="Calibri"/>
+                <w:b/>
+                <w:bCs/>
+                <w:color w:val="0D274D"/>
+                <w:sz w:val="20"/>
+                <w:szCs w:val="20"/>
+              </w:rPr>
+              <w:t xml:space="preserve">Case Study 3</w:t>
+            </w:r>
+          </w:p>
+        </w:tc>
+        <w:tc>
+          <w:tcPr>
+            <w:tcW w:type="dxa" w:w="1900"/>
+            <w:tcBorders>
+              <w:top w:val="single" w:color="E4EBF3" w:sz="4"/>
+              <w:left w:val="none" w:color="FFFFFF" w:sz="0"/>
+              <w:bottom w:val="none" w:color="FFFFFF" w:sz="0"/>
+              <w:right w:val="none" w:color="FFFFFF" w:sz="0"/>
+            </w:tcBorders>
+            <w:tcMar>
+              <w:top w:type="dxa" w:w="100"/>
+              <w:left w:type="dxa" w:w="110"/>
+              <w:bottom w:type="dxa" w:w="100"/>
+              <w:right w:type="dxa" w:w="110"/>
+            </w:tcMar>
+            <w:vAlign w:val="top"/>
+          </w:tcPr>
+          <w:p>
+            <w:pPr>
+              <w:spacing w:after="0" w:before="0" w:line="276"/>
+              <w:jc w:val="center"/>
+            </w:pPr>
+            <w:r>
+              <w:rPr>
+                <w:rFonts w:ascii="Calibri" w:cs="Calibri" w:eastAsia="Calibri" w:hAnsi="Calibri"/>
+                <w:b/>
+                <w:bCs/>
+                <w:color w:val="0B6670"/>
+                <w:sz w:val="20"/>
+                <w:szCs w:val="20"/>
+              </w:rPr>
+              <w:t xml:space="preserve">72</w:t>
+            </w:r>
+          </w:p>
+        </w:tc>
+        <w:tc>
+          <w:tcPr>
+            <w:tcW w:type="dxa" w:w="4960"/>
+            <w:tcBorders>
+              <w:top w:val="single" w:color="E4EBF3" w:sz="4"/>
+              <w:left w:val="none" w:color="FFFFFF" w:sz="0"/>
+              <w:bottom w:val="none" w:color="FFFFFF" w:sz="0"/>
+              <w:right w:val="none" w:color="FFFFFF" w:sz="0"/>
+            </w:tcBorders>
+            <w:tcMar>
+              <w:top w:type="dxa" w:w="100"/>
+              <w:left w:type="dxa" w:w="110"/>
+              <w:bottom w:type="dxa" w:w="100"/>
+              <w:right w:type="dxa" w:w="130"/>
+            </w:tcMar>
+            <w:vAlign w:val="top"/>
+          </w:tcPr>
+          <w:p>
+            <w:pPr>
+              <w:spacing w:after="0" w:before="0" w:line="276"/>
+            </w:pPr>
+            <w:r>
+              <w:rPr>
+                <w:rFonts w:ascii="Calibri" w:cs="Calibri" w:eastAsia="Calibri" w:hAnsi="Calibri"/>
+                <w:i/>
+                <w:iCs/>
+                <w:color w:val="0B4A5E"/>
+                <w:sz w:val="18"/>
+                <w:szCs w:val="18"/>
+              </w:rPr>
+              <w:t xml:space="preserve">Good automated containment with ISE. The encrypted-traffic answer needed EVE rather than blanket decryption.</w:t>
+            </w:r>
+          </w:p>
+        </w:tc>
+      </w:tr>
+      <w:tr>
+        <w:tc>
+          <w:tcPr>
+            <w:tcW w:type="dxa" w:w="2500"/>
+            <w:tcBorders>
+              <w:top w:val="single" w:color="E4EBF3" w:sz="4"/>
+              <w:left w:val="none" w:color="FFFFFF" w:sz="0"/>
+              <w:bottom w:val="none" w:color="FFFFFF" w:sz="0"/>
+              <w:right w:val="none" w:color="FFFFFF" w:sz="0"/>
+            </w:tcBorders>
+            <w:tcMar>
+              <w:top w:type="dxa" w:w="100"/>
+              <w:left w:type="dxa" w:w="130"/>
+              <w:bottom w:type="dxa" w:w="100"/>
+              <w:right w:type="dxa" w:w="110"/>
+            </w:tcMar>
+            <w:vAlign w:val="top"/>
+          </w:tcPr>
+          <w:p>
+            <w:pPr>
+              <w:spacing w:after="0" w:before="0" w:line="276"/>
+            </w:pPr>
+            <w:r>
+              <w:rPr>
+                <w:rFonts w:ascii="Calibri" w:cs="Calibri" w:eastAsia="Calibri" w:hAnsi="Calibri"/>
+                <w:b/>
+                <w:bCs/>
+                <w:color w:val="0D274D"/>
+                <w:sz w:val="20"/>
+                <w:szCs w:val="20"/>
+              </w:rPr>
+              <w:t xml:space="preserve">Case Study 4</w:t>
+            </w:r>
+          </w:p>
+        </w:tc>
+        <w:tc>
+          <w:tcPr>
+            <w:tcW w:type="dxa" w:w="1900"/>
+            <w:tcBorders>
+              <w:top w:val="single" w:color="E4EBF3" w:sz="4"/>
+              <w:left w:val="none" w:color="FFFFFF" w:sz="0"/>
+              <w:bottom w:val="none" w:color="FFFFFF" w:sz="0"/>
+              <w:right w:val="none" w:color="FFFFFF" w:sz="0"/>
+            </w:tcBorders>
+            <w:tcMar>
+              <w:top w:type="dxa" w:w="100"/>
+              <w:left w:type="dxa" w:w="110"/>
+              <w:bottom w:type="dxa" w:w="100"/>
+              <w:right w:type="dxa" w:w="110"/>
+            </w:tcMar>
+            <w:vAlign w:val="top"/>
+          </w:tcPr>
+          <w:p>
+            <w:pPr>
+              <w:spacing w:after="0" w:before="0" w:line="276"/>
+              <w:jc w:val="center"/>
+            </w:pPr>
+            <w:r>
+              <w:rPr>
+                <w:rFonts w:ascii="Calibri" w:cs="Calibri" w:eastAsia="Calibri" w:hAnsi="Calibri"/>
+                <w:b/>
+                <w:bCs/>
+                <w:color w:val="0B6670"/>
+                <w:sz w:val="20"/>
+                <w:szCs w:val="20"/>
+              </w:rPr>
+              <w:t xml:space="preserve">64</w:t>
+            </w:r>
+          </w:p>
+        </w:tc>
+        <w:tc>
+          <w:tcPr>
+            <w:tcW w:type="dxa" w:w="4960"/>
+            <w:tcBorders>
+              <w:top w:val="single" w:color="E4EBF3" w:sz="4"/>
+              <w:left w:val="none" w:color="FFFFFF" w:sz="0"/>
+              <w:bottom w:val="none" w:color="FFFFFF" w:sz="0"/>
+              <w:right w:val="none" w:color="FFFFFF" w:sz="0"/>
+            </w:tcBorders>
+            <w:tcMar>
+              <w:top w:type="dxa" w:w="100"/>
+              <w:left w:type="dxa" w:w="110"/>
+              <w:bottom w:type="dxa" w:w="100"/>
+              <w:right w:type="dxa" w:w="130"/>
+            </w:tcMar>
+            <w:vAlign w:val="top"/>
+          </w:tcPr>
+          <w:p>
+            <w:pPr>
+              <w:spacing w:after="0" w:before="0" w:line="276"/>
+            </w:pPr>
+            <w:r>
+              <w:rPr>
+                <w:rFonts w:ascii="Calibri" w:cs="Calibri" w:eastAsia="Calibri" w:hAnsi="Calibri"/>
+                <w:i/>
+                <w:iCs/>
+                <w:color w:val="0B4A5E"/>
+                <w:sz w:val="18"/>
+                <w:szCs w:val="18"/>
+              </w:rPr>
+              <w:t xml:space="preserve">Solid Kubernetes segmentation. Dependency mapping before enforcement was implied rather than stated.</w:t>
+            </w:r>
+          </w:p>
+        </w:tc>
+      </w:tr>
+      <w:tr>
+        <w:tc>
+          <w:tcPr>
+            <w:tcW w:type="dxa" w:w="2500"/>
+            <w:tcBorders>
+              <w:top w:val="single" w:color="C4D2E2" w:sz="10"/>
+              <w:left w:val="none" w:color="FFFFFF" w:sz="0"/>
+              <w:bottom w:val="none" w:color="FFFFFF" w:sz="0"/>
+              <w:right w:val="none" w:color="FFFFFF" w:sz="0"/>
+            </w:tcBorders>
+            <w:shd w:fill="EAF1F8" w:color="auto" w:val="clear"/>
+            <w:tcMar>
+              <w:top w:type="dxa" w:w="100"/>
+              <w:left w:type="dxa" w:w="130"/>
+              <w:bottom w:type="dxa" w:w="100"/>
+              <w:right w:type="dxa" w:w="110"/>
+            </w:tcMar>
+          </w:tcPr>
+          <w:p>
+            <w:pPr>
+              <w:spacing w:after="0" w:before="0" w:line="276"/>
+            </w:pPr>
+            <w:r>
+              <w:rPr>
+                <w:rFonts w:ascii="Calibri" w:cs="Calibri" w:eastAsia="Calibri" w:hAnsi="Calibri"/>
+                <w:b/>
+                <w:bCs/>
+                <w:color w:val="0D274D"/>
+                <w:sz w:val="20"/>
+                <w:szCs w:val="20"/>
+              </w:rPr>
+              <w:t xml:space="preserve">Overall total</w:t>
+            </w:r>
+          </w:p>
+        </w:tc>
+        <w:tc>
+          <w:tcPr>
+            <w:tcW w:type="dxa" w:w="1900"/>
+            <w:tcBorders>
+              <w:top w:val="single" w:color="C4D2E2" w:sz="10"/>
+              <w:left w:val="none" w:color="FFFFFF" w:sz="0"/>
+              <w:bottom w:val="none" w:color="FFFFFF" w:sz="0"/>
+              <w:right w:val="none" w:color="FFFFFF" w:sz="0"/>
+            </w:tcBorders>
+            <w:shd w:fill="EAF1F8" w:color="auto" w:val="clear"/>
+            <w:tcMar>
+              <w:top w:type="dxa" w:w="100"/>
+              <w:left w:type="dxa" w:w="110"/>
+              <w:bottom w:type="dxa" w:w="100"/>
+              <w:right w:type="dxa" w:w="110"/>
+            </w:tcMar>
+          </w:tcPr>
+          <w:p>
+            <w:pPr>
+              <w:spacing w:after="0" w:before="0" w:line="276"/>
+              <w:jc w:val="center"/>
+            </w:pPr>
+            <w:r>
+              <w:rPr>
+                <w:rFonts w:ascii="Calibri" w:cs="Calibri" w:eastAsia="Calibri" w:hAnsi="Calibri"/>
+                <w:b/>
+                <w:bCs/>
+                <w:color w:val="0B6670"/>
+                <w:sz w:val="20"/>
+                <w:szCs w:val="20"/>
+              </w:rPr>
+              <w:t xml:space="preserve">280</w:t>
+            </w:r>
+            <w:r>
+              <w:rPr>
+                <w:rFonts w:ascii="Calibri" w:cs="Calibri" w:eastAsia="Calibri" w:hAnsi="Calibri"/>
+                <w:b/>
+                <w:bCs/>
+                <w:color w:val="0D274D"/>
+                <w:sz w:val="19"/>
+                <w:szCs w:val="19"/>
+              </w:rPr>
+              <w:t xml:space="preserve"> / 400</w:t>
+            </w:r>
+          </w:p>
+        </w:tc>
+        <w:tc>
+          <w:tcPr>
+            <w:tcW w:type="dxa" w:w="4960"/>
+            <w:tcBorders>
+              <w:top w:val="single" w:color="C4D2E2" w:sz="10"/>
+              <w:left w:val="none" w:color="FFFFFF" w:sz="0"/>
+              <w:bottom w:val="none" w:color="FFFFFF" w:sz="0"/>
+              <w:right w:val="none" w:color="FFFFFF" w:sz="0"/>
+            </w:tcBorders>
+            <w:shd w:fill="EAF1F8" w:color="auto" w:val="clear"/>
+            <w:tcMar>
+              <w:top w:type="dxa" w:w="100"/>
+              <w:left w:type="dxa" w:w="110"/>
+              <w:bottom w:type="dxa" w:w="100"/>
+              <w:right w:type="dxa" w:w="130"/>
+            </w:tcMar>
+          </w:tcPr>
+          <w:p>
+            <w:pPr>
+              <w:spacing w:after="0" w:before="0" w:line="276"/>
+            </w:pPr>
+            <w:r>
+              <w:rPr>
+                <w:rFonts w:ascii="Calibri" w:cs="Calibri" w:eastAsia="Calibri" w:hAnsi="Calibri"/>
+                <w:color w:val="14263A"/>
+                <w:sz w:val="2"/>
+                <w:szCs w:val="2"/>
+              </w:rPr>
+              <w:t xml:space="preserve"/>
+            </w:r>
+          </w:p>
+        </w:tc>
+      </w:tr>
+    </w:tbl>
+    <w:p>
+      <w:pPr>
+        <w:spacing w:after="140"/>
+      </w:pPr>
+      <w:r>
+        <w:rPr>
+          <w:rFonts w:ascii="Calibri" w:cs="Calibri" w:eastAsia="Calibri" w:hAnsi="Calibri"/>
+          <w:color w:val="14263A"/>
+          <w:sz w:val="2"/>
+          <w:szCs w:val="2"/>
+        </w:rPr>
+        <w:t xml:space="preserve"/>
+      </w:r>
+    </w:p>
+    <w:tbl>
+      <w:tblPr>
+        <w:tblW w:type="dxa" w:w="9360"/>
+        <w:tblBorders>
+          <w:top w:val="single" w:color="auto" w:sz="4"/>
+          <w:left w:val="single" w:color="auto" w:sz="4"/>
+          <w:bottom w:val="single" w:color="auto" w:sz="4"/>
+          <w:right w:val="single" w:color="auto" w:sz="4"/>
+          <w:insideH w:val="single" w:color="auto" w:sz="4"/>
+          <w:insideV w:val="single" w:color="auto" w:sz="4"/>
+        </w:tblBorders>
+      </w:tblPr>
+      <w:tblGrid>
+        <w:gridCol w:w="9360"/>
+      </w:tblGrid>
+      <w:tr>
+        <w:tc>
+          <w:tcPr>
+            <w:tcW w:type="dxa" w:w="9360"/>
+            <w:tcBorders>
+              <w:top w:val="single" w:color="9FC9DD" w:sz="6"/>
+              <w:left w:val="single" w:color="9FC9DD" w:sz="6"/>
+              <w:bottom w:val="single" w:color="9FC9DD" w:sz="6"/>
+              <w:right w:val="single" w:color="9FC9DD" w:sz="6"/>
+            </w:tcBorders>
+            <w:shd w:fill="F7FCFE" w:color="auto" w:val="clear"/>
+            <w:tcMar>
+              <w:top w:type="dxa" w:w="110"/>
+              <w:left w:type="dxa" w:w="160"/>
+              <w:bottom w:type="dxa" w:w="110"/>
+              <w:right w:type="dxa" w:w="160"/>
+            </w:tcMar>
+            <w:vAlign w:val="top"/>
+          </w:tcPr>
+          <w:p>
+            <w:pPr>
+              <w:spacing w:after="0" w:before="0" w:line="276"/>
+            </w:pPr>
+            <w:r>
+              <w:rPr>
+                <w:rFonts w:ascii="Calibri" w:cs="Calibri" w:eastAsia="Calibri" w:hAnsi="Calibri"/>
+                <w:b/>
+                <w:bCs/>
+                <w:color w:val="0D274D"/>
+                <w:sz w:val="19"/>
+                <w:szCs w:val="19"/>
+              </w:rPr>
+              <w:t xml:space="preserve">Topology diagram: SME review.  </w:t>
+            </w:r>
+            <w:r>
+              <w:rPr>
+                <w:rFonts w:ascii="Calibri" w:cs="Calibri" w:eastAsia="Calibri" w:hAnsi="Calibri"/>
+                <w:color w:val="33465F"/>
+                <w:sz w:val="19"/>
+                <w:szCs w:val="19"/>
+              </w:rPr>
+              <w:t xml:space="preserve">The team's Hybrid Mesh Firewall diagram is submitted for Subject Matter Expert review and is not part of the score.    Reviewed by SME:  Yes </w:t>
+            </w:r>
+            <w:r>
+              <w:rPr>
+                <w:rFonts w:ascii="Calibri" w:cs="Calibri" w:eastAsia="Calibri" w:hAnsi="Calibri"/>
+                <w:b/>
+                <w:bCs/>
+                <w:color w:val="0B6670"/>
+                <w:sz w:val="19"/>
+                <w:szCs w:val="19"/>
+              </w:rPr>
+              <w:t xml:space="preserve">[x]</w:t>
+            </w:r>
+            <w:r>
+              <w:rPr>
+                <w:rFonts w:ascii="Calibri" w:cs="Calibri" w:eastAsia="Calibri" w:hAnsi="Calibri"/>
+                <w:color w:val="33465F"/>
+                <w:sz w:val="19"/>
+                <w:szCs w:val="19"/>
+              </w:rPr>
+              <w:t xml:space="preserve">   No </w:t>
+            </w:r>
+            <w:r>
+              <w:rPr>
+                <w:rFonts w:ascii="Calibri" w:cs="Calibri" w:eastAsia="Calibri" w:hAnsi="Calibri"/>
+                <w:color w:val="9AA8BC"/>
+                <w:sz w:val="19"/>
+                <w:szCs w:val="19"/>
+              </w:rPr>
+              <w:t xml:space="preserve">[  ]</w:t>
+            </w:r>
+          </w:p>
+        </w:tc>
+      </w:tr>
+    </w:tbl>
+    <w:p>
+      <w:pPr>
+        <w:spacing w:after="80"/>
+      </w:pPr>
+      <w:r>
+        <w:rPr>
+          <w:rFonts w:ascii="Calibri" w:cs="Calibri" w:eastAsia="Calibri" w:hAnsi="Calibri"/>
+          <w:color w:val="14263A"/>
+          <w:sz w:val="2"/>
+          <w:szCs w:val="2"/>
+        </w:rPr>
+        <w:t xml:space="preserve"/>
+      </w:r>
+    </w:p>
+    <w:tbl>
+      <w:tblPr>
+        <w:tblW w:type="dxa" w:w="9360"/>
+        <w:tblBorders>
+          <w:top w:val="single" w:color="auto" w:sz="4"/>
+          <w:left w:val="single" w:color="auto" w:sz="4"/>
+          <w:bottom w:val="single" w:color="auto" w:sz="4"/>
+          <w:right w:val="single" w:color="auto" w:sz="4"/>
+          <w:insideH w:val="single" w:color="auto" w:sz="4"/>
+          <w:insideV w:val="single" w:color="auto" w:sz="4"/>
+        </w:tblBorders>
+      </w:tblPr>
+      <w:tblGrid>
+        <w:gridCol w:w="9360"/>
+      </w:tblGrid>
+      <w:tr>
+        <w:tc>
+          <w:tcPr>
+            <w:tcW w:type="dxa" w:w="9360"/>
+            <w:tcBorders>
+              <w:top w:val="single" w:color="E1E8F1" w:sz="6"/>
+              <w:left w:val="single" w:color="E1E8F1" w:sz="6"/>
+              <w:bottom w:val="single" w:color="E1E8F1" w:sz="6"/>
+              <w:right w:val="single" w:color="E1E8F1" w:sz="6"/>
+            </w:tcBorders>
+            <w:shd w:fill="F7F9FC" w:color="auto" w:val="clear"/>
+            <w:tcMar>
+              <w:top w:type="dxa" w:w="110"/>
+              <w:left w:type="dxa" w:w="160"/>
+              <w:bottom w:type="dxa" w:w="110"/>
+              <w:right w:type="dxa" w:w="160"/>
+            </w:tcMar>
+            <w:vAlign w:val="top"/>
+          </w:tcPr>
+          <w:p>
+            <w:pPr>
+              <w:spacing w:after="50" w:before="0" w:line="276"/>
+            </w:pPr>
+            <w:r>
+              <w:rPr>
+                <w:rFonts w:ascii="Calibri" w:cs="Calibri" w:eastAsia="Calibri" w:hAnsi="Calibri"/>
+                <w:b/>
+                <w:bCs/>
+                <w:color w:val="0D274D"/>
+                <w:sz w:val="18"/>
+                <w:szCs w:val="18"/>
+              </w:rPr>
+              <w:t xml:space="preserve">What the team did well</w:t>
+            </w:r>
+          </w:p>
+          <w:p>
+            <w:pPr>
+              <w:spacing w:after="0" w:before="0" w:line="276"/>
+            </w:pPr>
+            <w:r>
+              <w:rPr>
+                <w:rFonts w:ascii="Calibri" w:cs="Calibri" w:eastAsia="Calibri" w:hAnsi="Calibri"/>
+                <w:i/>
+                <w:iCs/>
+                <w:color w:val="0B4A5E"/>
+                <w:sz w:val="19"/>
+                <w:szCs w:val="19"/>
+              </w:rPr>
+              <w:t xml:space="preserve">Consistently named the right Cisco products and tied them to Cedarline's estate. Customer-ready value stories in Case Studies 2 and 3.</w:t>
+            </w:r>
+          </w:p>
+        </w:tc>
+      </w:tr>
+    </w:tbl>
+    <w:p>
+      <w:pPr>
+        <w:spacing w:after="120"/>
+      </w:pPr>
+      <w:r>
+        <w:rPr>
+          <w:rFonts w:ascii="Calibri" w:cs="Calibri" w:eastAsia="Calibri" w:hAnsi="Calibri"/>
+          <w:color w:val="14263A"/>
+          <w:sz w:val="2"/>
+          <w:szCs w:val="2"/>
+        </w:rPr>
+        <w:t xml:space="preserve"/>
+      </w:r>
+    </w:p>
+    <w:tbl>
+      <w:tblPr>
+        <w:tblW w:type="dxa" w:w="9360"/>
+        <w:tblBorders>
+          <w:top w:val="single" w:color="auto" w:sz="4"/>
+          <w:left w:val="single" w:color="auto" w:sz="4"/>
+          <w:bottom w:val="single" w:color="auto" w:sz="4"/>
+          <w:right w:val="single" w:color="auto" w:sz="4"/>
+          <w:insideH w:val="single" w:color="auto" w:sz="4"/>
+          <w:insideV w:val="single" w:color="auto" w:sz="4"/>
+        </w:tblBorders>
+      </w:tblPr>
+      <w:tblGrid>
+        <w:gridCol w:w="9360"/>
+      </w:tblGrid>
+      <w:tr>
+        <w:tc>
+          <w:tcPr>
+            <w:tcW w:type="dxa" w:w="9360"/>
+            <w:tcBorders>
+              <w:top w:val="single" w:color="E1E8F1" w:sz="6"/>
+              <w:left w:val="single" w:color="E1E8F1" w:sz="6"/>
+              <w:bottom w:val="single" w:color="E1E8F1" w:sz="6"/>
+              <w:right w:val="single" w:color="E1E8F1" w:sz="6"/>
+            </w:tcBorders>
+            <w:shd w:fill="F7F9FC" w:color="auto" w:val="clear"/>
+            <w:tcMar>
+              <w:top w:type="dxa" w:w="110"/>
+              <w:left w:type="dxa" w:w="160"/>
+              <w:bottom w:type="dxa" w:w="110"/>
+              <w:right w:type="dxa" w:w="160"/>
+            </w:tcMar>
+            <w:vAlign w:val="top"/>
+          </w:tcPr>
+          <w:p>
+            <w:pPr>
+              <w:spacing w:after="50" w:before="0" w:line="276"/>
+            </w:pPr>
+            <w:r>
+              <w:rPr>
+                <w:rFonts w:ascii="Calibri" w:cs="Calibri" w:eastAsia="Calibri" w:hAnsi="Calibri"/>
+                <w:b/>
+                <w:bCs/>
+                <w:color w:val="0D274D"/>
+                <w:sz w:val="18"/>
+                <w:szCs w:val="18"/>
+              </w:rPr>
+              <w:t xml:space="preserve">Where they can learn and grow</w:t>
+            </w:r>
+          </w:p>
+          <w:p>
+            <w:pPr>
+              <w:spacing w:after="0" w:before="0" w:line="276"/>
+            </w:pPr>
+            <w:r>
+              <w:rPr>
+                <w:rFonts w:ascii="Calibri" w:cs="Calibri" w:eastAsia="Calibri" w:hAnsi="Calibri"/>
+                <w:i/>
+                <w:iCs/>
+                <w:color w:val="0B4A5E"/>
+                <w:sz w:val="19"/>
+                <w:szCs w:val="19"/>
+              </w:rPr>
+              <w:t xml:space="preserve">Name the underlying requirement before reaching for the product, and always close with the concrete Cedarline outcome.</w:t>
+            </w:r>
+          </w:p>
+        </w:tc>
+      </w:tr>
+    </w:tbl>
+    <w:p>
+      <w:pPr>
+        <w:spacing w:after="120"/>
+      </w:pPr>
+      <w:r>
+        <w:rPr>
+          <w:rFonts w:ascii="Calibri" w:cs="Calibri" w:eastAsia="Calibri" w:hAnsi="Calibri"/>
+          <w:color w:val="14263A"/>
+          <w:sz w:val="2"/>
+          <w:szCs w:val="2"/>
+        </w:rPr>
+        <w:t xml:space="preserve"/>
+      </w:r>
+    </w:p>
+    <w:tbl>
+      <w:tblPr>
+        <w:tblW w:type="dxa" w:w="9360"/>
+        <w:tblBorders>
+          <w:top w:val="single" w:color="auto" w:sz="4"/>
+          <w:left w:val="single" w:color="auto" w:sz="4"/>
+          <w:bottom w:val="single" w:color="auto" w:sz="4"/>
+          <w:right w:val="single" w:color="auto" w:sz="4"/>
+          <w:insideH w:val="single" w:color="auto" w:sz="4"/>
+          <w:insideV w:val="single" w:color="auto" w:sz="4"/>
+        </w:tblBorders>
+      </w:tblPr>
+      <w:tblGrid>
+        <w:gridCol w:w="9360"/>
+      </w:tblGrid>
+      <w:tr>
+        <w:tc>
+          <w:tcPr>
+            <w:tcW w:type="dxa" w:w="9360"/>
+            <w:tcBorders>
+              <w:top w:val="single" w:color="DCE6F1" w:sz="6"/>
+              <w:left w:val="single" w:color="DCE6F1" w:sz="6"/>
+              <w:bottom w:val="single" w:color="DCE6F1" w:sz="6"/>
+              <w:right w:val="single" w:color="DCE6F1" w:sz="6"/>
+            </w:tcBorders>
+            <w:shd w:fill="F3F7FB" w:color="auto" w:val="clear"/>
+            <w:tcMar>
+              <w:top w:type="dxa" w:w="110"/>
+              <w:left w:type="dxa" w:w="160"/>
+              <w:bottom w:type="dxa" w:w="110"/>
+              <w:right w:type="dxa" w:w="160"/>
+            </w:tcMar>
+            <w:vAlign w:val="top"/>
+          </w:tcPr>
+          <w:p>
+            <w:pPr>
+              <w:spacing w:after="0" w:before="0" w:line="276"/>
+            </w:pPr>
+            <w:r>
+              <w:rPr>
+                <w:rFonts w:ascii="Calibri" w:cs="Calibri" w:eastAsia="Calibri" w:hAnsi="Calibri"/>
+                <w:b/>
+                <w:bCs/>
+                <w:color w:val="0D274D"/>
+                <w:sz w:val="20"/>
+                <w:szCs w:val="20"/>
+              </w:rPr>
+              <w:t xml:space="preserve">That is the whole flow.  </w:t>
+            </w:r>
+            <w:r>
+              <w:rPr>
+                <w:rFonts w:ascii="Calibri" w:cs="Calibri" w:eastAsia="Calibri" w:hAnsi="Calibri"/>
+                <w:color w:val="33465F"/>
+                <w:sz w:val="20"/>
+                <w:szCs w:val="20"/>
+              </w:rPr>
+              <w:t xml:space="preserve">Grade every pain point on the rubric, total each case study, then fill in this page inside the team's Workbook exactly like the example above, and hand it back as their result and feedback.</w:t>
+            </w:r>
+          </w:p>
+        </w:tc>
+      </w:tr>
+    </w:tbl>
     <w:sectPr>
       <w:footerReference w:type="default" r:id="rId7"/>
       <w:pgSz w:w="12240" w:h="15840" w:orient="portrait"/>

</xml_diff>

<commit_message>
Add positive overall-grade categories and a standalone Rubric Sheet
- Overall cumulative score (out of 400) now maps to three encouraging
  categories, Best (300-400) / Better (200-299) / Good (up to 199), so
  proctors share results in a positive tone. Shown on the Grading Guide's
  completion page and on the completed score sheet example.
- New standalone HMF-Rubric-Sheet (PDF + Word): a one-page evaluation
  rubric with the three dimensions and their four levels plus the
  pain-point, case-study and overall-grade bands, to keep beside the
  proctor while grading.

README and package zip updated. Solution Guide unchanged.

Co-Authored-By: Claude Opus 4.8 <noreply@anthropic.com>
Claude-Session: https://claude.ai/code/session_01QFagQxWq3DUNgqxaEaNjHo
</commit_message>
<xml_diff>
--- a/case-study-pack/docx/HMF-Grading-Guide.docx
+++ b/case-study-pack/docx/HMF-Grading-Guide.docx
@@ -3458,6 +3458,485 @@
         <w:t xml:space="preserve"/>
       </w:r>
     </w:p>
+    <w:p>
+      <w:pPr>
+        <w:spacing w:after="50" w:before="150" w:line="276"/>
+      </w:pPr>
+      <w:r>
+        <w:rPr>
+          <w:rFonts w:ascii="Calibri" w:cs="Calibri" w:eastAsia="Calibri" w:hAnsi="Calibri"/>
+          <w:b/>
+          <w:bCs/>
+          <w:caps/>
+          <w:color w:val="0D274D"/>
+          <w:sz w:val="22"/>
+          <w:szCs w:val="22"/>
+        </w:rPr>
+        <w:t xml:space="preserve">Overall grade, out of 400</w:t>
+      </w:r>
+    </w:p>
+    <w:p>
+      <w:pPr>
+        <w:spacing w:after="60" w:before="0" w:line="276"/>
+      </w:pPr>
+      <w:r>
+        <w:rPr>
+          <w:rFonts w:ascii="Calibri" w:cs="Calibri" w:eastAsia="Calibri" w:hAnsi="Calibri"/>
+          <w:color w:val="3A4C63"/>
+          <w:sz w:val="20"/>
+          <w:szCs w:val="20"/>
+        </w:rPr>
+        <w:t xml:space="preserve">Give the team their overall result as one of these three encouraging categories. Every category is positive; it names where the team is strong and what to build next.</w:t>
+      </w:r>
+    </w:p>
+    <w:tbl>
+      <w:tblPr>
+        <w:tblW w:type="dxa" w:w="9360"/>
+        <w:tblBorders>
+          <w:top w:val="single" w:color="C4D2E2" w:sz="6"/>
+          <w:left w:val="single" w:color="C4D2E2" w:sz="6"/>
+          <w:bottom w:val="single" w:color="C4D2E2" w:sz="6"/>
+          <w:right w:val="single" w:color="C4D2E2" w:sz="6"/>
+          <w:insideH w:val="none" w:color="FFFFFF" w:sz="0"/>
+          <w:insideV w:val="none" w:color="FFFFFF" w:sz="0"/>
+        </w:tblBorders>
+      </w:tblPr>
+      <w:tblGrid>
+        <w:gridCol w:w="1650"/>
+        <w:gridCol w:w="1300"/>
+        <w:gridCol w:w="6410"/>
+      </w:tblGrid>
+      <w:tr>
+        <w:trPr>
+          <w:tblHeader/>
+        </w:trPr>
+        <w:tc>
+          <w:tcPr>
+            <w:tcW w:type="dxa" w:w="1650"/>
+            <w:tcBorders>
+              <w:top w:val="none" w:color="FFFFFF" w:sz="0"/>
+              <w:left w:val="none" w:color="FFFFFF" w:sz="0"/>
+              <w:bottom w:val="none" w:color="FFFFFF" w:sz="0"/>
+              <w:right w:val="none" w:color="FFFFFF" w:sz="0"/>
+            </w:tcBorders>
+            <w:shd w:fill="0D274D" w:color="auto" w:val="clear"/>
+            <w:tcMar>
+              <w:top w:type="dxa" w:w="60"/>
+              <w:left w:type="dxa" w:w="120"/>
+              <w:bottom w:type="dxa" w:w="60"/>
+              <w:right w:type="dxa" w:w="120"/>
+            </w:tcMar>
+          </w:tcPr>
+          <w:p>
+            <w:pPr>
+              <w:spacing w:after="0" w:before="0" w:line="276"/>
+              <w:jc w:val="left"/>
+            </w:pPr>
+            <w:r>
+              <w:rPr>
+                <w:rFonts w:ascii="Calibri" w:cs="Calibri" w:eastAsia="Calibri" w:hAnsi="Calibri"/>
+                <w:b/>
+                <w:bCs/>
+                <w:caps/>
+                <w:color w:val="FFFFFF"/>
+                <w:sz w:val="13"/>
+                <w:szCs w:val="13"/>
+              </w:rPr>
+              <w:t xml:space="preserve">Level</w:t>
+            </w:r>
+          </w:p>
+        </w:tc>
+        <w:tc>
+          <w:tcPr>
+            <w:tcW w:type="dxa" w:w="1300"/>
+            <w:tcBorders>
+              <w:top w:val="none" w:color="FFFFFF" w:sz="0"/>
+              <w:left w:val="none" w:color="FFFFFF" w:sz="0"/>
+              <w:bottom w:val="none" w:color="FFFFFF" w:sz="0"/>
+              <w:right w:val="none" w:color="FFFFFF" w:sz="0"/>
+            </w:tcBorders>
+            <w:shd w:fill="0D274D" w:color="auto" w:val="clear"/>
+            <w:tcMar>
+              <w:top w:type="dxa" w:w="60"/>
+              <w:left w:type="dxa" w:w="120"/>
+              <w:bottom w:type="dxa" w:w="60"/>
+              <w:right w:type="dxa" w:w="120"/>
+            </w:tcMar>
+          </w:tcPr>
+          <w:p>
+            <w:pPr>
+              <w:spacing w:after="0" w:before="0" w:line="276"/>
+              <w:jc w:val="center"/>
+            </w:pPr>
+            <w:r>
+              <w:rPr>
+                <w:rFonts w:ascii="Calibri" w:cs="Calibri" w:eastAsia="Calibri" w:hAnsi="Calibri"/>
+                <w:b/>
+                <w:bCs/>
+                <w:caps/>
+                <w:color w:val="FFFFFF"/>
+                <w:sz w:val="13"/>
+                <w:szCs w:val="13"/>
+              </w:rPr>
+              <w:t xml:space="preserve">out of 400</w:t>
+            </w:r>
+          </w:p>
+        </w:tc>
+        <w:tc>
+          <w:tcPr>
+            <w:tcW w:type="dxa" w:w="6410"/>
+            <w:tcBorders>
+              <w:top w:val="none" w:color="FFFFFF" w:sz="0"/>
+              <w:left w:val="none" w:color="FFFFFF" w:sz="0"/>
+              <w:bottom w:val="none" w:color="FFFFFF" w:sz="0"/>
+              <w:right w:val="none" w:color="FFFFFF" w:sz="0"/>
+            </w:tcBorders>
+            <w:shd w:fill="0D274D" w:color="auto" w:val="clear"/>
+            <w:tcMar>
+              <w:top w:type="dxa" w:w="60"/>
+              <w:left w:type="dxa" w:w="120"/>
+              <w:bottom w:type="dxa" w:w="60"/>
+              <w:right w:type="dxa" w:w="120"/>
+            </w:tcMar>
+          </w:tcPr>
+          <w:p>
+            <w:pPr>
+              <w:spacing w:after="0" w:before="0" w:line="276"/>
+              <w:jc w:val="left"/>
+            </w:pPr>
+            <w:r>
+              <w:rPr>
+                <w:rFonts w:ascii="Calibri" w:cs="Calibri" w:eastAsia="Calibri" w:hAnsi="Calibri"/>
+                <w:b/>
+                <w:bCs/>
+                <w:caps/>
+                <w:color w:val="FFFFFF"/>
+                <w:sz w:val="13"/>
+                <w:szCs w:val="13"/>
+              </w:rPr>
+              <w:t xml:space="preserve">What it means</w:t>
+            </w:r>
+          </w:p>
+        </w:tc>
+      </w:tr>
+      <w:tr>
+        <w:tc>
+          <w:tcPr>
+            <w:tcW w:type="dxa" w:w="1650"/>
+            <w:tcBorders>
+              <w:top w:val="none" w:color="FFFFFF" w:sz="0"/>
+              <w:left w:val="none" w:color="FFFFFF" w:sz="0"/>
+              <w:bottom w:val="none" w:color="FFFFFF" w:sz="0"/>
+              <w:right w:val="none" w:color="FFFFFF" w:sz="0"/>
+            </w:tcBorders>
+            <w:shd w:fill="F4FBF7" w:color="auto" w:val="clear"/>
+            <w:tcMar>
+              <w:top w:type="dxa" w:w="80"/>
+              <w:left w:type="dxa" w:w="130"/>
+              <w:bottom w:type="dxa" w:w="80"/>
+              <w:right w:type="dxa" w:w="100"/>
+            </w:tcMar>
+          </w:tcPr>
+          <w:p>
+            <w:pPr>
+              <w:spacing w:after="0" w:before="0" w:line="276"/>
+            </w:pPr>
+            <w:r>
+              <w:rPr>
+                <w:rFonts w:ascii="Calibri" w:cs="Calibri" w:eastAsia="Calibri" w:hAnsi="Calibri"/>
+                <w:b/>
+                <w:bCs/>
+                <w:color w:val="0D274D"/>
+                <w:sz w:val="18"/>
+                <w:szCs w:val="18"/>
+              </w:rPr>
+              <w:t xml:space="preserve">Best</w:t>
+            </w:r>
+          </w:p>
+        </w:tc>
+        <w:tc>
+          <w:tcPr>
+            <w:tcW w:type="dxa" w:w="1300"/>
+            <w:tcBorders>
+              <w:top w:val="none" w:color="FFFFFF" w:sz="0"/>
+              <w:left w:val="none" w:color="FFFFFF" w:sz="0"/>
+              <w:bottom w:val="none" w:color="FFFFFF" w:sz="0"/>
+              <w:right w:val="none" w:color="FFFFFF" w:sz="0"/>
+            </w:tcBorders>
+            <w:shd w:fill="F4FBF7" w:color="auto" w:val="clear"/>
+            <w:tcMar>
+              <w:top w:type="dxa" w:w="80"/>
+              <w:left w:type="dxa" w:w="100"/>
+              <w:bottom w:type="dxa" w:w="80"/>
+              <w:right w:type="dxa" w:w="100"/>
+            </w:tcMar>
+          </w:tcPr>
+          <w:p>
+            <w:pPr>
+              <w:spacing w:after="0" w:before="0" w:line="276"/>
+              <w:jc w:val="center"/>
+            </w:pPr>
+            <w:r>
+              <w:rPr>
+                <w:rFonts w:ascii="Calibri" w:cs="Calibri" w:eastAsia="Calibri" w:hAnsi="Calibri"/>
+                <w:b/>
+                <w:bCs/>
+                <w:color w:val="0B6670"/>
+                <w:sz w:val="18"/>
+                <w:szCs w:val="18"/>
+              </w:rPr>
+              <w:t xml:space="preserve">300 to 400</w:t>
+            </w:r>
+          </w:p>
+        </w:tc>
+        <w:tc>
+          <w:tcPr>
+            <w:tcW w:type="dxa" w:w="6410"/>
+            <w:tcBorders>
+              <w:top w:val="none" w:color="FFFFFF" w:sz="0"/>
+              <w:left w:val="none" w:color="FFFFFF" w:sz="0"/>
+              <w:bottom w:val="none" w:color="FFFFFF" w:sz="0"/>
+              <w:right w:val="none" w:color="FFFFFF" w:sz="0"/>
+            </w:tcBorders>
+            <w:shd w:fill="F4FBF7" w:color="auto" w:val="clear"/>
+            <w:tcMar>
+              <w:top w:type="dxa" w:w="80"/>
+              <w:left w:type="dxa" w:w="120"/>
+              <w:bottom w:type="dxa" w:w="80"/>
+              <w:right w:type="dxa" w:w="130"/>
+            </w:tcMar>
+          </w:tcPr>
+          <w:p>
+            <w:pPr>
+              <w:spacing w:after="0" w:before="0" w:line="276"/>
+            </w:pPr>
+            <w:r>
+              <w:rPr>
+                <w:rFonts w:ascii="Calibri" w:cs="Calibri" w:eastAsia="Calibri" w:hAnsi="Calibri"/>
+                <w:color w:val="2A3C52"/>
+                <w:sz w:val="18"/>
+                <w:szCs w:val="18"/>
+              </w:rPr>
+              <w:t xml:space="preserve">Standout work. Across the four case studies the team read the requirements precisely, designed fitting Hybrid Mesh Firewall solutions, and told a clear Cedarline value story.</w:t>
+            </w:r>
+          </w:p>
+        </w:tc>
+      </w:tr>
+      <w:tr>
+        <w:tc>
+          <w:tcPr>
+            <w:tcW w:type="dxa" w:w="1650"/>
+            <w:tcBorders>
+              <w:top w:val="single" w:color="E4EBF3" w:sz="4"/>
+              <w:left w:val="none" w:color="FFFFFF" w:sz="0"/>
+              <w:bottom w:val="none" w:color="FFFFFF" w:sz="0"/>
+              <w:right w:val="none" w:color="FFFFFF" w:sz="0"/>
+            </w:tcBorders>
+            <w:tcMar>
+              <w:top w:type="dxa" w:w="80"/>
+              <w:left w:type="dxa" w:w="130"/>
+              <w:bottom w:type="dxa" w:w="80"/>
+              <w:right w:type="dxa" w:w="100"/>
+            </w:tcMar>
+          </w:tcPr>
+          <w:p>
+            <w:pPr>
+              <w:spacing w:after="0" w:before="0" w:line="276"/>
+            </w:pPr>
+            <w:r>
+              <w:rPr>
+                <w:rFonts w:ascii="Calibri" w:cs="Calibri" w:eastAsia="Calibri" w:hAnsi="Calibri"/>
+                <w:b/>
+                <w:bCs/>
+                <w:color w:val="0D274D"/>
+                <w:sz w:val="18"/>
+                <w:szCs w:val="18"/>
+              </w:rPr>
+              <w:t xml:space="preserve">Better</w:t>
+            </w:r>
+          </w:p>
+        </w:tc>
+        <w:tc>
+          <w:tcPr>
+            <w:tcW w:type="dxa" w:w="1300"/>
+            <w:tcBorders>
+              <w:top w:val="single" w:color="E4EBF3" w:sz="4"/>
+              <w:left w:val="none" w:color="FFFFFF" w:sz="0"/>
+              <w:bottom w:val="none" w:color="FFFFFF" w:sz="0"/>
+              <w:right w:val="none" w:color="FFFFFF" w:sz="0"/>
+            </w:tcBorders>
+            <w:tcMar>
+              <w:top w:type="dxa" w:w="80"/>
+              <w:left w:type="dxa" w:w="100"/>
+              <w:bottom w:type="dxa" w:w="80"/>
+              <w:right w:type="dxa" w:w="100"/>
+            </w:tcMar>
+          </w:tcPr>
+          <w:p>
+            <w:pPr>
+              <w:spacing w:after="0" w:before="0" w:line="276"/>
+              <w:jc w:val="center"/>
+            </w:pPr>
+            <w:r>
+              <w:rPr>
+                <w:rFonts w:ascii="Calibri" w:cs="Calibri" w:eastAsia="Calibri" w:hAnsi="Calibri"/>
+                <w:b/>
+                <w:bCs/>
+                <w:color w:val="0B6670"/>
+                <w:sz w:val="18"/>
+                <w:szCs w:val="18"/>
+              </w:rPr>
+              <w:t xml:space="preserve">200 to 299</w:t>
+            </w:r>
+          </w:p>
+        </w:tc>
+        <w:tc>
+          <w:tcPr>
+            <w:tcW w:type="dxa" w:w="6410"/>
+            <w:tcBorders>
+              <w:top w:val="single" w:color="E4EBF3" w:sz="4"/>
+              <w:left w:val="none" w:color="FFFFFF" w:sz="0"/>
+              <w:bottom w:val="none" w:color="FFFFFF" w:sz="0"/>
+              <w:right w:val="none" w:color="FFFFFF" w:sz="0"/>
+            </w:tcBorders>
+            <w:tcMar>
+              <w:top w:type="dxa" w:w="80"/>
+              <w:left w:type="dxa" w:w="120"/>
+              <w:bottom w:type="dxa" w:w="80"/>
+              <w:right w:type="dxa" w:w="130"/>
+            </w:tcMar>
+          </w:tcPr>
+          <w:p>
+            <w:pPr>
+              <w:spacing w:after="0" w:before="0" w:line="276"/>
+            </w:pPr>
+            <w:r>
+              <w:rPr>
+                <w:rFonts w:ascii="Calibri" w:cs="Calibri" w:eastAsia="Calibri" w:hAnsi="Calibri"/>
+                <w:color w:val="2A3C52"/>
+                <w:sz w:val="18"/>
+                <w:szCs w:val="18"/>
+              </w:rPr>
+              <w:t xml:space="preserve">Strong, consistent work. The team matched the right solutions across most pain points and communicated real value, with a few answers to sharpen.</w:t>
+            </w:r>
+          </w:p>
+        </w:tc>
+      </w:tr>
+      <w:tr>
+        <w:tc>
+          <w:tcPr>
+            <w:tcW w:type="dxa" w:w="1650"/>
+            <w:tcBorders>
+              <w:top w:val="single" w:color="E4EBF3" w:sz="4"/>
+              <w:left w:val="none" w:color="FFFFFF" w:sz="0"/>
+              <w:bottom w:val="none" w:color="FFFFFF" w:sz="0"/>
+              <w:right w:val="none" w:color="FFFFFF" w:sz="0"/>
+            </w:tcBorders>
+            <w:tcMar>
+              <w:top w:type="dxa" w:w="80"/>
+              <w:left w:type="dxa" w:w="130"/>
+              <w:bottom w:type="dxa" w:w="80"/>
+              <w:right w:type="dxa" w:w="100"/>
+            </w:tcMar>
+          </w:tcPr>
+          <w:p>
+            <w:pPr>
+              <w:spacing w:after="0" w:before="0" w:line="276"/>
+            </w:pPr>
+            <w:r>
+              <w:rPr>
+                <w:rFonts w:ascii="Calibri" w:cs="Calibri" w:eastAsia="Calibri" w:hAnsi="Calibri"/>
+                <w:b/>
+                <w:bCs/>
+                <w:color w:val="0D274D"/>
+                <w:sz w:val="18"/>
+                <w:szCs w:val="18"/>
+              </w:rPr>
+              <w:t xml:space="preserve">Good</w:t>
+            </w:r>
+          </w:p>
+        </w:tc>
+        <w:tc>
+          <w:tcPr>
+            <w:tcW w:type="dxa" w:w="1300"/>
+            <w:tcBorders>
+              <w:top w:val="single" w:color="E4EBF3" w:sz="4"/>
+              <w:left w:val="none" w:color="FFFFFF" w:sz="0"/>
+              <w:bottom w:val="none" w:color="FFFFFF" w:sz="0"/>
+              <w:right w:val="none" w:color="FFFFFF" w:sz="0"/>
+            </w:tcBorders>
+            <w:tcMar>
+              <w:top w:type="dxa" w:w="80"/>
+              <w:left w:type="dxa" w:w="100"/>
+              <w:bottom w:type="dxa" w:w="80"/>
+              <w:right w:type="dxa" w:w="100"/>
+            </w:tcMar>
+          </w:tcPr>
+          <w:p>
+            <w:pPr>
+              <w:spacing w:after="0" w:before="0" w:line="276"/>
+              <w:jc w:val="center"/>
+            </w:pPr>
+            <w:r>
+              <w:rPr>
+                <w:rFonts w:ascii="Calibri" w:cs="Calibri" w:eastAsia="Calibri" w:hAnsi="Calibri"/>
+                <w:b/>
+                <w:bCs/>
+                <w:color w:val="0B6670"/>
+                <w:sz w:val="18"/>
+                <w:szCs w:val="18"/>
+              </w:rPr>
+              <w:t xml:space="preserve">up to 199</w:t>
+            </w:r>
+          </w:p>
+        </w:tc>
+        <w:tc>
+          <w:tcPr>
+            <w:tcW w:type="dxa" w:w="6410"/>
+            <w:tcBorders>
+              <w:top w:val="single" w:color="E4EBF3" w:sz="4"/>
+              <w:left w:val="none" w:color="FFFFFF" w:sz="0"/>
+              <w:bottom w:val="none" w:color="FFFFFF" w:sz="0"/>
+              <w:right w:val="none" w:color="FFFFFF" w:sz="0"/>
+            </w:tcBorders>
+            <w:tcMar>
+              <w:top w:type="dxa" w:w="80"/>
+              <w:left w:type="dxa" w:w="120"/>
+              <w:bottom w:type="dxa" w:w="80"/>
+              <w:right w:type="dxa" w:w="130"/>
+            </w:tcMar>
+          </w:tcPr>
+          <w:p>
+            <w:pPr>
+              <w:spacing w:after="0" w:before="0" w:line="276"/>
+            </w:pPr>
+            <w:r>
+              <w:rPr>
+                <w:rFonts w:ascii="Calibri" w:cs="Calibri" w:eastAsia="Calibri" w:hAnsi="Calibri"/>
+                <w:color w:val="2A3C52"/>
+                <w:sz w:val="18"/>
+                <w:szCs w:val="18"/>
+              </w:rPr>
+              <w:t xml:space="preserve">A solid foundation to build on. The team engaged every case study and found real products; the next step is naming the requirement and the outcome more precisely.</w:t>
+            </w:r>
+          </w:p>
+        </w:tc>
+      </w:tr>
+    </w:tbl>
+    <w:p>
+      <w:pPr>
+        <w:spacing w:after="120"/>
+      </w:pPr>
+      <w:r>
+        <w:rPr>
+          <w:rFonts w:ascii="Calibri" w:cs="Calibri" w:eastAsia="Calibri" w:hAnsi="Calibri"/>
+          <w:color w:val="14263A"/>
+          <w:sz w:val="2"/>
+          <w:szCs w:val="2"/>
+        </w:rPr>
+        <w:t xml:space="preserve"/>
+      </w:r>
+    </w:p>
     <w:tbl>
       <w:tblPr>
         <w:tblW w:type="dxa" w:w="9360"/>
@@ -3514,7 +3993,7 @@
                 <w:sz w:val="20"/>
                 <w:szCs w:val="20"/>
               </w:rPr>
-              <w:t xml:space="preserve">This guide is for grading only; it has no spaces to write in. Record each case study score, the overall score out of 400, and your feedback on the Proctor evaluation page at the back of the team's Workbook.</w:t>
+              <w:t xml:space="preserve">This guide is for grading only; it has no spaces to write in. Record each case study score, the overall score out of 400 and its category, and your feedback on the Proctor evaluation page at the back of the team's Workbook.</w:t>
             </w:r>
           </w:p>
         </w:tc>
@@ -23900,11 +24379,24 @@
             <w:r>
               <w:rPr>
                 <w:rFonts w:ascii="Calibri" w:cs="Calibri" w:eastAsia="Calibri" w:hAnsi="Calibri"/>
-                <w:color w:val="14263A"/>
-                <w:sz w:val="2"/>
-                <w:szCs w:val="2"/>
-              </w:rPr>
-              <w:t xml:space="preserve"/>
+                <w:i/>
+                <w:iCs/>
+                <w:color w:val="0B4A5E"/>
+                <w:sz w:val="18"/>
+                <w:szCs w:val="18"/>
+              </w:rPr>
+              <w:t xml:space="preserve">Overall grade: </w:t>
+            </w:r>
+            <w:r>
+              <w:rPr>
+                <w:rFonts w:ascii="Calibri" w:cs="Calibri" w:eastAsia="Calibri" w:hAnsi="Calibri"/>
+                <w:b/>
+                <w:bCs/>
+                <w:color w:val="0B6670"/>
+                <w:sz w:val="18"/>
+                <w:szCs w:val="18"/>
+              </w:rPr>
+              <w:t xml:space="preserve">Better</w:t>
             </w:r>
           </w:p>
         </w:tc>

</xml_diff>

<commit_message>
Rename cumulative categories to the Solution ladder
Overall grade categories are now Solution Explorer (up to 199),
Solution Designer (200-299) and Solution Strategist (300-400), replacing
Foundational/Established/Advanced. Updated across the content module,
Grading Guide, Rubric Sheet, Workbook cumulative box, Proctor evaluation
legend and completed example, Activity Guide, LLM prompt schema, README,
and the sample test-results labels.

Co-Authored-By: Claude Opus 4.8 <noreply@anthropic.com>
Claude-Session: https://claude.ai/code/session_01QFagQxWq3DUNgqxaEaNjHo
</commit_message>
<xml_diff>
--- a/case-study-pack/docx/HMF-Grading-Guide.docx
+++ b/case-study-pack/docx/HMF-Grading-Guide.docx
@@ -3650,7 +3650,7 @@
                 <w:sz w:val="18"/>
                 <w:szCs w:val="18"/>
               </w:rPr>
-              <w:t xml:space="preserve">Advanced</w:t>
+              <w:t xml:space="preserve">Solution Strategist</w:t>
             </w:r>
           </w:p>
         </w:tc>
@@ -3752,7 +3752,7 @@
                 <w:sz w:val="18"/>
                 <w:szCs w:val="18"/>
               </w:rPr>
-              <w:t xml:space="preserve">Established</w:t>
+              <w:t xml:space="preserve">Solution Designer</w:t>
             </w:r>
           </w:p>
         </w:tc>
@@ -3852,7 +3852,7 @@
                 <w:sz w:val="18"/>
                 <w:szCs w:val="18"/>
               </w:rPr>
-              <w:t xml:space="preserve">Foundational</w:t>
+              <w:t xml:space="preserve">Solution Explorer</w:t>
             </w:r>
           </w:p>
         </w:tc>
@@ -24427,7 +24427,7 @@
           <w:sz w:val="21"/>
           <w:szCs w:val="21"/>
         </w:rPr>
-        <w:t xml:space="preserve">Established     </w:t>
+        <w:t xml:space="preserve">Solution Designer     </w:t>
       </w:r>
       <w:r>
         <w:rPr>
@@ -24436,7 +24436,7 @@
           <w:sz w:val="16"/>
           <w:szCs w:val="16"/>
         </w:rPr>
-        <w:t xml:space="preserve">(Advanced 300 to 400;  Established 200 to 299;  Foundational up to 199)</w:t>
+        <w:t xml:space="preserve">(Solution Strategist 300 to 400;  Solution Designer 200 to 299;  Solution Explorer up to 199)</w:t>
       </w:r>
     </w:p>
     <w:tbl>

</xml_diff>

<commit_message>
Rename middle cumulative category to Solution Builder to remove dimension collision
The 200-299 overall category was "Solution Designer," the same name as
the scored Solution Designer dimension. Renamed it to Solution Builder,
so the cumulative ladder is Solution Explorer (up to 199), Solution
Builder (200-299), Solution Strategist (300-400), with no clash. Updated
across the content module, all documents, the LLM prompt, README, and the
sample test-results labels.

Co-Authored-By: Claude Opus 4.8 <noreply@anthropic.com>
Claude-Session: https://claude.ai/code/session_01QFagQxWq3DUNgqxaEaNjHo
</commit_message>
<xml_diff>
--- a/case-study-pack/docx/HMF-Grading-Guide.docx
+++ b/case-study-pack/docx/HMF-Grading-Guide.docx
@@ -3752,7 +3752,7 @@
                 <w:sz w:val="18"/>
                 <w:szCs w:val="18"/>
               </w:rPr>
-              <w:t xml:space="preserve">Solution Designer</w:t>
+              <w:t xml:space="preserve">Solution Builder</w:t>
             </w:r>
           </w:p>
         </w:tc>
@@ -24427,7 +24427,7 @@
           <w:sz w:val="21"/>
           <w:szCs w:val="21"/>
         </w:rPr>
-        <w:t xml:space="preserve">Solution Designer     </w:t>
+        <w:t xml:space="preserve">Solution Builder     </w:t>
       </w:r>
       <w:r>
         <w:rPr>
@@ -24436,7 +24436,7 @@
           <w:sz w:val="16"/>
           <w:szCs w:val="16"/>
         </w:rPr>
-        <w:t xml:space="preserve">(Solution Strategist 300 to 400;  Solution Designer 200 to 299;  Solution Explorer up to 199)</w:t>
+        <w:t xml:space="preserve">(Solution Strategist 300 to 400;  Solution Builder 200 to 299;  Solution Explorer up to 199)</w:t>
       </w:r>
     </w:p>
     <w:tbl>

</xml_diff>